<commit_message>
docs: release 1.3.0 pubblicata (link verificati)
Co-Authored-By: Claude Opus 5.5 <noreply@anthropic.com>
</commit_message>
<xml_diff>
--- a/docs/PDFz_20261022.docx
+++ b/docs/PDFz_20261022.docx
@@ -16,7 +16,7 @@
           <w:noProof/>
         </w:rPr>
         <w:drawing>
-          <wp:inline distT="0" distB="0" distL="0" distR="0" wp14:anchorId="6621DC4F" wp14:editId="3C0DBA6F">
+          <wp:inline distT="0" distB="0" distL="0" distR="0" wp14:anchorId="4C4F0972" wp14:editId="0F2A26C5">
             <wp:extent cx="3619500" cy="1285875"/>
             <wp:effectExtent l="0" t="0" r="0" b="0"/>
             <wp:docPr id="1" name="Immagine 1"/>
@@ -129,14 +129,13 @@
           <w:sz w:val="32"/>
           <w:szCs w:val="32"/>
         </w:rPr>
-        <w:lastRenderedPageBreak/>
         <w:t>Indice</w:t>
       </w:r>
     </w:p>
     <w:sdt>
       <w:sdtPr>
         <w:alias w:val="Indice"/>
-        <w:id w:val="1893469610"/>
+        <w:id w:val="1809595153"/>
       </w:sdtPr>
       <w:sdtEndPr/>
       <w:sdtContent>
@@ -159,7 +158,7 @@
           <w:r>
             <w:fldChar w:fldCharType="separate"/>
           </w:r>
-          <w:hyperlink w:anchor="_Toc243559994" w:history="1">
+          <w:hyperlink w:anchor="_Toc243560549" w:history="1">
             <w:r>
               <w:rPr>
                 <w:rStyle w:val="Collegamentoipertestuale"/>
@@ -183,7 +182,7 @@
               <w:rPr>
                 <w:noProof/>
               </w:rPr>
-              <w:instrText xml:space="preserve"> PAGEREF _Toc243559994 \h </w:instrText>
+              <w:instrText xml:space="preserve"> PAGEREF _Toc243560549 \h </w:instrText>
             </w:r>
             <w:r>
               <w:rPr>
@@ -220,7 +219,7 @@
               <w:noProof/>
             </w:rPr>
           </w:pPr>
-          <w:hyperlink w:anchor="_Toc243559995" w:history="1">
+          <w:hyperlink w:anchor="_Toc243560550" w:history="1">
             <w:r>
               <w:rPr>
                 <w:rStyle w:val="Collegamentoipertestuale"/>
@@ -244,7 +243,7 @@
               <w:rPr>
                 <w:noProof/>
               </w:rPr>
-              <w:instrText xml:space="preserve"> PAGEREF _Toc243559995 \h </w:instrText>
+              <w:instrText xml:space="preserve"> PAGEREF _Toc243560550 \h </w:instrText>
             </w:r>
             <w:r>
               <w:rPr>
@@ -281,7 +280,7 @@
               <w:noProof/>
             </w:rPr>
           </w:pPr>
-          <w:hyperlink w:anchor="_Toc243559996" w:history="1">
+          <w:hyperlink w:anchor="_Toc243560551" w:history="1">
             <w:r>
               <w:rPr>
                 <w:rStyle w:val="Collegamentoipertestuale"/>
@@ -305,7 +304,7 @@
               <w:rPr>
                 <w:noProof/>
               </w:rPr>
-              <w:instrText xml:space="preserve"> PAGEREF _Toc243559996 \h </w:instrText>
+              <w:instrText xml:space="preserve"> PAGEREF _Toc243560551 \h </w:instrText>
             </w:r>
             <w:r>
               <w:rPr>
@@ -342,7 +341,7 @@
               <w:noProof/>
             </w:rPr>
           </w:pPr>
-          <w:hyperlink w:anchor="_Toc243559997" w:history="1">
+          <w:hyperlink w:anchor="_Toc243560552" w:history="1">
             <w:r>
               <w:rPr>
                 <w:rStyle w:val="Collegamentoipertestuale"/>
@@ -366,7 +365,7 @@
               <w:rPr>
                 <w:noProof/>
               </w:rPr>
-              <w:instrText xml:space="preserve"> PAGEREF _Toc243559997 \h </w:instrText>
+              <w:instrText xml:space="preserve"> PAGEREF _Toc243560552 \h </w:instrText>
             </w:r>
             <w:r>
               <w:rPr>
@@ -403,7 +402,7 @@
               <w:noProof/>
             </w:rPr>
           </w:pPr>
-          <w:hyperlink w:anchor="_Toc243559998" w:history="1">
+          <w:hyperlink w:anchor="_Toc243560553" w:history="1">
             <w:r>
               <w:rPr>
                 <w:rStyle w:val="Collegamentoipertestuale"/>
@@ -427,7 +426,7 @@
               <w:rPr>
                 <w:noProof/>
               </w:rPr>
-              <w:instrText xml:space="preserve"> PAGEREF _Toc243559998 \h </w:instrText>
+              <w:instrText xml:space="preserve"> PAGEREF _Toc243560553 \h </w:instrText>
             </w:r>
             <w:r>
               <w:rPr>
@@ -464,7 +463,7 @@
               <w:noProof/>
             </w:rPr>
           </w:pPr>
-          <w:hyperlink w:anchor="_Toc243559999" w:history="1">
+          <w:hyperlink w:anchor="_Toc243560554" w:history="1">
             <w:r>
               <w:rPr>
                 <w:rStyle w:val="Collegamentoipertestuale"/>
@@ -488,7 +487,7 @@
               <w:rPr>
                 <w:noProof/>
               </w:rPr>
-              <w:instrText xml:space="preserve"> PAGEREF _Toc243559999 \h </w:instrText>
+              <w:instrText xml:space="preserve"> PAGEREF _Toc243560554 \h </w:instrText>
             </w:r>
             <w:r>
               <w:rPr>
@@ -525,7 +524,7 @@
               <w:noProof/>
             </w:rPr>
           </w:pPr>
-          <w:hyperlink w:anchor="_Toc243560000" w:history="1">
+          <w:hyperlink w:anchor="_Toc243560555" w:history="1">
             <w:r>
               <w:rPr>
                 <w:rStyle w:val="Collegamentoipertestuale"/>
@@ -549,7 +548,7 @@
               <w:rPr>
                 <w:noProof/>
               </w:rPr>
-              <w:instrText xml:space="preserve"> PAGEREF _Toc243560000 \h </w:instrText>
+              <w:instrText xml:space="preserve"> PAGEREF _Toc243560555 \h </w:instrText>
             </w:r>
             <w:r>
               <w:rPr>
@@ -586,7 +585,7 @@
               <w:noProof/>
             </w:rPr>
           </w:pPr>
-          <w:hyperlink w:anchor="_Toc243560001" w:history="1">
+          <w:hyperlink w:anchor="_Toc243560556" w:history="1">
             <w:r>
               <w:rPr>
                 <w:rStyle w:val="Collegamentoipertestuale"/>
@@ -610,7 +609,7 @@
               <w:rPr>
                 <w:noProof/>
               </w:rPr>
-              <w:instrText xml:space="preserve"> PAGEREF _Toc243560001 \h </w:instrText>
+              <w:instrText xml:space="preserve"> PAGEREF _Toc243560556 \h </w:instrText>
             </w:r>
             <w:r>
               <w:rPr>
@@ -647,7 +646,7 @@
               <w:noProof/>
             </w:rPr>
           </w:pPr>
-          <w:hyperlink w:anchor="_Toc243560002" w:history="1">
+          <w:hyperlink w:anchor="_Toc243560557" w:history="1">
             <w:r>
               <w:rPr>
                 <w:rStyle w:val="Collegamentoipertestuale"/>
@@ -671,7 +670,7 @@
               <w:rPr>
                 <w:noProof/>
               </w:rPr>
-              <w:instrText xml:space="preserve"> PAGEREF _Toc243560002 \h </w:instrText>
+              <w:instrText xml:space="preserve"> PAGEREF _Toc243560557 \h </w:instrText>
             </w:r>
             <w:r>
               <w:rPr>
@@ -708,7 +707,7 @@
               <w:noProof/>
             </w:rPr>
           </w:pPr>
-          <w:hyperlink w:anchor="_Toc243560003" w:history="1">
+          <w:hyperlink w:anchor="_Toc243560558" w:history="1">
             <w:r>
               <w:rPr>
                 <w:rStyle w:val="Collegamentoipertestuale"/>
@@ -732,7 +731,7 @@
               <w:rPr>
                 <w:noProof/>
               </w:rPr>
-              <w:instrText xml:space="preserve"> PAGEREF _Toc243560003 \h </w:instrText>
+              <w:instrText xml:space="preserve"> PAGEREF _Toc243560558 \h </w:instrText>
             </w:r>
             <w:r>
               <w:rPr>
@@ -769,7 +768,7 @@
               <w:noProof/>
             </w:rPr>
           </w:pPr>
-          <w:hyperlink w:anchor="_Toc243560004" w:history="1">
+          <w:hyperlink w:anchor="_Toc243560559" w:history="1">
             <w:r>
               <w:rPr>
                 <w:rStyle w:val="Collegamentoipertestuale"/>
@@ -793,7 +792,7 @@
               <w:rPr>
                 <w:noProof/>
               </w:rPr>
-              <w:instrText xml:space="preserve"> PAGEREF _Toc243560004 \h </w:instrText>
+              <w:instrText xml:space="preserve"> PAGEREF _Toc243560559 \h </w:instrText>
             </w:r>
             <w:r>
               <w:rPr>
@@ -830,7 +829,7 @@
               <w:noProof/>
             </w:rPr>
           </w:pPr>
-          <w:hyperlink w:anchor="_Toc243560005" w:history="1">
+          <w:hyperlink w:anchor="_Toc243560560" w:history="1">
             <w:r>
               <w:rPr>
                 <w:rStyle w:val="Collegamentoipertestuale"/>
@@ -854,7 +853,7 @@
               <w:rPr>
                 <w:noProof/>
               </w:rPr>
-              <w:instrText xml:space="preserve"> PAGEREF _Toc243560005 \h </w:instrText>
+              <w:instrText xml:space="preserve"> PAGEREF _Toc243560560 \h </w:instrText>
             </w:r>
             <w:r>
               <w:rPr>
@@ -891,7 +890,7 @@
               <w:noProof/>
             </w:rPr>
           </w:pPr>
-          <w:hyperlink w:anchor="_Toc243560006" w:history="1">
+          <w:hyperlink w:anchor="_Toc243560561" w:history="1">
             <w:r>
               <w:rPr>
                 <w:rStyle w:val="Collegamentoipertestuale"/>
@@ -915,7 +914,7 @@
               <w:rPr>
                 <w:noProof/>
               </w:rPr>
-              <w:instrText xml:space="preserve"> PAGEREF _Toc243560006 \h </w:instrText>
+              <w:instrText xml:space="preserve"> PAGEREF _Toc243560561 \h </w:instrText>
             </w:r>
             <w:r>
               <w:rPr>
@@ -952,7 +951,7 @@
               <w:noProof/>
             </w:rPr>
           </w:pPr>
-          <w:hyperlink w:anchor="_Toc243560007" w:history="1">
+          <w:hyperlink w:anchor="_Toc243560562" w:history="1">
             <w:r>
               <w:rPr>
                 <w:rStyle w:val="Collegamentoipertestuale"/>
@@ -976,7 +975,7 @@
               <w:rPr>
                 <w:noProof/>
               </w:rPr>
-              <w:instrText xml:space="preserve"> PAGEREF _Toc243560007 \h </w:instrText>
+              <w:instrText xml:space="preserve"> PAGEREF _Toc243560562 \h </w:instrText>
             </w:r>
             <w:r>
               <w:rPr>
@@ -1013,7 +1012,7 @@
               <w:noProof/>
             </w:rPr>
           </w:pPr>
-          <w:hyperlink w:anchor="_Toc243560008" w:history="1">
+          <w:hyperlink w:anchor="_Toc243560563" w:history="1">
             <w:r>
               <w:rPr>
                 <w:rStyle w:val="Collegamentoipertestuale"/>
@@ -1037,7 +1036,7 @@
               <w:rPr>
                 <w:noProof/>
               </w:rPr>
-              <w:instrText xml:space="preserve"> PAGEREF _Toc243560008 \h </w:instrText>
+              <w:instrText xml:space="preserve"> PAGEREF _Toc243560563 \h </w:instrText>
             </w:r>
             <w:r>
               <w:rPr>
@@ -1074,7 +1073,7 @@
               <w:noProof/>
             </w:rPr>
           </w:pPr>
-          <w:hyperlink w:anchor="_Toc243560009" w:history="1">
+          <w:hyperlink w:anchor="_Toc243560564" w:history="1">
             <w:r>
               <w:rPr>
                 <w:rStyle w:val="Collegamentoipertestuale"/>
@@ -1098,7 +1097,7 @@
               <w:rPr>
                 <w:noProof/>
               </w:rPr>
-              <w:instrText xml:space="preserve"> PAGEREF _Toc243560009 \h </w:instrText>
+              <w:instrText xml:space="preserve"> PAGEREF _Toc243560564 \h </w:instrText>
             </w:r>
             <w:r>
               <w:rPr>
@@ -1135,7 +1134,7 @@
               <w:noProof/>
             </w:rPr>
           </w:pPr>
-          <w:hyperlink w:anchor="_Toc243560010" w:history="1">
+          <w:hyperlink w:anchor="_Toc243560565" w:history="1">
             <w:r>
               <w:rPr>
                 <w:rStyle w:val="Collegamentoipertestuale"/>
@@ -1159,7 +1158,7 @@
               <w:rPr>
                 <w:noProof/>
               </w:rPr>
-              <w:instrText xml:space="preserve"> PAGEREF _Toc243560010 \h </w:instrText>
+              <w:instrText xml:space="preserve"> PAGEREF _Toc243560565 \h </w:instrText>
             </w:r>
             <w:r>
               <w:rPr>
@@ -1196,7 +1195,7 @@
               <w:noProof/>
             </w:rPr>
           </w:pPr>
-          <w:hyperlink w:anchor="_Toc243560011" w:history="1">
+          <w:hyperlink w:anchor="_Toc243560566" w:history="1">
             <w:r>
               <w:rPr>
                 <w:rStyle w:val="Collegamentoipertestuale"/>
@@ -1220,7 +1219,7 @@
               <w:rPr>
                 <w:noProof/>
               </w:rPr>
-              <w:instrText xml:space="preserve"> PAGEREF _Toc243560011 \h </w:instrText>
+              <w:instrText xml:space="preserve"> PAGEREF _Toc243560566 \h </w:instrText>
             </w:r>
             <w:r>
               <w:rPr>
@@ -1257,7 +1256,7 @@
               <w:noProof/>
             </w:rPr>
           </w:pPr>
-          <w:hyperlink w:anchor="_Toc243560012" w:history="1">
+          <w:hyperlink w:anchor="_Toc243560567" w:history="1">
             <w:r>
               <w:rPr>
                 <w:rStyle w:val="Collegamentoipertestuale"/>
@@ -1281,7 +1280,7 @@
               <w:rPr>
                 <w:noProof/>
               </w:rPr>
-              <w:instrText xml:space="preserve"> PAGEREF _Toc243560012 \h </w:instrText>
+              <w:instrText xml:space="preserve"> PAGEREF _Toc243560567 \h </w:instrText>
             </w:r>
             <w:r>
               <w:rPr>
@@ -1318,7 +1317,7 @@
               <w:noProof/>
             </w:rPr>
           </w:pPr>
-          <w:hyperlink w:anchor="_Toc243560013" w:history="1">
+          <w:hyperlink w:anchor="_Toc243560568" w:history="1">
             <w:r>
               <w:rPr>
                 <w:rStyle w:val="Collegamentoipertestuale"/>
@@ -1342,7 +1341,7 @@
               <w:rPr>
                 <w:noProof/>
               </w:rPr>
-              <w:instrText xml:space="preserve"> PAGEREF _Toc243560013 \h </w:instrText>
+              <w:instrText xml:space="preserve"> PAGEREF _Toc243560568 \h </w:instrText>
             </w:r>
             <w:r>
               <w:rPr>
@@ -1379,7 +1378,7 @@
               <w:noProof/>
             </w:rPr>
           </w:pPr>
-          <w:hyperlink w:anchor="_Toc243560014" w:history="1">
+          <w:hyperlink w:anchor="_Toc243560569" w:history="1">
             <w:r>
               <w:rPr>
                 <w:rStyle w:val="Collegamentoipertestuale"/>
@@ -1403,7 +1402,7 @@
               <w:rPr>
                 <w:noProof/>
               </w:rPr>
-              <w:instrText xml:space="preserve"> PAGEREF _Toc243560014 \h </w:instrText>
+              <w:instrText xml:space="preserve"> PAGEREF _Toc243560569 \h </w:instrText>
             </w:r>
             <w:r>
               <w:rPr>
@@ -1440,7 +1439,7 @@
               <w:noProof/>
             </w:rPr>
           </w:pPr>
-          <w:hyperlink w:anchor="_Toc243560015" w:history="1">
+          <w:hyperlink w:anchor="_Toc243560570" w:history="1">
             <w:r>
               <w:rPr>
                 <w:rStyle w:val="Collegamentoipertestuale"/>
@@ -1464,7 +1463,7 @@
               <w:rPr>
                 <w:noProof/>
               </w:rPr>
-              <w:instrText xml:space="preserve"> PAGEREF _Toc243560015 \h </w:instrText>
+              <w:instrText xml:space="preserve"> PAGEREF _Toc243560570 \h </w:instrText>
             </w:r>
             <w:r>
               <w:rPr>
@@ -1501,7 +1500,7 @@
               <w:noProof/>
             </w:rPr>
           </w:pPr>
-          <w:hyperlink w:anchor="_Toc243560016" w:history="1">
+          <w:hyperlink w:anchor="_Toc243560571" w:history="1">
             <w:r>
               <w:rPr>
                 <w:rStyle w:val="Collegamentoipertestuale"/>
@@ -1525,7 +1524,7 @@
               <w:rPr>
                 <w:noProof/>
               </w:rPr>
-              <w:instrText xml:space="preserve"> PAGEREF _Toc243560016 \h </w:instrText>
+              <w:instrText xml:space="preserve"> PAGEREF _Toc243560571 \h </w:instrText>
             </w:r>
             <w:r>
               <w:rPr>
@@ -1562,7 +1561,7 @@
               <w:noProof/>
             </w:rPr>
           </w:pPr>
-          <w:hyperlink w:anchor="_Toc243560017" w:history="1">
+          <w:hyperlink w:anchor="_Toc243560572" w:history="1">
             <w:r>
               <w:rPr>
                 <w:rStyle w:val="Collegamentoipertestuale"/>
@@ -1586,7 +1585,7 @@
               <w:rPr>
                 <w:noProof/>
               </w:rPr>
-              <w:instrText xml:space="preserve"> PAGEREF _Toc243560017 \h </w:instrText>
+              <w:instrText xml:space="preserve"> PAGEREF _Toc243560572 \h </w:instrText>
             </w:r>
             <w:r>
               <w:rPr>
@@ -1623,7 +1622,7 @@
               <w:noProof/>
             </w:rPr>
           </w:pPr>
-          <w:hyperlink w:anchor="_Toc243560018" w:history="1">
+          <w:hyperlink w:anchor="_Toc243560573" w:history="1">
             <w:r>
               <w:rPr>
                 <w:rStyle w:val="Collegamentoipertestuale"/>
@@ -1647,7 +1646,7 @@
               <w:rPr>
                 <w:noProof/>
               </w:rPr>
-              <w:instrText xml:space="preserve"> PAGEREF _Toc243560018 \h </w:instrText>
+              <w:instrText xml:space="preserve"> PAGEREF _Toc243560573 \h </w:instrText>
             </w:r>
             <w:r>
               <w:rPr>
@@ -1684,7 +1683,7 @@
               <w:noProof/>
             </w:rPr>
           </w:pPr>
-          <w:hyperlink w:anchor="_Toc243560019" w:history="1">
+          <w:hyperlink w:anchor="_Toc243560574" w:history="1">
             <w:r>
               <w:rPr>
                 <w:rStyle w:val="Collegamentoipertestuale"/>
@@ -1708,7 +1707,7 @@
               <w:rPr>
                 <w:noProof/>
               </w:rPr>
-              <w:instrText xml:space="preserve"> PAGEREF _Toc243560019 \h </w:instrText>
+              <w:instrText xml:space="preserve"> PAGEREF _Toc243560574 \h </w:instrText>
             </w:r>
             <w:r>
               <w:rPr>
@@ -1745,7 +1744,7 @@
               <w:noProof/>
             </w:rPr>
           </w:pPr>
-          <w:hyperlink w:anchor="_Toc243560020" w:history="1">
+          <w:hyperlink w:anchor="_Toc243560575" w:history="1">
             <w:r>
               <w:rPr>
                 <w:rStyle w:val="Collegamentoipertestuale"/>
@@ -1769,7 +1768,7 @@
               <w:rPr>
                 <w:noProof/>
               </w:rPr>
-              <w:instrText xml:space="preserve"> PAGEREF _Toc243560020 \h </w:instrText>
+              <w:instrText xml:space="preserve"> PAGEREF _Toc243560575 \h </w:instrText>
             </w:r>
             <w:r>
               <w:rPr>
@@ -1806,7 +1805,7 @@
               <w:noProof/>
             </w:rPr>
           </w:pPr>
-          <w:hyperlink w:anchor="_Toc243560021" w:history="1">
+          <w:hyperlink w:anchor="_Toc243560576" w:history="1">
             <w:r>
               <w:rPr>
                 <w:rStyle w:val="Collegamentoipertestuale"/>
@@ -1830,7 +1829,7 @@
               <w:rPr>
                 <w:noProof/>
               </w:rPr>
-              <w:instrText xml:space="preserve"> PAGEREF _Toc243560021 \h </w:instrText>
+              <w:instrText xml:space="preserve"> PAGEREF _Toc243560576 \h </w:instrText>
             </w:r>
             <w:r>
               <w:rPr>
@@ -1867,7 +1866,7 @@
               <w:noProof/>
             </w:rPr>
           </w:pPr>
-          <w:hyperlink w:anchor="_Toc243560022" w:history="1">
+          <w:hyperlink w:anchor="_Toc243560577" w:history="1">
             <w:r>
               <w:rPr>
                 <w:rStyle w:val="Collegamentoipertestuale"/>
@@ -1891,7 +1890,7 @@
               <w:rPr>
                 <w:noProof/>
               </w:rPr>
-              <w:instrText xml:space="preserve"> PAGEREF _Toc243560022 \h </w:instrText>
+              <w:instrText xml:space="preserve"> PAGEREF _Toc243560577 \h </w:instrText>
             </w:r>
             <w:r>
               <w:rPr>
@@ -1928,7 +1927,7 @@
               <w:noProof/>
             </w:rPr>
           </w:pPr>
-          <w:hyperlink w:anchor="_Toc243560023" w:history="1">
+          <w:hyperlink w:anchor="_Toc243560578" w:history="1">
             <w:r>
               <w:rPr>
                 <w:rStyle w:val="Collegamentoipertestuale"/>
@@ -1952,7 +1951,7 @@
               <w:rPr>
                 <w:noProof/>
               </w:rPr>
-              <w:instrText xml:space="preserve"> PAGEREF _Toc243560023 \h </w:instrText>
+              <w:instrText xml:space="preserve"> PAGEREF _Toc243560578 \h </w:instrText>
             </w:r>
             <w:r>
               <w:rPr>
@@ -1989,7 +1988,7 @@
               <w:noProof/>
             </w:rPr>
           </w:pPr>
-          <w:hyperlink w:anchor="_Toc243560024" w:history="1">
+          <w:hyperlink w:anchor="_Toc243560579" w:history="1">
             <w:r>
               <w:rPr>
                 <w:rStyle w:val="Collegamentoipertestuale"/>
@@ -2013,7 +2012,7 @@
               <w:rPr>
                 <w:noProof/>
               </w:rPr>
-              <w:instrText xml:space="preserve"> PAGEREF _Toc243560024 \h </w:instrText>
+              <w:instrText xml:space="preserve"> PAGEREF _Toc243560579 \h </w:instrText>
             </w:r>
             <w:r>
               <w:rPr>
@@ -2050,7 +2049,7 @@
               <w:noProof/>
             </w:rPr>
           </w:pPr>
-          <w:hyperlink w:anchor="_Toc243560025" w:history="1">
+          <w:hyperlink w:anchor="_Toc243560580" w:history="1">
             <w:r>
               <w:rPr>
                 <w:rStyle w:val="Collegamentoipertestuale"/>
@@ -2074,7 +2073,7 @@
               <w:rPr>
                 <w:noProof/>
               </w:rPr>
-              <w:instrText xml:space="preserve"> PAGEREF _Toc243560025 \h </w:instrText>
+              <w:instrText xml:space="preserve"> PAGEREF _Toc243560580 \h </w:instrText>
             </w:r>
             <w:r>
               <w:rPr>
@@ -2111,7 +2110,7 @@
               <w:noProof/>
             </w:rPr>
           </w:pPr>
-          <w:hyperlink w:anchor="_Toc243560026" w:history="1">
+          <w:hyperlink w:anchor="_Toc243560581" w:history="1">
             <w:r>
               <w:rPr>
                 <w:rStyle w:val="Collegamentoipertestuale"/>
@@ -2135,7 +2134,7 @@
               <w:rPr>
                 <w:noProof/>
               </w:rPr>
-              <w:instrText xml:space="preserve"> PAGEREF _Toc243560026 \h </w:instrText>
+              <w:instrText xml:space="preserve"> PAGEREF _Toc243560581 \h </w:instrText>
             </w:r>
             <w:r>
               <w:rPr>
@@ -2172,7 +2171,7 @@
               <w:noProof/>
             </w:rPr>
           </w:pPr>
-          <w:hyperlink w:anchor="_Toc243560027" w:history="1">
+          <w:hyperlink w:anchor="_Toc243560582" w:history="1">
             <w:r>
               <w:rPr>
                 <w:rStyle w:val="Collegamentoipertestuale"/>
@@ -2196,7 +2195,7 @@
               <w:rPr>
                 <w:noProof/>
               </w:rPr>
-              <w:instrText xml:space="preserve"> PAGEREF _Toc243560027 \h </w:instrText>
+              <w:instrText xml:space="preserve"> PAGEREF _Toc243560582 \h </w:instrText>
             </w:r>
             <w:r>
               <w:rPr>
@@ -2233,7 +2232,7 @@
               <w:noProof/>
             </w:rPr>
           </w:pPr>
-          <w:hyperlink w:anchor="_Toc243560028" w:history="1">
+          <w:hyperlink w:anchor="_Toc243560583" w:history="1">
             <w:r>
               <w:rPr>
                 <w:rStyle w:val="Collegamentoipertestuale"/>
@@ -2257,7 +2256,7 @@
               <w:rPr>
                 <w:noProof/>
               </w:rPr>
-              <w:instrText xml:space="preserve"> PAGEREF _Toc243560028 \h </w:instrText>
+              <w:instrText xml:space="preserve"> PAGEREF _Toc243560583 \h </w:instrText>
             </w:r>
             <w:r>
               <w:rPr>
@@ -2294,7 +2293,7 @@
               <w:noProof/>
             </w:rPr>
           </w:pPr>
-          <w:hyperlink w:anchor="_Toc243560029" w:history="1">
+          <w:hyperlink w:anchor="_Toc243560584" w:history="1">
             <w:r>
               <w:rPr>
                 <w:rStyle w:val="Collegamentoipertestuale"/>
@@ -2318,7 +2317,7 @@
               <w:rPr>
                 <w:noProof/>
               </w:rPr>
-              <w:instrText xml:space="preserve"> PAGEREF _Toc243560029 \h </w:instrText>
+              <w:instrText xml:space="preserve"> PAGEREF _Toc243560584 \h </w:instrText>
             </w:r>
             <w:r>
               <w:rPr>
@@ -2355,7 +2354,7 @@
               <w:noProof/>
             </w:rPr>
           </w:pPr>
-          <w:hyperlink w:anchor="_Toc243560030" w:history="1">
+          <w:hyperlink w:anchor="_Toc243560585" w:history="1">
             <w:r>
               <w:rPr>
                 <w:rStyle w:val="Collegamentoipertestuale"/>
@@ -2379,7 +2378,7 @@
               <w:rPr>
                 <w:noProof/>
               </w:rPr>
-              <w:instrText xml:space="preserve"> PAGEREF _Toc243560030 \h </w:instrText>
+              <w:instrText xml:space="preserve"> PAGEREF _Toc243560585 \h </w:instrText>
             </w:r>
             <w:r>
               <w:rPr>
@@ -2416,7 +2415,7 @@
               <w:noProof/>
             </w:rPr>
           </w:pPr>
-          <w:hyperlink w:anchor="_Toc243560031" w:history="1">
+          <w:hyperlink w:anchor="_Toc243560586" w:history="1">
             <w:r>
               <w:rPr>
                 <w:rStyle w:val="Collegamentoipertestuale"/>
@@ -2440,7 +2439,7 @@
               <w:rPr>
                 <w:noProof/>
               </w:rPr>
-              <w:instrText xml:space="preserve"> PAGEREF _Toc243560031 \h </w:instrText>
+              <w:instrText xml:space="preserve"> PAGEREF _Toc243560586 \h </w:instrText>
             </w:r>
             <w:r>
               <w:rPr>
@@ -2477,7 +2476,7 @@
               <w:noProof/>
             </w:rPr>
           </w:pPr>
-          <w:hyperlink w:anchor="_Toc243560032" w:history="1">
+          <w:hyperlink w:anchor="_Toc243560587" w:history="1">
             <w:r>
               <w:rPr>
                 <w:rStyle w:val="Collegamentoipertestuale"/>
@@ -2501,7 +2500,7 @@
               <w:rPr>
                 <w:noProof/>
               </w:rPr>
-              <w:instrText xml:space="preserve"> PAGEREF _Toc243560032 \h </w:instrText>
+              <w:instrText xml:space="preserve"> PAGEREF _Toc243560587 \h </w:instrText>
             </w:r>
             <w:r>
               <w:rPr>
@@ -2538,7 +2537,7 @@
               <w:noProof/>
             </w:rPr>
           </w:pPr>
-          <w:hyperlink w:anchor="_Toc243560033" w:history="1">
+          <w:hyperlink w:anchor="_Toc243560588" w:history="1">
             <w:r>
               <w:rPr>
                 <w:rStyle w:val="Collegamentoipertestuale"/>
@@ -2562,7 +2561,7 @@
               <w:rPr>
                 <w:noProof/>
               </w:rPr>
-              <w:instrText xml:space="preserve"> PAGEREF _Toc243560033 \h </w:instrText>
+              <w:instrText xml:space="preserve"> PAGEREF _Toc243560588 \h </w:instrText>
             </w:r>
             <w:r>
               <w:rPr>
@@ -2599,7 +2598,7 @@
               <w:noProof/>
             </w:rPr>
           </w:pPr>
-          <w:hyperlink w:anchor="_Toc243560034" w:history="1">
+          <w:hyperlink w:anchor="_Toc243560589" w:history="1">
             <w:r>
               <w:rPr>
                 <w:rStyle w:val="Collegamentoipertestuale"/>
@@ -2623,7 +2622,7 @@
               <w:rPr>
                 <w:noProof/>
               </w:rPr>
-              <w:instrText xml:space="preserve"> PAGEREF _Toc243560034 \h </w:instrText>
+              <w:instrText xml:space="preserve"> PAGEREF _Toc243560589 \h </w:instrText>
             </w:r>
             <w:r>
               <w:rPr>
@@ -2660,7 +2659,7 @@
               <w:noProof/>
             </w:rPr>
           </w:pPr>
-          <w:hyperlink w:anchor="_Toc243560035" w:history="1">
+          <w:hyperlink w:anchor="_Toc243560590" w:history="1">
             <w:r>
               <w:rPr>
                 <w:rStyle w:val="Collegamentoipertestuale"/>
@@ -2684,7 +2683,7 @@
               <w:rPr>
                 <w:noProof/>
               </w:rPr>
-              <w:instrText xml:space="preserve"> PAGEREF _Toc243560035 \h </w:instrText>
+              <w:instrText xml:space="preserve"> PAGEREF _Toc243560590 \h </w:instrText>
             </w:r>
             <w:r>
               <w:rPr>
@@ -2721,7 +2720,7 @@
               <w:noProof/>
             </w:rPr>
           </w:pPr>
-          <w:hyperlink w:anchor="_Toc243560036" w:history="1">
+          <w:hyperlink w:anchor="_Toc243560591" w:history="1">
             <w:r>
               <w:rPr>
                 <w:rStyle w:val="Collegamentoipertestuale"/>
@@ -2745,7 +2744,7 @@
               <w:rPr>
                 <w:noProof/>
               </w:rPr>
-              <w:instrText xml:space="preserve"> PAGEREF _Toc243560036 \h </w:instrText>
+              <w:instrText xml:space="preserve"> PAGEREF _Toc243560591 \h </w:instrText>
             </w:r>
             <w:r>
               <w:rPr>
@@ -2782,7 +2781,7 @@
               <w:noProof/>
             </w:rPr>
           </w:pPr>
-          <w:hyperlink w:anchor="_Toc243560037" w:history="1">
+          <w:hyperlink w:anchor="_Toc243560592" w:history="1">
             <w:r>
               <w:rPr>
                 <w:rStyle w:val="Collegamentoipertestuale"/>
@@ -2806,7 +2805,7 @@
               <w:rPr>
                 <w:noProof/>
               </w:rPr>
-              <w:instrText xml:space="preserve"> PAGEREF _Toc243560037 \h </w:instrText>
+              <w:instrText xml:space="preserve"> PAGEREF _Toc243560592 \h </w:instrText>
             </w:r>
             <w:r>
               <w:rPr>
@@ -2843,7 +2842,7 @@
               <w:noProof/>
             </w:rPr>
           </w:pPr>
-          <w:hyperlink w:anchor="_Toc243560038" w:history="1">
+          <w:hyperlink w:anchor="_Toc243560593" w:history="1">
             <w:r>
               <w:rPr>
                 <w:rStyle w:val="Collegamentoipertestuale"/>
@@ -2867,7 +2866,7 @@
               <w:rPr>
                 <w:noProof/>
               </w:rPr>
-              <w:instrText xml:space="preserve"> PAGEREF _Toc243560038 \h </w:instrText>
+              <w:instrText xml:space="preserve"> PAGEREF _Toc243560593 \h </w:instrText>
             </w:r>
             <w:r>
               <w:rPr>
@@ -2910,9 +2909,8 @@
       <w:pPr>
         <w:pStyle w:val="Titolo1"/>
       </w:pPr>
-      <w:bookmarkStart w:id="0" w:name="_Toc243559994"/>
-      <w:r>
-        <w:lastRenderedPageBreak/>
+      <w:bookmarkStart w:id="0" w:name="_Toc243560549"/>
+      <w:r>
         <w:t>1. In breve</w:t>
       </w:r>
       <w:bookmarkEnd w:id="0"/>
@@ -3202,7 +3200,7 @@
       <w:pPr>
         <w:pStyle w:val="Titolo1"/>
       </w:pPr>
-      <w:bookmarkStart w:id="1" w:name="_Toc243559995"/>
+      <w:bookmarkStart w:id="1" w:name="_Toc243560550"/>
       <w:r>
         <w:t>2. Nuovo marchio</w:t>
       </w:r>
@@ -3212,7 +3210,7 @@
       <w:pPr>
         <w:pStyle w:val="Titolo2"/>
       </w:pPr>
-      <w:bookmarkStart w:id="2" w:name="_Toc243559996"/>
+      <w:bookmarkStart w:id="2" w:name="_Toc243560551"/>
       <w:r>
         <w:t>2.1 Nomi e identificativi</w:t>
       </w:r>
@@ -3758,9 +3756,8 @@
       <w:pPr>
         <w:pStyle w:val="Titolo2"/>
       </w:pPr>
-      <w:bookmarkStart w:id="3" w:name="_Toc243559997"/>
-      <w:r>
-        <w:lastRenderedPageBreak/>
+      <w:bookmarkStart w:id="3" w:name="_Toc243560552"/>
+      <w:r>
         <w:t>2.2 Colori</w:t>
       </w:r>
       <w:bookmarkEnd w:id="3"/>
@@ -4154,7 +4151,7 @@
       <w:pPr>
         <w:pStyle w:val="Titolo2"/>
       </w:pPr>
-      <w:bookmarkStart w:id="4" w:name="_Toc243559998"/>
+      <w:bookmarkStart w:id="4" w:name="_Toc243560553"/>
       <w:r>
         <w:t>2.3 Icona in uso: 24 «Foglio senza fondo» (serie 6, 22 ottobre)</w:t>
       </w:r>
@@ -4188,7 +4185,7 @@
           <w:noProof/>
         </w:rPr>
         <w:drawing>
-          <wp:inline distT="0" distB="0" distL="0" distR="0" wp14:anchorId="75B61833" wp14:editId="65CB6199">
+          <wp:inline distT="0" distB="0" distL="0" distR="0" wp14:anchorId="5F1E0A90" wp14:editId="1E881C98">
             <wp:extent cx="3429000" cy="4000500"/>
             <wp:effectExtent l="0" t="0" r="0" b="0"/>
             <wp:docPr id="2" name="Immagine 2"/>
@@ -4247,7 +4244,7 @@
       <w:pPr>
         <w:pStyle w:val="Titolo2"/>
       </w:pPr>
-      <w:bookmarkStart w:id="5" w:name="_Toc243559999"/>
+      <w:bookmarkStart w:id="5" w:name="_Toc243560554"/>
       <w:r>
         <w:t>2.4 Serie 4: la 17 «Foglio oro», in uso fino al 21 ottobre</w:t>
       </w:r>
@@ -4280,9 +4277,8 @@
         <w:rPr>
           <w:noProof/>
         </w:rPr>
-        <w:lastRenderedPageBreak/>
         <w:drawing>
-          <wp:inline distT="0" distB="0" distL="0" distR="0" wp14:anchorId="466C1B33" wp14:editId="3C5C4D97">
+          <wp:inline distT="0" distB="0" distL="0" distR="0" wp14:anchorId="66BDA45F" wp14:editId="1457B059">
             <wp:extent cx="5334000" cy="5895975"/>
             <wp:effectExtent l="0" t="0" r="0" b="0"/>
             <wp:docPr id="3" name="Immagine 3"/>
@@ -4695,7 +4691,7 @@
       <w:pPr>
         <w:pStyle w:val="Titolo2"/>
       </w:pPr>
-      <w:bookmarkStart w:id="6" w:name="_Toc243560000"/>
+      <w:bookmarkStart w:id="6" w:name="_Toc243560555"/>
       <w:r>
         <w:t>2.5 Serie 5: la 17 con più bianco, la 19 in uso il 21 ottobre</w:t>
       </w:r>
@@ -4716,11 +4712,7 @@
         <w:t>Scelta la 19 «Foglio bianco»</w:t>
       </w:r>
       <w:r>
-        <w:t xml:space="preserve"> (21 ottobre), </w:t>
-      </w:r>
-      <w:r>
-        <w:lastRenderedPageBreak/>
-        <w:t>applicata su tutte le piattaforme: icone di Windows, macOS, Linux e Android, favicon, logo, schermate di avvio e immagini dell'installer.</w:t>
+        <w:t xml:space="preserve"> (21 ottobre), applicata su tutte le piattaforme: icone di Windows, macOS, Linux e Android, favicon, logo, schermate di avvio e immagini dell'installer.</w:t>
       </w:r>
     </w:p>
     <w:p>
@@ -4733,7 +4725,7 @@
           <w:noProof/>
         </w:rPr>
         <w:drawing>
-          <wp:inline distT="0" distB="0" distL="0" distR="0" wp14:anchorId="3C19806F" wp14:editId="3960EF5A">
+          <wp:inline distT="0" distB="0" distL="0" distR="0" wp14:anchorId="03150606" wp14:editId="5894D6CA">
             <wp:extent cx="5715000" cy="3295650"/>
             <wp:effectExtent l="0" t="0" r="0" b="0"/>
             <wp:docPr id="4" name="Immagine 4"/>
@@ -5280,7 +5272,7 @@
       <w:pPr>
         <w:pStyle w:val="Titolo2"/>
       </w:pPr>
-      <w:bookmarkStart w:id="7" w:name="_Toc243560001"/>
+      <w:bookmarkStart w:id="7" w:name="_Toc243560556"/>
       <w:r>
         <w:t>2.6 Serie 3, non scelta (la 11 è diventata la serie 4)</w:t>
       </w:r>
@@ -5303,9 +5295,8 @@
         <w:rPr>
           <w:noProof/>
         </w:rPr>
-        <w:lastRenderedPageBreak/>
         <w:drawing>
-          <wp:inline distT="0" distB="0" distL="0" distR="0" wp14:anchorId="56CB1F0B" wp14:editId="4972D08C">
+          <wp:inline distT="0" distB="0" distL="0" distR="0" wp14:anchorId="6100EF94" wp14:editId="7BF3FCB2">
             <wp:extent cx="5905500" cy="4133850"/>
             <wp:effectExtent l="0" t="0" r="0" b="0"/>
             <wp:docPr id="5" name="Immagine 5"/>
@@ -5991,7 +5982,7 @@
       <w:pPr>
         <w:pStyle w:val="Titolo2"/>
       </w:pPr>
-      <w:bookmarkStart w:id="8" w:name="_Toc243560002"/>
+      <w:bookmarkStart w:id="8" w:name="_Toc243560557"/>
       <w:r>
         <w:t>2.7 Serie 2, non scelta</w:t>
       </w:r>
@@ -6014,9 +6005,8 @@
         <w:rPr>
           <w:noProof/>
         </w:rPr>
-        <w:lastRenderedPageBreak/>
         <w:drawing>
-          <wp:inline distT="0" distB="0" distL="0" distR="0" wp14:anchorId="54B765BF" wp14:editId="1AC736E4">
+          <wp:inline distT="0" distB="0" distL="0" distR="0" wp14:anchorId="5A322323" wp14:editId="507AD3E6">
             <wp:extent cx="5905500" cy="4133850"/>
             <wp:effectExtent l="0" t="0" r="0" b="0"/>
             <wp:docPr id="6" name="Immagine 6"/>
@@ -6736,7 +6726,7 @@
       <w:pPr>
         <w:pStyle w:val="Titolo2"/>
       </w:pPr>
-      <w:bookmarkStart w:id="9" w:name="_Toc243560003"/>
+      <w:bookmarkStart w:id="9" w:name="_Toc243560558"/>
       <w:r>
         <w:t>2.8 Serie 1, scartata</w:t>
       </w:r>
@@ -6759,9 +6749,8 @@
         <w:rPr>
           <w:noProof/>
         </w:rPr>
-        <w:lastRenderedPageBreak/>
         <w:drawing>
-          <wp:inline distT="0" distB="0" distL="0" distR="0" wp14:anchorId="67918EE2" wp14:editId="56236DEF">
+          <wp:inline distT="0" distB="0" distL="0" distR="0" wp14:anchorId="132004C3" wp14:editId="4E635706">
             <wp:extent cx="4000500" cy="2800350"/>
             <wp:effectExtent l="0" t="0" r="0" b="0"/>
             <wp:docPr id="7" name="Immagine 7"/>
@@ -6820,7 +6809,7 @@
       <w:pPr>
         <w:pStyle w:val="Titolo2"/>
       </w:pPr>
-      <w:bookmarkStart w:id="10" w:name="_Toc243560004"/>
+      <w:bookmarkStart w:id="10" w:name="_Toc243560559"/>
       <w:r>
         <w:t>2.9 Verifica dei marchi registrati</w:t>
       </w:r>
@@ -7072,7 +7061,7 @@
       <w:pPr>
         <w:pStyle w:val="Titolo1"/>
       </w:pPr>
-      <w:bookmarkStart w:id="11" w:name="_Toc243560005"/>
+      <w:bookmarkStart w:id="11" w:name="_Toc243560560"/>
       <w:r>
         <w:t>3. Temi colore</w:t>
       </w:r>
@@ -7105,9 +7094,8 @@
         <w:rPr>
           <w:noProof/>
         </w:rPr>
-        <w:lastRenderedPageBreak/>
         <w:drawing>
-          <wp:inline distT="0" distB="0" distL="0" distR="0" wp14:anchorId="283D5101" wp14:editId="53594B69">
+          <wp:inline distT="0" distB="0" distL="0" distR="0" wp14:anchorId="540E6522" wp14:editId="474AAF07">
             <wp:extent cx="4572000" cy="3429000"/>
             <wp:effectExtent l="0" t="0" r="0" b="0"/>
             <wp:docPr id="8" name="Immagine 8"/>
@@ -7817,7 +7805,7 @@
       <w:pPr>
         <w:pStyle w:val="Titolo1"/>
       </w:pPr>
-      <w:bookmarkStart w:id="12" w:name="_Toc243560006"/>
+      <w:bookmarkStart w:id="12" w:name="_Toc243560561"/>
       <w:r>
         <w:t>4. Correzione: avvisi «come JavaScript»</w:t>
       </w:r>
@@ -7827,7 +7815,7 @@
       <w:pPr>
         <w:pStyle w:val="Titolo2"/>
       </w:pPr>
-      <w:bookmarkStart w:id="13" w:name="_Toc243560007"/>
+      <w:bookmarkStart w:id="13" w:name="_Toc243560562"/>
       <w:r>
         <w:t>4.1 Il problema</w:t>
       </w:r>
@@ -8230,7 +8218,7 @@
       <w:pPr>
         <w:pStyle w:val="Titolo2"/>
       </w:pPr>
-      <w:bookmarkStart w:id="14" w:name="_Toc243560008"/>
+      <w:bookmarkStart w:id="14" w:name="_Toc243560563"/>
       <w:r>
         <w:t>4.2 La soluzione</w:t>
       </w:r>
@@ -8363,7 +8351,7 @@
           <w:noProof/>
         </w:rPr>
         <w:drawing>
-          <wp:inline distT="0" distB="0" distL="0" distR="0" wp14:anchorId="23AECFE4" wp14:editId="046A2204">
+          <wp:inline distT="0" distB="0" distL="0" distR="0" wp14:anchorId="17298C0B" wp14:editId="2FEE3613">
             <wp:extent cx="4572000" cy="3429000"/>
             <wp:effectExtent l="0" t="0" r="0" b="0"/>
             <wp:docPr id="9" name="Immagine 9"/>
@@ -8422,7 +8410,7 @@
       <w:pPr>
         <w:pStyle w:val="Titolo2"/>
       </w:pPr>
-      <w:bookmarkStart w:id="15" w:name="_Toc243560009"/>
+      <w:bookmarkStart w:id="15" w:name="_Toc243560564"/>
       <w:r>
         <w:t>4.3 Verifiche</w:t>
       </w:r>
@@ -8469,7 +8457,7 @@
       <w:pPr>
         <w:pStyle w:val="Titolo2"/>
       </w:pPr>
-      <w:bookmarkStart w:id="16" w:name="_Toc243560010"/>
+      <w:bookmarkStart w:id="16" w:name="_Toc243560565"/>
       <w:r>
         <w:t>4.4 Android: menu Tema e notifiche (versione 1.0.1)</w:t>
       </w:r>
@@ -8737,7 +8725,6 @@
           </w:tcPr>
           <w:p>
             <w:r>
-              <w:lastRenderedPageBreak/>
               <w:t>Non si leggono tutte le notifiche</w:t>
             </w:r>
           </w:p>
@@ -8805,7 +8792,7 @@
       <w:pPr>
         <w:pStyle w:val="Titolo2"/>
       </w:pPr>
-      <w:bookmarkStart w:id="17" w:name="_Toc243560011"/>
+      <w:bookmarkStart w:id="17" w:name="_Toc243560566"/>
       <w:r>
         <w:t>4.5 App più leggera: traduzione tolta</w:t>
       </w:r>
@@ -9238,7 +9225,7 @@
       <w:pPr>
         <w:pStyle w:val="Titolo2"/>
       </w:pPr>
-      <w:bookmarkStart w:id="18" w:name="_Toc243560012"/>
+      <w:bookmarkStart w:id="18" w:name="_Toc243560567"/>
       <w:r>
         <w:t>4.6 Schede in una nuova finestra</w:t>
       </w:r>
@@ -9356,7 +9343,7 @@
           <w:noProof/>
         </w:rPr>
         <w:drawing>
-          <wp:inline distT="0" distB="0" distL="0" distR="0" wp14:anchorId="76A7B22A" wp14:editId="1A6AF6BD">
+          <wp:inline distT="0" distB="0" distL="0" distR="0" wp14:anchorId="609D3398" wp14:editId="09D12D02">
             <wp:extent cx="5715000" cy="857250"/>
             <wp:effectExtent l="0" t="0" r="0" b="0"/>
             <wp:docPr id="10" name="Immagine 10"/>
@@ -9554,7 +9541,6 @@
           </w:tcPr>
           <w:p>
             <w:r>
-              <w:lastRenderedPageBreak/>
               <w:t>Linux</w:t>
             </w:r>
           </w:p>
@@ -9646,7 +9632,7 @@
       <w:pPr>
         <w:pStyle w:val="Titolo2"/>
       </w:pPr>
-      <w:bookmarkStart w:id="19" w:name="_Toc243560013"/>
+      <w:bookmarkStart w:id="19" w:name="_Toc243560568"/>
       <w:r>
         <w:t>4.7 Riunire le finestre</w:t>
       </w:r>
@@ -9748,7 +9734,7 @@
       <w:pPr>
         <w:pStyle w:val="Titolo2"/>
       </w:pPr>
-      <w:bookmarkStart w:id="20" w:name="_Toc243560014"/>
+      <w:bookmarkStart w:id="20" w:name="_Toc243560569"/>
       <w:r>
         <w:t>4.8 Correzioni di «Modifica testo»</w:t>
       </w:r>
@@ -10012,9 +9998,8 @@
         <w:rPr>
           <w:noProof/>
         </w:rPr>
-        <w:lastRenderedPageBreak/>
         <w:drawing>
-          <wp:inline distT="0" distB="0" distL="0" distR="0" wp14:anchorId="14885F58" wp14:editId="4EBE6CAA">
+          <wp:inline distT="0" distB="0" distL="0" distR="0" wp14:anchorId="38B85096" wp14:editId="11F86070">
             <wp:extent cx="3286125" cy="2286000"/>
             <wp:effectExtent l="0" t="0" r="0" b="0"/>
             <wp:docPr id="11" name="Immagine 11"/>
@@ -10079,7 +10064,7 @@
           <w:noProof/>
         </w:rPr>
         <w:drawing>
-          <wp:inline distT="0" distB="0" distL="0" distR="0" wp14:anchorId="7A5B8A59" wp14:editId="24D77B4F">
+          <wp:inline distT="0" distB="0" distL="0" distR="0" wp14:anchorId="00986948" wp14:editId="720B924B">
             <wp:extent cx="3286125" cy="2286000"/>
             <wp:effectExtent l="0" t="0" r="0" b="0"/>
             <wp:docPr id="12" name="Immagine 12"/>
@@ -10146,7 +10131,7 @@
       <w:pPr>
         <w:pStyle w:val="Titolo2"/>
       </w:pPr>
-      <w:bookmarkStart w:id="21" w:name="_Toc243560015"/>
+      <w:bookmarkStart w:id="21" w:name="_Toc243560570"/>
       <w:r>
         <w:t>4.9 Web app per iPhone</w:t>
       </w:r>
@@ -10564,7 +10549,6 @@
           <w:bCs/>
           <w:color w:val="3B3632"/>
         </w:rPr>
-        <w:lastRenderedPageBreak/>
         <w:t>Regola (22 ottobre):</w:t>
       </w:r>
       <w:r>
@@ -10586,7 +10570,7 @@
       <w:pPr>
         <w:pStyle w:val="Titolo1"/>
       </w:pPr>
-      <w:bookmarkStart w:id="22" w:name="_Toc243560016"/>
+      <w:bookmarkStart w:id="22" w:name="_Toc243560571"/>
       <w:r>
         <w:t>5. Decisioni</w:t>
       </w:r>
@@ -10604,7 +10588,7 @@
       <w:pPr>
         <w:pStyle w:val="Titolo2"/>
       </w:pPr>
-      <w:bookmarkStart w:id="23" w:name="_Toc243560017"/>
+      <w:bookmarkStart w:id="23" w:name="_Toc243560572"/>
       <w:r>
         <w:t>5.1 Canale degli aggiornamenti</w:t>
       </w:r>
@@ -11111,7 +11095,7 @@
       <w:pPr>
         <w:pStyle w:val="Titolo2"/>
       </w:pPr>
-      <w:bookmarkStart w:id="24" w:name="_Toc243560018"/>
+      <w:bookmarkStart w:id="24" w:name="_Toc243560573"/>
       <w:r>
         <w:t>5.2 Storia del repository</w:t>
       </w:r>
@@ -11562,7 +11546,6 @@
           </w:tcPr>
           <w:p>
             <w:r>
-              <w:lastRenderedPageBreak/>
               <w:t>Compromesso efficace</w:t>
             </w:r>
           </w:p>
@@ -11619,7 +11602,7 @@
       <w:pPr>
         <w:pStyle w:val="Titolo2"/>
       </w:pPr>
-      <w:bookmarkStart w:id="25" w:name="_Toc243560019"/>
+      <w:bookmarkStart w:id="25" w:name="_Toc243560574"/>
       <w:r>
         <w:t>5.3 Identificativi del prodotto</w:t>
       </w:r>
@@ -12119,7 +12102,7 @@
       <w:pPr>
         <w:pStyle w:val="Titolo2"/>
       </w:pPr>
-      <w:bookmarkStart w:id="26" w:name="_Toc243560020"/>
+      <w:bookmarkStart w:id="26" w:name="_Toc243560575"/>
       <w:r>
         <w:t>5.4 Avvisi e domande</w:t>
       </w:r>
@@ -12626,7 +12609,7 @@
       <w:pPr>
         <w:pStyle w:val="Titolo2"/>
       </w:pPr>
-      <w:bookmarkStart w:id="27" w:name="_Toc243560021"/>
+      <w:bookmarkStart w:id="27" w:name="_Toc243560576"/>
       <w:r>
         <w:t>5.5 Traduzione offline</w:t>
       </w:r>
@@ -12692,7 +12675,6 @@
                 <w:bCs/>
                 <w:color w:val="FFFFFF"/>
               </w:rPr>
-              <w:lastRenderedPageBreak/>
               <w:t>Scenario</w:t>
             </w:r>
           </w:p>
@@ -13134,7 +13116,7 @@
       <w:pPr>
         <w:pStyle w:val="Titolo2"/>
       </w:pPr>
-      <w:bookmarkStart w:id="28" w:name="_Toc243560022"/>
+      <w:bookmarkStart w:id="28" w:name="_Toc243560577"/>
       <w:r>
         <w:t>5.6 Passaggio della scheda alla nuova finestra</w:t>
       </w:r>
@@ -13656,7 +13638,7 @@
       <w:pPr>
         <w:pStyle w:val="Titolo2"/>
       </w:pPr>
-      <w:bookmarkStart w:id="29" w:name="_Toc243560023"/>
+      <w:bookmarkStart w:id="29" w:name="_Toc243560578"/>
       <w:r>
         <w:t>5.7 Come si cancella la riga in «Modifica testo»</w:t>
       </w:r>
@@ -14163,7 +14145,7 @@
       <w:pPr>
         <w:pStyle w:val="Titolo1"/>
       </w:pPr>
-      <w:bookmarkStart w:id="30" w:name="_Toc243560024"/>
+      <w:bookmarkStart w:id="30" w:name="_Toc243560579"/>
       <w:r>
         <w:t>6. Come si lavora</w:t>
       </w:r>
@@ -14173,7 +14155,7 @@
       <w:pPr>
         <w:pStyle w:val="Titolo2"/>
       </w:pPr>
-      <w:bookmarkStart w:id="31" w:name="_Toc243560025"/>
+      <w:bookmarkStart w:id="31" w:name="_Toc243560580"/>
       <w:r>
         <w:t>6.1 Comandi</w:t>
       </w:r>
@@ -14243,7 +14225,7 @@
       <w:pPr>
         <w:pStyle w:val="Titolo2"/>
       </w:pPr>
-      <w:bookmarkStart w:id="32" w:name="_Toc243560026"/>
+      <w:bookmarkStart w:id="32" w:name="_Toc243560581"/>
       <w:r>
         <w:t>6.2 Pubblicare una versione</w:t>
       </w:r>
@@ -14371,7 +14353,7 @@
       <w:pPr>
         <w:pStyle w:val="Titolo2"/>
       </w:pPr>
-      <w:bookmarkStart w:id="33" w:name="_Toc243560027"/>
+      <w:bookmarkStart w:id="33" w:name="_Toc243560582"/>
       <w:r>
         <w:t>6.3 Release 1.0.0 (pubblicata il 16 ottobre 2026)</w:t>
       </w:r>
@@ -14933,11 +14915,7 @@
           </w:tcPr>
           <w:p>
             <w:r>
-              <w:t xml:space="preserve">PDFz-1.0.0-android.apk </w:t>
-            </w:r>
-            <w:r>
-              <w:lastRenderedPageBreak/>
-              <w:t>(firmato con la chiave di PDFz)</w:t>
+              <w:t>PDFz-1.0.0-android.apk (firmato con la chiave di PDFz)</w:t>
             </w:r>
           </w:p>
         </w:tc>
@@ -14959,7 +14937,6 @@
           </w:tcPr>
           <w:p>
             <w:r>
-              <w:lastRenderedPageBreak/>
               <w:t>61,6 MB</w:t>
             </w:r>
           </w:p>
@@ -15103,7 +15080,7 @@
       <w:pPr>
         <w:pStyle w:val="Titolo2"/>
       </w:pPr>
-      <w:bookmarkStart w:id="34" w:name="_Toc243560028"/>
+      <w:bookmarkStart w:id="34" w:name="_Toc243560583"/>
       <w:r>
         <w:t>6.4 Release 1.0.1</w:t>
       </w:r>
@@ -15400,7 +15377,7 @@
       <w:pPr>
         <w:pStyle w:val="Titolo2"/>
       </w:pPr>
-      <w:bookmarkStart w:id="35" w:name="_Toc243560029"/>
+      <w:bookmarkStart w:id="35" w:name="_Toc243560584"/>
       <w:r>
         <w:t>6.5 Release 1.0.2 e repository pubblico</w:t>
       </w:r>
@@ -15822,7 +15799,7 @@
       <w:pPr>
         <w:pStyle w:val="Titolo2"/>
       </w:pPr>
-      <w:bookmarkStart w:id="36" w:name="_Toc243560030"/>
+      <w:bookmarkStart w:id="36" w:name="_Toc243560585"/>
       <w:r>
         <w:t>6.6 Nuova versione: link diretto per ogni sistema</w:t>
       </w:r>
@@ -15882,7 +15859,6 @@
                 <w:bCs/>
                 <w:color w:val="FFFFFF"/>
               </w:rPr>
-              <w:lastRenderedPageBreak/>
               <w:t>Sistema</w:t>
             </w:r>
           </w:p>
@@ -16240,7 +16216,7 @@
           <w:noProof/>
         </w:rPr>
         <w:drawing>
-          <wp:inline distT="0" distB="0" distL="0" distR="0" wp14:anchorId="79A24CA7" wp14:editId="6263A365">
+          <wp:inline distT="0" distB="0" distL="0" distR="0" wp14:anchorId="40F84EB8" wp14:editId="10F0B772">
             <wp:extent cx="4572000" cy="4429125"/>
             <wp:effectExtent l="0" t="0" r="0" b="0"/>
             <wp:docPr id="13" name="Immagine 13"/>
@@ -16315,7 +16291,7 @@
       <w:pPr>
         <w:pStyle w:val="Titolo2"/>
       </w:pPr>
-      <w:bookmarkStart w:id="37" w:name="_Toc243560031"/>
+      <w:bookmarkStart w:id="37" w:name="_Toc243560586"/>
       <w:r>
         <w:t>6.7 Release 1.1.0</w:t>
       </w:r>
@@ -16664,7 +16640,6 @@
           </w:tcPr>
           <w:p>
             <w:r>
-              <w:lastRenderedPageBreak/>
               <w:t>Linux</w:t>
             </w:r>
           </w:p>
@@ -16880,7 +16855,7 @@
       <w:pPr>
         <w:pStyle w:val="Titolo2"/>
       </w:pPr>
-      <w:bookmarkStart w:id="38" w:name="_Toc243560032"/>
+      <w:bookmarkStart w:id="38" w:name="_Toc243560587"/>
       <w:r>
         <w:t>6.8 Versione 1.2.0</w:t>
       </w:r>
@@ -17429,7 +17404,7 @@
       <w:pPr>
         <w:pStyle w:val="Titolo2"/>
       </w:pPr>
-      <w:bookmarkStart w:id="39" w:name="_Toc243560033"/>
+      <w:bookmarkStart w:id="39" w:name="_Toc243560588"/>
       <w:r>
         <w:t>6.9 Versione 1.2.1</w:t>
       </w:r>
@@ -17447,7 +17422,7 @@
       <w:pPr>
         <w:pStyle w:val="Titolo2"/>
       </w:pPr>
-      <w:bookmarkStart w:id="40" w:name="_Toc243560034"/>
+      <w:bookmarkStart w:id="40" w:name="_Toc243560589"/>
       <w:r>
         <w:t>6.10 Versione 1.3.0</w:t>
       </w:r>
@@ -17458,7 +17433,10 @@
         <w:spacing w:after="120"/>
       </w:pPr>
       <w:r>
-        <w:t xml:space="preserve">Preparata il 22 ottobre 2026: icona 24 su tutte le piattaforme, web app per iPhone unita al codice, barra in alto corretta sui telefoni stretti. Installer Windows 101.3.0, Android 1001003000. Da questa versione ogni modifica si pubblica subito come nuova versione e l'utente riceve i link di download (richiesta del 22 ottobre). La web app esce su GitHub Pages quando l'autore accende la pubblicazione (variabile </w:t>
+        <w:t>Pubblicata il 22 ottobre 2026 (release «Latest», pipeline riuscita in 6 minuti; la web app è stata saltata perché GitHub Pages non è ancora acceso): icona 24 su tutte le piattaforme, web app per iPhone unita al codice, barra in alto corretta sui telefoni stretti. Link verificati senza account: MSI 131,6 MB, DMG 160,0 MB, AppImage 175,1 MB, APK 64,6 MB. Installer Windows 101.3.0, Android 1001003000. Da questa versione ogni modifica si pubblica subito come nuova versione e l'utente riceve i link di download (</w:t>
+      </w:r>
+      <w:r>
+        <w:t xml:space="preserve">richiesta del 22 ottobre). La web app esce su GitHub Pages quando l'autore accende la pubblicazione (variabile </w:t>
       </w:r>
       <w:r>
         <w:rPr>
@@ -17476,7 +17454,7 @@
       <w:pPr>
         <w:pStyle w:val="Titolo2"/>
       </w:pPr>
-      <w:bookmarkStart w:id="41" w:name="_Toc243560035"/>
+      <w:bookmarkStart w:id="41" w:name="_Toc243560590"/>
       <w:r>
         <w:t>6.11 Ruoli</w:t>
       </w:r>
@@ -17717,7 +17695,6 @@
           </w:tcPr>
           <w:p>
             <w:r>
-              <w:lastRenderedPageBreak/>
               <w:t>Cybersecurity</w:t>
             </w:r>
           </w:p>
@@ -17750,7 +17727,7 @@
       <w:pPr>
         <w:pStyle w:val="Titolo1"/>
       </w:pPr>
-      <w:bookmarkStart w:id="42" w:name="_Toc243560036"/>
+      <w:bookmarkStart w:id="42" w:name="_Toc243560591"/>
       <w:r>
         <w:t>7. Sicurezza</w:t>
       </w:r>
@@ -18049,7 +18026,7 @@
       <w:pPr>
         <w:pStyle w:val="Titolo1"/>
       </w:pPr>
-      <w:bookmarkStart w:id="43" w:name="_Toc243560037"/>
+      <w:bookmarkStart w:id="43" w:name="_Toc243560592"/>
       <w:r>
         <w:t>8. Punti aperti</w:t>
       </w:r>
@@ -18258,7 +18235,7 @@
       <w:pPr>
         <w:pStyle w:val="Titolo1"/>
       </w:pPr>
-      <w:bookmarkStart w:id="44" w:name="_Toc243560038"/>
+      <w:bookmarkStart w:id="44" w:name="_Toc243560593"/>
       <w:r>
         <w:t>9. Pensato per i prossimi 10 anni</w:t>
       </w:r>
@@ -18358,7 +18335,6 @@
           <w:b/>
           <w:bCs/>
         </w:rPr>
-        <w:lastRenderedPageBreak/>
         <w:t>Più finestre</w:t>
       </w:r>
       <w:r>
@@ -18537,10 +18513,10 @@
 <file path=word/numbering.xml><?xml version="1.0" encoding="utf-8"?>
 <w:numbering xmlns:wpc="http://schemas.microsoft.com/office/word/2010/wordprocessingCanvas" xmlns:cx="http://schemas.microsoft.com/office/drawing/2014/chartex" xmlns:cx1="http://schemas.microsoft.com/office/drawing/2015/9/8/chartex" xmlns:cx2="http://schemas.microsoft.com/office/drawing/2015/10/21/chartex" xmlns:cx3="http://schemas.microsoft.com/office/drawing/2016/5/9/chartex" xmlns:cx4="http://schemas.microsoft.com/office/drawing/2016/5/10/chartex" xmlns:cx5="http://schemas.microsoft.com/office/drawing/2016/5/11/chartex" xmlns:cx6="http://schemas.microsoft.com/office/drawing/2016/5/12/chartex" xmlns:cx7="http://schemas.microsoft.com/office/drawing/2016/5/13/chartex" xmlns:cx8="http://schemas.microsoft.com/office/drawing/2016/5/14/chartex" xmlns:mc="http://schemas.openxmlformats.org/markup-compatibility/2006" xmlns:aink="http://schemas.microsoft.com/office/drawing/2016/ink" xmlns:am3d="http://schemas.microsoft.com/office/drawing/2017/model3d" xmlns:o="urn:schemas-microsoft-com:office:office" xmlns:oel="http://schemas.microsoft.com/office/2019/extlst" xmlns:r="http://schemas.openxmlformats.org/officeDocument/2006/relationships" xmlns:m="http://schemas.openxmlformats.org/officeDocument/2006/math" xmlns:v="urn:schemas-microsoft-com:vml" xmlns:wp14="http://schemas.microsoft.com/office/word/2010/wordprocessingDrawing" xmlns:wp="http://schemas.openxmlformats.org/drawingml/2006/wordprocessingDrawing" xmlns:w10="urn:schemas-microsoft-com:office:word" xmlns:w="http://schemas.openxmlformats.org/wordprocessingml/2006/main" xmlns:w14="http://schemas.microsoft.com/office/word/2010/wordml" xmlns:w15="http://schemas.microsoft.com/office/word/2012/wordml" xmlns:w16cex="http://schemas.microsoft.com/office/word/2018/wordml/cex" xmlns:w16cid="http://schemas.microsoft.com/office/word/2016/wordml/cid" xmlns:w16="http://schemas.microsoft.com/office/word/2018/wordml" xmlns:w16du="http://schemas.microsoft.com/office/word/2023/wordml/word16du" xmlns:w16sdtdh="http://schemas.microsoft.com/office/word/2020/wordml/sdtdatahash" xmlns:w16sdtfl="http://schemas.microsoft.com/office/word/2024/wordml/sdtformatlock" xmlns:w16se="http://schemas.microsoft.com/office/word/2015/wordml/symex" xmlns:wpg="http://schemas.microsoft.com/office/word/2010/wordprocessingGroup" xmlns:wpi="http://schemas.microsoft.com/office/word/2010/wordprocessingInk" xmlns:wne="http://schemas.microsoft.com/office/word/2006/wordml" xmlns:wps="http://schemas.microsoft.com/office/word/2010/wordprocessingShape" mc:Ignorable="w14 w15 w16se w16cid w16 w16cex w16sdtdh w16sdtfl w16du wp14">
   <w:abstractNum w:abstractNumId="0" w15:restartNumberingAfterBreak="0">
-    <w:nsid w:val="36E52632"/>
+    <w:nsid w:val="08F2666F"/>
     <w:multiLevelType w:val="hybridMultilevel"/>
-    <w:tmpl w:val="F45C2308"/>
-    <w:lvl w:ilvl="0" w:tplc="360AA22E">
+    <w:tmpl w:val="05666D58"/>
+    <w:lvl w:ilvl="0" w:tplc="33967034">
       <w:start w:val="1"/>
       <w:numFmt w:val="decimal"/>
       <w:lvlText w:val="%1."/>
@@ -18549,138 +18525,52 @@
         <w:ind w:left="540" w:hanging="300"/>
       </w:pPr>
     </w:lvl>
-    <w:lvl w:ilvl="1" w:tplc="6B0E7014">
+    <w:lvl w:ilvl="1" w:tplc="00AE5D1E">
       <w:numFmt w:val="decimal"/>
       <w:lvlText w:val=""/>
       <w:lvlJc w:val="left"/>
     </w:lvl>
-    <w:lvl w:ilvl="2" w:tplc="2D986EC2">
+    <w:lvl w:ilvl="2" w:tplc="AF1AF086">
       <w:numFmt w:val="decimal"/>
       <w:lvlText w:val=""/>
       <w:lvlJc w:val="left"/>
     </w:lvl>
-    <w:lvl w:ilvl="3" w:tplc="77124E1C">
+    <w:lvl w:ilvl="3" w:tplc="FB9AD3E8">
       <w:numFmt w:val="decimal"/>
       <w:lvlText w:val=""/>
       <w:lvlJc w:val="left"/>
     </w:lvl>
-    <w:lvl w:ilvl="4" w:tplc="1D0A7F98">
+    <w:lvl w:ilvl="4" w:tplc="283A82AC">
       <w:numFmt w:val="decimal"/>
       <w:lvlText w:val=""/>
       <w:lvlJc w:val="left"/>
     </w:lvl>
-    <w:lvl w:ilvl="5" w:tplc="600AC318">
+    <w:lvl w:ilvl="5" w:tplc="82EAC8F2">
       <w:numFmt w:val="decimal"/>
       <w:lvlText w:val=""/>
       <w:lvlJc w:val="left"/>
     </w:lvl>
-    <w:lvl w:ilvl="6" w:tplc="FC16A142">
+    <w:lvl w:ilvl="6" w:tplc="83A49B58">
       <w:numFmt w:val="decimal"/>
       <w:lvlText w:val=""/>
       <w:lvlJc w:val="left"/>
     </w:lvl>
-    <w:lvl w:ilvl="7" w:tplc="FF8EABE0">
+    <w:lvl w:ilvl="7" w:tplc="15664C0A">
       <w:numFmt w:val="decimal"/>
       <w:lvlText w:val=""/>
       <w:lvlJc w:val="left"/>
     </w:lvl>
-    <w:lvl w:ilvl="8" w:tplc="1FBCD4CA">
+    <w:lvl w:ilvl="8" w:tplc="933495F8">
       <w:numFmt w:val="decimal"/>
       <w:lvlText w:val=""/>
       <w:lvlJc w:val="left"/>
     </w:lvl>
   </w:abstractNum>
   <w:abstractNum w:abstractNumId="1" w15:restartNumberingAfterBreak="0">
-    <w:nsid w:val="5E9372F0"/>
+    <w:nsid w:val="22EF6D60"/>
     <w:multiLevelType w:val="hybridMultilevel"/>
-    <w:tmpl w:val="1B0E4EF0"/>
-    <w:lvl w:ilvl="0" w:tplc="CA86107A" w:tentative="1">
-      <w:start w:val="1"/>
-      <w:numFmt w:val="bullet"/>
-      <w:lvlText w:val="●"/>
-      <w:lvlJc w:val="left"/>
-      <w:pPr>
-        <w:ind w:left="720" w:hanging="360"/>
-      </w:pPr>
-    </w:lvl>
-    <w:lvl w:ilvl="1" w:tplc="9126DCAC" w:tentative="1">
-      <w:start w:val="1"/>
-      <w:numFmt w:val="bullet"/>
-      <w:lvlText w:val="○"/>
-      <w:lvlJc w:val="left"/>
-      <w:pPr>
-        <w:ind w:left="1440" w:hanging="360"/>
-      </w:pPr>
-    </w:lvl>
-    <w:lvl w:ilvl="2" w:tplc="409C07DA" w:tentative="1">
-      <w:start w:val="1"/>
-      <w:numFmt w:val="bullet"/>
-      <w:lvlText w:val="■"/>
-      <w:lvlJc w:val="left"/>
-      <w:pPr>
-        <w:ind w:left="2160" w:hanging="360"/>
-      </w:pPr>
-    </w:lvl>
-    <w:lvl w:ilvl="3" w:tplc="86C6CE86" w:tentative="1">
-      <w:start w:val="1"/>
-      <w:numFmt w:val="bullet"/>
-      <w:lvlText w:val="●"/>
-      <w:lvlJc w:val="left"/>
-      <w:pPr>
-        <w:ind w:left="2880" w:hanging="360"/>
-      </w:pPr>
-    </w:lvl>
-    <w:lvl w:ilvl="4" w:tplc="686C7B2C" w:tentative="1">
-      <w:start w:val="1"/>
-      <w:numFmt w:val="bullet"/>
-      <w:lvlText w:val="○"/>
-      <w:lvlJc w:val="left"/>
-      <w:pPr>
-        <w:ind w:left="3600" w:hanging="360"/>
-      </w:pPr>
-    </w:lvl>
-    <w:lvl w:ilvl="5" w:tplc="E5660A4A" w:tentative="1">
-      <w:start w:val="1"/>
-      <w:numFmt w:val="bullet"/>
-      <w:lvlText w:val="■"/>
-      <w:lvlJc w:val="left"/>
-      <w:pPr>
-        <w:ind w:left="4320" w:hanging="360"/>
-      </w:pPr>
-    </w:lvl>
-    <w:lvl w:ilvl="6" w:tplc="2648E620" w:tentative="1">
-      <w:start w:val="1"/>
-      <w:numFmt w:val="bullet"/>
-      <w:lvlText w:val="●"/>
-      <w:lvlJc w:val="left"/>
-      <w:pPr>
-        <w:ind w:left="5040" w:hanging="360"/>
-      </w:pPr>
-    </w:lvl>
-    <w:lvl w:ilvl="7" w:tplc="1486BBA4" w:tentative="1">
-      <w:start w:val="1"/>
-      <w:numFmt w:val="bullet"/>
-      <w:lvlText w:val="●"/>
-      <w:lvlJc w:val="left"/>
-      <w:pPr>
-        <w:ind w:left="5760" w:hanging="360"/>
-      </w:pPr>
-    </w:lvl>
-    <w:lvl w:ilvl="8" w:tplc="0FCC60A4" w:tentative="1">
-      <w:start w:val="1"/>
-      <w:numFmt w:val="bullet"/>
-      <w:lvlText w:val="●"/>
-      <w:lvlJc w:val="left"/>
-      <w:pPr>
-        <w:ind w:left="6480" w:hanging="360"/>
-      </w:pPr>
-    </w:lvl>
-  </w:abstractNum>
-  <w:abstractNum w:abstractNumId="2" w15:restartNumberingAfterBreak="0">
-    <w:nsid w:val="6B340A75"/>
-    <w:multiLevelType w:val="hybridMultilevel"/>
-    <w:tmpl w:val="B13AAC7A"/>
-    <w:lvl w:ilvl="0" w:tplc="5C42CDCE">
+    <w:tmpl w:val="AF5A971C"/>
+    <w:lvl w:ilvl="0" w:tplc="B1662A3A">
       <w:start w:val="1"/>
       <w:numFmt w:val="decimal"/>
       <w:lvlText w:val="%1."/>
@@ -18689,52 +18579,138 @@
         <w:ind w:left="540" w:hanging="300"/>
       </w:pPr>
     </w:lvl>
-    <w:lvl w:ilvl="1" w:tplc="0972AB18">
+    <w:lvl w:ilvl="1" w:tplc="6212B274">
       <w:numFmt w:val="decimal"/>
       <w:lvlText w:val=""/>
       <w:lvlJc w:val="left"/>
     </w:lvl>
-    <w:lvl w:ilvl="2" w:tplc="27BCE1B2">
+    <w:lvl w:ilvl="2" w:tplc="7AE2B2B6">
       <w:numFmt w:val="decimal"/>
       <w:lvlText w:val=""/>
       <w:lvlJc w:val="left"/>
     </w:lvl>
-    <w:lvl w:ilvl="3" w:tplc="1F5C72B4">
+    <w:lvl w:ilvl="3" w:tplc="63A411EC">
       <w:numFmt w:val="decimal"/>
       <w:lvlText w:val=""/>
       <w:lvlJc w:val="left"/>
     </w:lvl>
-    <w:lvl w:ilvl="4" w:tplc="EBDC03B0">
+    <w:lvl w:ilvl="4" w:tplc="CB32C052">
       <w:numFmt w:val="decimal"/>
       <w:lvlText w:val=""/>
       <w:lvlJc w:val="left"/>
     </w:lvl>
-    <w:lvl w:ilvl="5" w:tplc="CBB463E6">
+    <w:lvl w:ilvl="5" w:tplc="931895A8">
       <w:numFmt w:val="decimal"/>
       <w:lvlText w:val=""/>
       <w:lvlJc w:val="left"/>
     </w:lvl>
-    <w:lvl w:ilvl="6" w:tplc="D99828F2">
+    <w:lvl w:ilvl="6" w:tplc="E2A0B9A8">
       <w:numFmt w:val="decimal"/>
       <w:lvlText w:val=""/>
       <w:lvlJc w:val="left"/>
     </w:lvl>
-    <w:lvl w:ilvl="7" w:tplc="4A808B5E">
+    <w:lvl w:ilvl="7" w:tplc="1068C506">
       <w:numFmt w:val="decimal"/>
       <w:lvlText w:val=""/>
       <w:lvlJc w:val="left"/>
     </w:lvl>
-    <w:lvl w:ilvl="8" w:tplc="40BA8656">
+    <w:lvl w:ilvl="8" w:tplc="F92EFE34">
       <w:numFmt w:val="decimal"/>
       <w:lvlText w:val=""/>
       <w:lvlJc w:val="left"/>
     </w:lvl>
   </w:abstractNum>
+  <w:abstractNum w:abstractNumId="2" w15:restartNumberingAfterBreak="0">
+    <w:nsid w:val="3F3F1FD0"/>
+    <w:multiLevelType w:val="hybridMultilevel"/>
+    <w:tmpl w:val="5F42F232"/>
+    <w:lvl w:ilvl="0" w:tplc="F8043442" w:tentative="1">
+      <w:start w:val="1"/>
+      <w:numFmt w:val="bullet"/>
+      <w:lvlText w:val="●"/>
+      <w:lvlJc w:val="left"/>
+      <w:pPr>
+        <w:ind w:left="720" w:hanging="360"/>
+      </w:pPr>
+    </w:lvl>
+    <w:lvl w:ilvl="1" w:tplc="4362880A" w:tentative="1">
+      <w:start w:val="1"/>
+      <w:numFmt w:val="bullet"/>
+      <w:lvlText w:val="○"/>
+      <w:lvlJc w:val="left"/>
+      <w:pPr>
+        <w:ind w:left="1440" w:hanging="360"/>
+      </w:pPr>
+    </w:lvl>
+    <w:lvl w:ilvl="2" w:tplc="5FFCDA98" w:tentative="1">
+      <w:start w:val="1"/>
+      <w:numFmt w:val="bullet"/>
+      <w:lvlText w:val="■"/>
+      <w:lvlJc w:val="left"/>
+      <w:pPr>
+        <w:ind w:left="2160" w:hanging="360"/>
+      </w:pPr>
+    </w:lvl>
+    <w:lvl w:ilvl="3" w:tplc="8092FC1E" w:tentative="1">
+      <w:start w:val="1"/>
+      <w:numFmt w:val="bullet"/>
+      <w:lvlText w:val="●"/>
+      <w:lvlJc w:val="left"/>
+      <w:pPr>
+        <w:ind w:left="2880" w:hanging="360"/>
+      </w:pPr>
+    </w:lvl>
+    <w:lvl w:ilvl="4" w:tplc="C680BBB6" w:tentative="1">
+      <w:start w:val="1"/>
+      <w:numFmt w:val="bullet"/>
+      <w:lvlText w:val="○"/>
+      <w:lvlJc w:val="left"/>
+      <w:pPr>
+        <w:ind w:left="3600" w:hanging="360"/>
+      </w:pPr>
+    </w:lvl>
+    <w:lvl w:ilvl="5" w:tplc="D01ECF3E" w:tentative="1">
+      <w:start w:val="1"/>
+      <w:numFmt w:val="bullet"/>
+      <w:lvlText w:val="■"/>
+      <w:lvlJc w:val="left"/>
+      <w:pPr>
+        <w:ind w:left="4320" w:hanging="360"/>
+      </w:pPr>
+    </w:lvl>
+    <w:lvl w:ilvl="6" w:tplc="F88CAEA0" w:tentative="1">
+      <w:start w:val="1"/>
+      <w:numFmt w:val="bullet"/>
+      <w:lvlText w:val="●"/>
+      <w:lvlJc w:val="left"/>
+      <w:pPr>
+        <w:ind w:left="5040" w:hanging="360"/>
+      </w:pPr>
+    </w:lvl>
+    <w:lvl w:ilvl="7" w:tplc="B0A657DE" w:tentative="1">
+      <w:start w:val="1"/>
+      <w:numFmt w:val="bullet"/>
+      <w:lvlText w:val="●"/>
+      <w:lvlJc w:val="left"/>
+      <w:pPr>
+        <w:ind w:left="5760" w:hanging="360"/>
+      </w:pPr>
+    </w:lvl>
+    <w:lvl w:ilvl="8" w:tplc="5E8C8898" w:tentative="1">
+      <w:start w:val="1"/>
+      <w:numFmt w:val="bullet"/>
+      <w:lvlText w:val="●"/>
+      <w:lvlJc w:val="left"/>
+      <w:pPr>
+        <w:ind w:left="6480" w:hanging="360"/>
+      </w:pPr>
+    </w:lvl>
+  </w:abstractNum>
   <w:abstractNum w:abstractNumId="3" w15:restartNumberingAfterBreak="0">
-    <w:nsid w:val="77C638C4"/>
+    <w:nsid w:val="48983F13"/>
     <w:multiLevelType w:val="hybridMultilevel"/>
-    <w:tmpl w:val="0026F892"/>
-    <w:lvl w:ilvl="0" w:tplc="A7087358">
+    <w:tmpl w:val="E4B216B4"/>
+    <w:lvl w:ilvl="0" w:tplc="7E005888">
       <w:start w:val="1"/>
       <w:numFmt w:val="bullet"/>
       <w:lvlText w:val="•"/>
@@ -18743,67 +18719,67 @@
         <w:ind w:left="540" w:hanging="270"/>
       </w:pPr>
     </w:lvl>
-    <w:lvl w:ilvl="1" w:tplc="984AB550">
+    <w:lvl w:ilvl="1" w:tplc="C18236D8">
       <w:numFmt w:val="decimal"/>
       <w:lvlText w:val=""/>
       <w:lvlJc w:val="left"/>
     </w:lvl>
-    <w:lvl w:ilvl="2" w:tplc="5B08B4BE">
+    <w:lvl w:ilvl="2" w:tplc="8A26624E">
       <w:numFmt w:val="decimal"/>
       <w:lvlText w:val=""/>
       <w:lvlJc w:val="left"/>
     </w:lvl>
-    <w:lvl w:ilvl="3" w:tplc="6E82EDDE">
+    <w:lvl w:ilvl="3" w:tplc="DDC69E30">
       <w:numFmt w:val="decimal"/>
       <w:lvlText w:val=""/>
       <w:lvlJc w:val="left"/>
     </w:lvl>
-    <w:lvl w:ilvl="4" w:tplc="DB62C0A0">
+    <w:lvl w:ilvl="4" w:tplc="31C0F400">
       <w:numFmt w:val="decimal"/>
       <w:lvlText w:val=""/>
       <w:lvlJc w:val="left"/>
     </w:lvl>
-    <w:lvl w:ilvl="5" w:tplc="33B2865E">
+    <w:lvl w:ilvl="5" w:tplc="64349E90">
       <w:numFmt w:val="decimal"/>
       <w:lvlText w:val=""/>
       <w:lvlJc w:val="left"/>
     </w:lvl>
-    <w:lvl w:ilvl="6" w:tplc="5BF8C900">
+    <w:lvl w:ilvl="6" w:tplc="6CEE8090">
       <w:numFmt w:val="decimal"/>
       <w:lvlText w:val=""/>
       <w:lvlJc w:val="left"/>
     </w:lvl>
-    <w:lvl w:ilvl="7" w:tplc="B55287A4">
+    <w:lvl w:ilvl="7" w:tplc="A4D2A91C">
       <w:numFmt w:val="decimal"/>
       <w:lvlText w:val=""/>
       <w:lvlJc w:val="left"/>
     </w:lvl>
-    <w:lvl w:ilvl="8" w:tplc="25463C68">
+    <w:lvl w:ilvl="8" w:tplc="2A0C6256">
       <w:numFmt w:val="decimal"/>
       <w:lvlText w:val=""/>
       <w:lvlJc w:val="left"/>
     </w:lvl>
   </w:abstractNum>
-  <w:num w:numId="1" w16cid:durableId="791024142">
-    <w:abstractNumId w:val="1"/>
+  <w:num w:numId="1" w16cid:durableId="1559902241">
+    <w:abstractNumId w:val="2"/>
     <w:lvlOverride w:ilvl="0">
       <w:startOverride w:val="1"/>
     </w:lvlOverride>
   </w:num>
-  <w:num w:numId="2" w16cid:durableId="963081380">
+  <w:num w:numId="2" w16cid:durableId="1415587488">
     <w:abstractNumId w:val="3"/>
     <w:lvlOverride w:ilvl="0">
       <w:startOverride w:val="1"/>
     </w:lvlOverride>
   </w:num>
-  <w:num w:numId="3" w16cid:durableId="301273123">
+  <w:num w:numId="3" w16cid:durableId="941568814">
     <w:abstractNumId w:val="0"/>
     <w:lvlOverride w:ilvl="0">
       <w:startOverride w:val="1"/>
     </w:lvlOverride>
   </w:num>
-  <w:num w:numId="4" w16cid:durableId="1205555003">
-    <w:abstractNumId w:val="2"/>
+  <w:num w:numId="4" w16cid:durableId="1071853144">
+    <w:abstractNumId w:val="1"/>
     <w:lvlOverride w:ilvl="0">
       <w:startOverride w:val="1"/>
     </w:lvlOverride>
@@ -19444,7 +19420,7 @@
     <w:autoRedefine/>
     <w:uiPriority w:val="39"/>
     <w:unhideWhenUsed/>
-    <w:rsid w:val="0071002A"/>
+    <w:rsid w:val="00C16A3E"/>
     <w:pPr>
       <w:spacing w:after="100"/>
     </w:pPr>
@@ -19456,7 +19432,7 @@
     <w:autoRedefine/>
     <w:uiPriority w:val="39"/>
     <w:unhideWhenUsed/>
-    <w:rsid w:val="0071002A"/>
+    <w:rsid w:val="00C16A3E"/>
     <w:pPr>
       <w:spacing w:after="100"/>
       <w:ind w:left="210"/>

</xml_diff>

<commit_message>
Sito degli aggiornamenti su Cloudflare (per il repository privato)
- .github/workflows/cloudflare.yml (al posto di pages.yml): dopo ogni release
  carica gli installer e il codice sorgente nell'archivio R2 (tiene le ultime
  5 versioni), compila la web app per iPhone e pubblica su Cloudflare Pages
  pagina, versione-*.json e /app/. Si accende con CLOUDFLARE_PAGES = true.
- packaging/sito_aggiornamenti.py: pagina degli aggiornamenti e file di
  versione con i link https://<sito>/download/vX.Y.Z/<file>.
- cloudflare/functions/download: installer dall'archivio R2, con ripresa.
- release.yml: i versione-*.json della GitHub Release puntano sempre a GitHub.
- docs/cloudflare-aggiornamenti.md con i passi e l'ordine del passaggio
  (versione ponte prima del repository privato), documenti, CLAUDE.md, Word.

Co-Authored-By: Claude Opus 5.5 <noreply@anthropic.com>
</commit_message>
<xml_diff>
--- a/docs/PDFz_20261022.docx
+++ b/docs/PDFz_20261022.docx
@@ -16,7 +16,7 @@
           <w:noProof/>
         </w:rPr>
         <w:drawing>
-          <wp:inline distT="0" distB="0" distL="0" distR="0" wp14:anchorId="4C4F0972" wp14:editId="0F2A26C5">
+          <wp:inline distT="0" distB="0" distL="0" distR="0" wp14:anchorId="67B0C0C8" wp14:editId="02E0A54E">
             <wp:extent cx="3619500" cy="1285875"/>
             <wp:effectExtent l="0" t="0" r="0" b="0"/>
             <wp:docPr id="1" name="Immagine 1"/>
@@ -129,13 +129,14 @@
           <w:sz w:val="32"/>
           <w:szCs w:val="32"/>
         </w:rPr>
+        <w:lastRenderedPageBreak/>
         <w:t>Indice</w:t>
       </w:r>
     </w:p>
     <w:sdt>
       <w:sdtPr>
         <w:alias w:val="Indice"/>
-        <w:id w:val="1809595153"/>
+        <w:id w:val="-1316256019"/>
       </w:sdtPr>
       <w:sdtEndPr/>
       <w:sdtContent>
@@ -158,7 +159,7 @@
           <w:r>
             <w:fldChar w:fldCharType="separate"/>
           </w:r>
-          <w:hyperlink w:anchor="_Toc243560549" w:history="1">
+          <w:hyperlink w:anchor="_Toc243564982" w:history="1">
             <w:r>
               <w:rPr>
                 <w:rStyle w:val="Collegamentoipertestuale"/>
@@ -182,7 +183,7 @@
               <w:rPr>
                 <w:noProof/>
               </w:rPr>
-              <w:instrText xml:space="preserve"> PAGEREF _Toc243560549 \h </w:instrText>
+              <w:instrText xml:space="preserve"> PAGEREF _Toc243564982 \h </w:instrText>
             </w:r>
             <w:r>
               <w:rPr>
@@ -219,7 +220,7 @@
               <w:noProof/>
             </w:rPr>
           </w:pPr>
-          <w:hyperlink w:anchor="_Toc243560550" w:history="1">
+          <w:hyperlink w:anchor="_Toc243564983" w:history="1">
             <w:r>
               <w:rPr>
                 <w:rStyle w:val="Collegamentoipertestuale"/>
@@ -243,7 +244,7 @@
               <w:rPr>
                 <w:noProof/>
               </w:rPr>
-              <w:instrText xml:space="preserve"> PAGEREF _Toc243560550 \h </w:instrText>
+              <w:instrText xml:space="preserve"> PAGEREF _Toc243564983 \h </w:instrText>
             </w:r>
             <w:r>
               <w:rPr>
@@ -280,7 +281,7 @@
               <w:noProof/>
             </w:rPr>
           </w:pPr>
-          <w:hyperlink w:anchor="_Toc243560551" w:history="1">
+          <w:hyperlink w:anchor="_Toc243564984" w:history="1">
             <w:r>
               <w:rPr>
                 <w:rStyle w:val="Collegamentoipertestuale"/>
@@ -304,7 +305,7 @@
               <w:rPr>
                 <w:noProof/>
               </w:rPr>
-              <w:instrText xml:space="preserve"> PAGEREF _Toc243560551 \h </w:instrText>
+              <w:instrText xml:space="preserve"> PAGEREF _Toc243564984 \h </w:instrText>
             </w:r>
             <w:r>
               <w:rPr>
@@ -341,7 +342,7 @@
               <w:noProof/>
             </w:rPr>
           </w:pPr>
-          <w:hyperlink w:anchor="_Toc243560552" w:history="1">
+          <w:hyperlink w:anchor="_Toc243564985" w:history="1">
             <w:r>
               <w:rPr>
                 <w:rStyle w:val="Collegamentoipertestuale"/>
@@ -365,7 +366,7 @@
               <w:rPr>
                 <w:noProof/>
               </w:rPr>
-              <w:instrText xml:space="preserve"> PAGEREF _Toc243560552 \h </w:instrText>
+              <w:instrText xml:space="preserve"> PAGEREF _Toc243564985 \h </w:instrText>
             </w:r>
             <w:r>
               <w:rPr>
@@ -402,7 +403,7 @@
               <w:noProof/>
             </w:rPr>
           </w:pPr>
-          <w:hyperlink w:anchor="_Toc243560553" w:history="1">
+          <w:hyperlink w:anchor="_Toc243564986" w:history="1">
             <w:r>
               <w:rPr>
                 <w:rStyle w:val="Collegamentoipertestuale"/>
@@ -426,7 +427,7 @@
               <w:rPr>
                 <w:noProof/>
               </w:rPr>
-              <w:instrText xml:space="preserve"> PAGEREF _Toc243560553 \h </w:instrText>
+              <w:instrText xml:space="preserve"> PAGEREF _Toc243564986 \h </w:instrText>
             </w:r>
             <w:r>
               <w:rPr>
@@ -463,7 +464,7 @@
               <w:noProof/>
             </w:rPr>
           </w:pPr>
-          <w:hyperlink w:anchor="_Toc243560554" w:history="1">
+          <w:hyperlink w:anchor="_Toc243564987" w:history="1">
             <w:r>
               <w:rPr>
                 <w:rStyle w:val="Collegamentoipertestuale"/>
@@ -487,7 +488,7 @@
               <w:rPr>
                 <w:noProof/>
               </w:rPr>
-              <w:instrText xml:space="preserve"> PAGEREF _Toc243560554 \h </w:instrText>
+              <w:instrText xml:space="preserve"> PAGEREF _Toc243564987 \h </w:instrText>
             </w:r>
             <w:r>
               <w:rPr>
@@ -524,7 +525,7 @@
               <w:noProof/>
             </w:rPr>
           </w:pPr>
-          <w:hyperlink w:anchor="_Toc243560555" w:history="1">
+          <w:hyperlink w:anchor="_Toc243564988" w:history="1">
             <w:r>
               <w:rPr>
                 <w:rStyle w:val="Collegamentoipertestuale"/>
@@ -548,7 +549,7 @@
               <w:rPr>
                 <w:noProof/>
               </w:rPr>
-              <w:instrText xml:space="preserve"> PAGEREF _Toc243560555 \h </w:instrText>
+              <w:instrText xml:space="preserve"> PAGEREF _Toc243564988 \h </w:instrText>
             </w:r>
             <w:r>
               <w:rPr>
@@ -585,7 +586,7 @@
               <w:noProof/>
             </w:rPr>
           </w:pPr>
-          <w:hyperlink w:anchor="_Toc243560556" w:history="1">
+          <w:hyperlink w:anchor="_Toc243564989" w:history="1">
             <w:r>
               <w:rPr>
                 <w:rStyle w:val="Collegamentoipertestuale"/>
@@ -609,7 +610,7 @@
               <w:rPr>
                 <w:noProof/>
               </w:rPr>
-              <w:instrText xml:space="preserve"> PAGEREF _Toc243560556 \h </w:instrText>
+              <w:instrText xml:space="preserve"> PAGEREF _Toc243564989 \h </w:instrText>
             </w:r>
             <w:r>
               <w:rPr>
@@ -646,7 +647,7 @@
               <w:noProof/>
             </w:rPr>
           </w:pPr>
-          <w:hyperlink w:anchor="_Toc243560557" w:history="1">
+          <w:hyperlink w:anchor="_Toc243564990" w:history="1">
             <w:r>
               <w:rPr>
                 <w:rStyle w:val="Collegamentoipertestuale"/>
@@ -670,7 +671,7 @@
               <w:rPr>
                 <w:noProof/>
               </w:rPr>
-              <w:instrText xml:space="preserve"> PAGEREF _Toc243560557 \h </w:instrText>
+              <w:instrText xml:space="preserve"> PAGEREF _Toc243564990 \h </w:instrText>
             </w:r>
             <w:r>
               <w:rPr>
@@ -707,7 +708,7 @@
               <w:noProof/>
             </w:rPr>
           </w:pPr>
-          <w:hyperlink w:anchor="_Toc243560558" w:history="1">
+          <w:hyperlink w:anchor="_Toc243564991" w:history="1">
             <w:r>
               <w:rPr>
                 <w:rStyle w:val="Collegamentoipertestuale"/>
@@ -731,7 +732,7 @@
               <w:rPr>
                 <w:noProof/>
               </w:rPr>
-              <w:instrText xml:space="preserve"> PAGEREF _Toc243560558 \h </w:instrText>
+              <w:instrText xml:space="preserve"> PAGEREF _Toc243564991 \h </w:instrText>
             </w:r>
             <w:r>
               <w:rPr>
@@ -768,7 +769,7 @@
               <w:noProof/>
             </w:rPr>
           </w:pPr>
-          <w:hyperlink w:anchor="_Toc243560559" w:history="1">
+          <w:hyperlink w:anchor="_Toc243564992" w:history="1">
             <w:r>
               <w:rPr>
                 <w:rStyle w:val="Collegamentoipertestuale"/>
@@ -792,7 +793,7 @@
               <w:rPr>
                 <w:noProof/>
               </w:rPr>
-              <w:instrText xml:space="preserve"> PAGEREF _Toc243560559 \h </w:instrText>
+              <w:instrText xml:space="preserve"> PAGEREF _Toc243564992 \h </w:instrText>
             </w:r>
             <w:r>
               <w:rPr>
@@ -829,7 +830,7 @@
               <w:noProof/>
             </w:rPr>
           </w:pPr>
-          <w:hyperlink w:anchor="_Toc243560560" w:history="1">
+          <w:hyperlink w:anchor="_Toc243564993" w:history="1">
             <w:r>
               <w:rPr>
                 <w:rStyle w:val="Collegamentoipertestuale"/>
@@ -853,7 +854,7 @@
               <w:rPr>
                 <w:noProof/>
               </w:rPr>
-              <w:instrText xml:space="preserve"> PAGEREF _Toc243560560 \h </w:instrText>
+              <w:instrText xml:space="preserve"> PAGEREF _Toc243564993 \h </w:instrText>
             </w:r>
             <w:r>
               <w:rPr>
@@ -890,7 +891,7 @@
               <w:noProof/>
             </w:rPr>
           </w:pPr>
-          <w:hyperlink w:anchor="_Toc243560561" w:history="1">
+          <w:hyperlink w:anchor="_Toc243564994" w:history="1">
             <w:r>
               <w:rPr>
                 <w:rStyle w:val="Collegamentoipertestuale"/>
@@ -914,7 +915,7 @@
               <w:rPr>
                 <w:noProof/>
               </w:rPr>
-              <w:instrText xml:space="preserve"> PAGEREF _Toc243560561 \h </w:instrText>
+              <w:instrText xml:space="preserve"> PAGEREF _Toc243564994 \h </w:instrText>
             </w:r>
             <w:r>
               <w:rPr>
@@ -951,7 +952,7 @@
               <w:noProof/>
             </w:rPr>
           </w:pPr>
-          <w:hyperlink w:anchor="_Toc243560562" w:history="1">
+          <w:hyperlink w:anchor="_Toc243564995" w:history="1">
             <w:r>
               <w:rPr>
                 <w:rStyle w:val="Collegamentoipertestuale"/>
@@ -975,7 +976,7 @@
               <w:rPr>
                 <w:noProof/>
               </w:rPr>
-              <w:instrText xml:space="preserve"> PAGEREF _Toc243560562 \h </w:instrText>
+              <w:instrText xml:space="preserve"> PAGEREF _Toc243564995 \h </w:instrText>
             </w:r>
             <w:r>
               <w:rPr>
@@ -1012,7 +1013,7 @@
               <w:noProof/>
             </w:rPr>
           </w:pPr>
-          <w:hyperlink w:anchor="_Toc243560563" w:history="1">
+          <w:hyperlink w:anchor="_Toc243564996" w:history="1">
             <w:r>
               <w:rPr>
                 <w:rStyle w:val="Collegamentoipertestuale"/>
@@ -1036,7 +1037,7 @@
               <w:rPr>
                 <w:noProof/>
               </w:rPr>
-              <w:instrText xml:space="preserve"> PAGEREF _Toc243560563 \h </w:instrText>
+              <w:instrText xml:space="preserve"> PAGEREF _Toc243564996 \h </w:instrText>
             </w:r>
             <w:r>
               <w:rPr>
@@ -1073,7 +1074,7 @@
               <w:noProof/>
             </w:rPr>
           </w:pPr>
-          <w:hyperlink w:anchor="_Toc243560564" w:history="1">
+          <w:hyperlink w:anchor="_Toc243564997" w:history="1">
             <w:r>
               <w:rPr>
                 <w:rStyle w:val="Collegamentoipertestuale"/>
@@ -1097,7 +1098,7 @@
               <w:rPr>
                 <w:noProof/>
               </w:rPr>
-              <w:instrText xml:space="preserve"> PAGEREF _Toc243560564 \h </w:instrText>
+              <w:instrText xml:space="preserve"> PAGEREF _Toc243564997 \h </w:instrText>
             </w:r>
             <w:r>
               <w:rPr>
@@ -1134,7 +1135,7 @@
               <w:noProof/>
             </w:rPr>
           </w:pPr>
-          <w:hyperlink w:anchor="_Toc243560565" w:history="1">
+          <w:hyperlink w:anchor="_Toc243564998" w:history="1">
             <w:r>
               <w:rPr>
                 <w:rStyle w:val="Collegamentoipertestuale"/>
@@ -1158,7 +1159,7 @@
               <w:rPr>
                 <w:noProof/>
               </w:rPr>
-              <w:instrText xml:space="preserve"> PAGEREF _Toc243560565 \h </w:instrText>
+              <w:instrText xml:space="preserve"> PAGEREF _Toc243564998 \h </w:instrText>
             </w:r>
             <w:r>
               <w:rPr>
@@ -1195,7 +1196,7 @@
               <w:noProof/>
             </w:rPr>
           </w:pPr>
-          <w:hyperlink w:anchor="_Toc243560566" w:history="1">
+          <w:hyperlink w:anchor="_Toc243564999" w:history="1">
             <w:r>
               <w:rPr>
                 <w:rStyle w:val="Collegamentoipertestuale"/>
@@ -1219,7 +1220,7 @@
               <w:rPr>
                 <w:noProof/>
               </w:rPr>
-              <w:instrText xml:space="preserve"> PAGEREF _Toc243560566 \h </w:instrText>
+              <w:instrText xml:space="preserve"> PAGEREF _Toc243564999 \h </w:instrText>
             </w:r>
             <w:r>
               <w:rPr>
@@ -1256,7 +1257,7 @@
               <w:noProof/>
             </w:rPr>
           </w:pPr>
-          <w:hyperlink w:anchor="_Toc243560567" w:history="1">
+          <w:hyperlink w:anchor="_Toc243565000" w:history="1">
             <w:r>
               <w:rPr>
                 <w:rStyle w:val="Collegamentoipertestuale"/>
@@ -1280,7 +1281,7 @@
               <w:rPr>
                 <w:noProof/>
               </w:rPr>
-              <w:instrText xml:space="preserve"> PAGEREF _Toc243560567 \h </w:instrText>
+              <w:instrText xml:space="preserve"> PAGEREF _Toc243565000 \h </w:instrText>
             </w:r>
             <w:r>
               <w:rPr>
@@ -1317,7 +1318,7 @@
               <w:noProof/>
             </w:rPr>
           </w:pPr>
-          <w:hyperlink w:anchor="_Toc243560568" w:history="1">
+          <w:hyperlink w:anchor="_Toc243565001" w:history="1">
             <w:r>
               <w:rPr>
                 <w:rStyle w:val="Collegamentoipertestuale"/>
@@ -1341,7 +1342,7 @@
               <w:rPr>
                 <w:noProof/>
               </w:rPr>
-              <w:instrText xml:space="preserve"> PAGEREF _Toc243560568 \h </w:instrText>
+              <w:instrText xml:space="preserve"> PAGEREF _Toc243565001 \h </w:instrText>
             </w:r>
             <w:r>
               <w:rPr>
@@ -1378,7 +1379,7 @@
               <w:noProof/>
             </w:rPr>
           </w:pPr>
-          <w:hyperlink w:anchor="_Toc243560569" w:history="1">
+          <w:hyperlink w:anchor="_Toc243565002" w:history="1">
             <w:r>
               <w:rPr>
                 <w:rStyle w:val="Collegamentoipertestuale"/>
@@ -1402,7 +1403,7 @@
               <w:rPr>
                 <w:noProof/>
               </w:rPr>
-              <w:instrText xml:space="preserve"> PAGEREF _Toc243560569 \h </w:instrText>
+              <w:instrText xml:space="preserve"> PAGEREF _Toc243565002 \h </w:instrText>
             </w:r>
             <w:r>
               <w:rPr>
@@ -1439,7 +1440,7 @@
               <w:noProof/>
             </w:rPr>
           </w:pPr>
-          <w:hyperlink w:anchor="_Toc243560570" w:history="1">
+          <w:hyperlink w:anchor="_Toc243565003" w:history="1">
             <w:r>
               <w:rPr>
                 <w:rStyle w:val="Collegamentoipertestuale"/>
@@ -1463,7 +1464,7 @@
               <w:rPr>
                 <w:noProof/>
               </w:rPr>
-              <w:instrText xml:space="preserve"> PAGEREF _Toc243560570 \h </w:instrText>
+              <w:instrText xml:space="preserve"> PAGEREF _Toc243565003 \h </w:instrText>
             </w:r>
             <w:r>
               <w:rPr>
@@ -1481,6 +1482,67 @@
                 <w:noProof/>
               </w:rPr>
               <w:t>15</w:t>
+            </w:r>
+            <w:r>
+              <w:rPr>
+                <w:noProof/>
+              </w:rPr>
+              <w:fldChar w:fldCharType="end"/>
+            </w:r>
+          </w:hyperlink>
+        </w:p>
+        <w:p>
+          <w:pPr>
+            <w:pStyle w:val="Sommario2"/>
+            <w:tabs>
+              <w:tab w:val="right" w:leader="dot" w:pos="9628"/>
+            </w:tabs>
+            <w:rPr>
+              <w:noProof/>
+            </w:rPr>
+          </w:pPr>
+          <w:hyperlink w:anchor="_Toc243565004" w:history="1">
+            <w:r>
+              <w:rPr>
+                <w:rStyle w:val="Collegamentoipertestuale"/>
+                <w:noProof/>
+              </w:rPr>
+              <w:t>4.10 Aggiornamenti su Cloudflare (repository privato)</w:t>
+            </w:r>
+            <w:r>
+              <w:rPr>
+                <w:noProof/>
+              </w:rPr>
+              <w:tab/>
+            </w:r>
+            <w:r>
+              <w:rPr>
+                <w:noProof/>
+              </w:rPr>
+              <w:fldChar w:fldCharType="begin"/>
+            </w:r>
+            <w:r>
+              <w:rPr>
+                <w:noProof/>
+              </w:rPr>
+              <w:instrText xml:space="preserve"> PAGEREF _Toc243565004 \h </w:instrText>
+            </w:r>
+            <w:r>
+              <w:rPr>
+                <w:noProof/>
+              </w:rPr>
+            </w:r>
+            <w:r>
+              <w:rPr>
+                <w:noProof/>
+              </w:rPr>
+              <w:fldChar w:fldCharType="separate"/>
+            </w:r>
+            <w:r>
+              <w:rPr>
+                <w:noProof/>
+              </w:rPr>
+              <w:t>16</w:t>
             </w:r>
             <w:r>
               <w:rPr>
@@ -1500,7 +1562,7 @@
               <w:noProof/>
             </w:rPr>
           </w:pPr>
-          <w:hyperlink w:anchor="_Toc243560571" w:history="1">
+          <w:hyperlink w:anchor="_Toc243565005" w:history="1">
             <w:r>
               <w:rPr>
                 <w:rStyle w:val="Collegamentoipertestuale"/>
@@ -1524,7 +1586,7 @@
               <w:rPr>
                 <w:noProof/>
               </w:rPr>
-              <w:instrText xml:space="preserve"> PAGEREF _Toc243560571 \h </w:instrText>
+              <w:instrText xml:space="preserve"> PAGEREF _Toc243565005 \h </w:instrText>
             </w:r>
             <w:r>
               <w:rPr>
@@ -1561,7 +1623,7 @@
               <w:noProof/>
             </w:rPr>
           </w:pPr>
-          <w:hyperlink w:anchor="_Toc243560572" w:history="1">
+          <w:hyperlink w:anchor="_Toc243565006" w:history="1">
             <w:r>
               <w:rPr>
                 <w:rStyle w:val="Collegamentoipertestuale"/>
@@ -1585,7 +1647,7 @@
               <w:rPr>
                 <w:noProof/>
               </w:rPr>
-              <w:instrText xml:space="preserve"> PAGEREF _Toc243560572 \h </w:instrText>
+              <w:instrText xml:space="preserve"> PAGEREF _Toc243565006 \h </w:instrText>
             </w:r>
             <w:r>
               <w:rPr>
@@ -1622,7 +1684,7 @@
               <w:noProof/>
             </w:rPr>
           </w:pPr>
-          <w:hyperlink w:anchor="_Toc243560573" w:history="1">
+          <w:hyperlink w:anchor="_Toc243565007" w:history="1">
             <w:r>
               <w:rPr>
                 <w:rStyle w:val="Collegamentoipertestuale"/>
@@ -1646,7 +1708,7 @@
               <w:rPr>
                 <w:noProof/>
               </w:rPr>
-              <w:instrText xml:space="preserve"> PAGEREF _Toc243560573 \h </w:instrText>
+              <w:instrText xml:space="preserve"> PAGEREF _Toc243565007 \h </w:instrText>
             </w:r>
             <w:r>
               <w:rPr>
@@ -1663,7 +1725,7 @@
               <w:rPr>
                 <w:noProof/>
               </w:rPr>
-              <w:t>16</w:t>
+              <w:t>17</w:t>
             </w:r>
             <w:r>
               <w:rPr>
@@ -1683,7 +1745,7 @@
               <w:noProof/>
             </w:rPr>
           </w:pPr>
-          <w:hyperlink w:anchor="_Toc243560574" w:history="1">
+          <w:hyperlink w:anchor="_Toc243565008" w:history="1">
             <w:r>
               <w:rPr>
                 <w:rStyle w:val="Collegamentoipertestuale"/>
@@ -1707,7 +1769,7 @@
               <w:rPr>
                 <w:noProof/>
               </w:rPr>
-              <w:instrText xml:space="preserve"> PAGEREF _Toc243560574 \h </w:instrText>
+              <w:instrText xml:space="preserve"> PAGEREF _Toc243565008 \h </w:instrText>
             </w:r>
             <w:r>
               <w:rPr>
@@ -1744,7 +1806,7 @@
               <w:noProof/>
             </w:rPr>
           </w:pPr>
-          <w:hyperlink w:anchor="_Toc243560575" w:history="1">
+          <w:hyperlink w:anchor="_Toc243565009" w:history="1">
             <w:r>
               <w:rPr>
                 <w:rStyle w:val="Collegamentoipertestuale"/>
@@ -1768,7 +1830,7 @@
               <w:rPr>
                 <w:noProof/>
               </w:rPr>
-              <w:instrText xml:space="preserve"> PAGEREF _Toc243560575 \h </w:instrText>
+              <w:instrText xml:space="preserve"> PAGEREF _Toc243565009 \h </w:instrText>
             </w:r>
             <w:r>
               <w:rPr>
@@ -1785,7 +1847,7 @@
               <w:rPr>
                 <w:noProof/>
               </w:rPr>
-              <w:t>17</w:t>
+              <w:t>18</w:t>
             </w:r>
             <w:r>
               <w:rPr>
@@ -1805,7 +1867,7 @@
               <w:noProof/>
             </w:rPr>
           </w:pPr>
-          <w:hyperlink w:anchor="_Toc243560576" w:history="1">
+          <w:hyperlink w:anchor="_Toc243565010" w:history="1">
             <w:r>
               <w:rPr>
                 <w:rStyle w:val="Collegamentoipertestuale"/>
@@ -1829,7 +1891,7 @@
               <w:rPr>
                 <w:noProof/>
               </w:rPr>
-              <w:instrText xml:space="preserve"> PAGEREF _Toc243560576 \h </w:instrText>
+              <w:instrText xml:space="preserve"> PAGEREF _Toc243565010 \h </w:instrText>
             </w:r>
             <w:r>
               <w:rPr>
@@ -1846,7 +1908,7 @@
               <w:rPr>
                 <w:noProof/>
               </w:rPr>
-              <w:t>17</w:t>
+              <w:t>18</w:t>
             </w:r>
             <w:r>
               <w:rPr>
@@ -1866,7 +1928,7 @@
               <w:noProof/>
             </w:rPr>
           </w:pPr>
-          <w:hyperlink w:anchor="_Toc243560577" w:history="1">
+          <w:hyperlink w:anchor="_Toc243565011" w:history="1">
             <w:r>
               <w:rPr>
                 <w:rStyle w:val="Collegamentoipertestuale"/>
@@ -1890,7 +1952,7 @@
               <w:rPr>
                 <w:noProof/>
               </w:rPr>
-              <w:instrText xml:space="preserve"> PAGEREF _Toc243560577 \h </w:instrText>
+              <w:instrText xml:space="preserve"> PAGEREF _Toc243565011 \h </w:instrText>
             </w:r>
             <w:r>
               <w:rPr>
@@ -1927,7 +1989,7 @@
               <w:noProof/>
             </w:rPr>
           </w:pPr>
-          <w:hyperlink w:anchor="_Toc243560578" w:history="1">
+          <w:hyperlink w:anchor="_Toc243565012" w:history="1">
             <w:r>
               <w:rPr>
                 <w:rStyle w:val="Collegamentoipertestuale"/>
@@ -1951,7 +2013,7 @@
               <w:rPr>
                 <w:noProof/>
               </w:rPr>
-              <w:instrText xml:space="preserve"> PAGEREF _Toc243560578 \h </w:instrText>
+              <w:instrText xml:space="preserve"> PAGEREF _Toc243565012 \h </w:instrText>
             </w:r>
             <w:r>
               <w:rPr>
@@ -1968,7 +2030,7 @@
               <w:rPr>
                 <w:noProof/>
               </w:rPr>
-              <w:t>18</w:t>
+              <w:t>19</w:t>
             </w:r>
             <w:r>
               <w:rPr>
@@ -1988,7 +2050,7 @@
               <w:noProof/>
             </w:rPr>
           </w:pPr>
-          <w:hyperlink w:anchor="_Toc243560579" w:history="1">
+          <w:hyperlink w:anchor="_Toc243565013" w:history="1">
             <w:r>
               <w:rPr>
                 <w:rStyle w:val="Collegamentoipertestuale"/>
@@ -2012,7 +2074,7 @@
               <w:rPr>
                 <w:noProof/>
               </w:rPr>
-              <w:instrText xml:space="preserve"> PAGEREF _Toc243560579 \h </w:instrText>
+              <w:instrText xml:space="preserve"> PAGEREF _Toc243565013 \h </w:instrText>
             </w:r>
             <w:r>
               <w:rPr>
@@ -2049,7 +2111,7 @@
               <w:noProof/>
             </w:rPr>
           </w:pPr>
-          <w:hyperlink w:anchor="_Toc243560580" w:history="1">
+          <w:hyperlink w:anchor="_Toc243565014" w:history="1">
             <w:r>
               <w:rPr>
                 <w:rStyle w:val="Collegamentoipertestuale"/>
@@ -2073,7 +2135,7 @@
               <w:rPr>
                 <w:noProof/>
               </w:rPr>
-              <w:instrText xml:space="preserve"> PAGEREF _Toc243560580 \h </w:instrText>
+              <w:instrText xml:space="preserve"> PAGEREF _Toc243565014 \h </w:instrText>
             </w:r>
             <w:r>
               <w:rPr>
@@ -2110,7 +2172,7 @@
               <w:noProof/>
             </w:rPr>
           </w:pPr>
-          <w:hyperlink w:anchor="_Toc243560581" w:history="1">
+          <w:hyperlink w:anchor="_Toc243565015" w:history="1">
             <w:r>
               <w:rPr>
                 <w:rStyle w:val="Collegamentoipertestuale"/>
@@ -2134,7 +2196,7 @@
               <w:rPr>
                 <w:noProof/>
               </w:rPr>
-              <w:instrText xml:space="preserve"> PAGEREF _Toc243560581 \h </w:instrText>
+              <w:instrText xml:space="preserve"> PAGEREF _Toc243565015 \h </w:instrText>
             </w:r>
             <w:r>
               <w:rPr>
@@ -2171,7 +2233,7 @@
               <w:noProof/>
             </w:rPr>
           </w:pPr>
-          <w:hyperlink w:anchor="_Toc243560582" w:history="1">
+          <w:hyperlink w:anchor="_Toc243565016" w:history="1">
             <w:r>
               <w:rPr>
                 <w:rStyle w:val="Collegamentoipertestuale"/>
@@ -2195,7 +2257,7 @@
               <w:rPr>
                 <w:noProof/>
               </w:rPr>
-              <w:instrText xml:space="preserve"> PAGEREF _Toc243560582 \h </w:instrText>
+              <w:instrText xml:space="preserve"> PAGEREF _Toc243565016 \h </w:instrText>
             </w:r>
             <w:r>
               <w:rPr>
@@ -2212,7 +2274,7 @@
               <w:rPr>
                 <w:noProof/>
               </w:rPr>
-              <w:t>19</w:t>
+              <w:t>20</w:t>
             </w:r>
             <w:r>
               <w:rPr>
@@ -2232,7 +2294,7 @@
               <w:noProof/>
             </w:rPr>
           </w:pPr>
-          <w:hyperlink w:anchor="_Toc243560583" w:history="1">
+          <w:hyperlink w:anchor="_Toc243565017" w:history="1">
             <w:r>
               <w:rPr>
                 <w:rStyle w:val="Collegamentoipertestuale"/>
@@ -2256,7 +2318,7 @@
               <w:rPr>
                 <w:noProof/>
               </w:rPr>
-              <w:instrText xml:space="preserve"> PAGEREF _Toc243560583 \h </w:instrText>
+              <w:instrText xml:space="preserve"> PAGEREF _Toc243565017 \h </w:instrText>
             </w:r>
             <w:r>
               <w:rPr>
@@ -2293,7 +2355,7 @@
               <w:noProof/>
             </w:rPr>
           </w:pPr>
-          <w:hyperlink w:anchor="_Toc243560584" w:history="1">
+          <w:hyperlink w:anchor="_Toc243565018" w:history="1">
             <w:r>
               <w:rPr>
                 <w:rStyle w:val="Collegamentoipertestuale"/>
@@ -2317,7 +2379,7 @@
               <w:rPr>
                 <w:noProof/>
               </w:rPr>
-              <w:instrText xml:space="preserve"> PAGEREF _Toc243560584 \h </w:instrText>
+              <w:instrText xml:space="preserve"> PAGEREF _Toc243565018 \h </w:instrText>
             </w:r>
             <w:r>
               <w:rPr>
@@ -2334,7 +2396,7 @@
               <w:rPr>
                 <w:noProof/>
               </w:rPr>
-              <w:t>20</w:t>
+              <w:t>21</w:t>
             </w:r>
             <w:r>
               <w:rPr>
@@ -2354,7 +2416,7 @@
               <w:noProof/>
             </w:rPr>
           </w:pPr>
-          <w:hyperlink w:anchor="_Toc243560585" w:history="1">
+          <w:hyperlink w:anchor="_Toc243565019" w:history="1">
             <w:r>
               <w:rPr>
                 <w:rStyle w:val="Collegamentoipertestuale"/>
@@ -2378,7 +2440,7 @@
               <w:rPr>
                 <w:noProof/>
               </w:rPr>
-              <w:instrText xml:space="preserve"> PAGEREF _Toc243560585 \h </w:instrText>
+              <w:instrText xml:space="preserve"> PAGEREF _Toc243565019 \h </w:instrText>
             </w:r>
             <w:r>
               <w:rPr>
@@ -2395,7 +2457,7 @@
               <w:rPr>
                 <w:noProof/>
               </w:rPr>
-              <w:t>20</w:t>
+              <w:t>21</w:t>
             </w:r>
             <w:r>
               <w:rPr>
@@ -2415,7 +2477,7 @@
               <w:noProof/>
             </w:rPr>
           </w:pPr>
-          <w:hyperlink w:anchor="_Toc243560586" w:history="1">
+          <w:hyperlink w:anchor="_Toc243565020" w:history="1">
             <w:r>
               <w:rPr>
                 <w:rStyle w:val="Collegamentoipertestuale"/>
@@ -2439,7 +2501,7 @@
               <w:rPr>
                 <w:noProof/>
               </w:rPr>
-              <w:instrText xml:space="preserve"> PAGEREF _Toc243560586 \h </w:instrText>
+              <w:instrText xml:space="preserve"> PAGEREF _Toc243565020 \h </w:instrText>
             </w:r>
             <w:r>
               <w:rPr>
@@ -2456,7 +2518,7 @@
               <w:rPr>
                 <w:noProof/>
               </w:rPr>
-              <w:t>21</w:t>
+              <w:t>22</w:t>
             </w:r>
             <w:r>
               <w:rPr>
@@ -2476,7 +2538,7 @@
               <w:noProof/>
             </w:rPr>
           </w:pPr>
-          <w:hyperlink w:anchor="_Toc243560587" w:history="1">
+          <w:hyperlink w:anchor="_Toc243565021" w:history="1">
             <w:r>
               <w:rPr>
                 <w:rStyle w:val="Collegamentoipertestuale"/>
@@ -2500,7 +2562,7 @@
               <w:rPr>
                 <w:noProof/>
               </w:rPr>
-              <w:instrText xml:space="preserve"> PAGEREF _Toc243560587 \h </w:instrText>
+              <w:instrText xml:space="preserve"> PAGEREF _Toc243565021 \h </w:instrText>
             </w:r>
             <w:r>
               <w:rPr>
@@ -2517,7 +2579,7 @@
               <w:rPr>
                 <w:noProof/>
               </w:rPr>
-              <w:t>22</w:t>
+              <w:t>23</w:t>
             </w:r>
             <w:r>
               <w:rPr>
@@ -2537,7 +2599,7 @@
               <w:noProof/>
             </w:rPr>
           </w:pPr>
-          <w:hyperlink w:anchor="_Toc243560588" w:history="1">
+          <w:hyperlink w:anchor="_Toc243565022" w:history="1">
             <w:r>
               <w:rPr>
                 <w:rStyle w:val="Collegamentoipertestuale"/>
@@ -2561,7 +2623,7 @@
               <w:rPr>
                 <w:noProof/>
               </w:rPr>
-              <w:instrText xml:space="preserve"> PAGEREF _Toc243560588 \h </w:instrText>
+              <w:instrText xml:space="preserve"> PAGEREF _Toc243565022 \h </w:instrText>
             </w:r>
             <w:r>
               <w:rPr>
@@ -2578,7 +2640,7 @@
               <w:rPr>
                 <w:noProof/>
               </w:rPr>
-              <w:t>22</w:t>
+              <w:t>23</w:t>
             </w:r>
             <w:r>
               <w:rPr>
@@ -2598,7 +2660,7 @@
               <w:noProof/>
             </w:rPr>
           </w:pPr>
-          <w:hyperlink w:anchor="_Toc243560589" w:history="1">
+          <w:hyperlink w:anchor="_Toc243565023" w:history="1">
             <w:r>
               <w:rPr>
                 <w:rStyle w:val="Collegamentoipertestuale"/>
@@ -2622,7 +2684,7 @@
               <w:rPr>
                 <w:noProof/>
               </w:rPr>
-              <w:instrText xml:space="preserve"> PAGEREF _Toc243560589 \h </w:instrText>
+              <w:instrText xml:space="preserve"> PAGEREF _Toc243565023 \h </w:instrText>
             </w:r>
             <w:r>
               <w:rPr>
@@ -2639,7 +2701,7 @@
               <w:rPr>
                 <w:noProof/>
               </w:rPr>
-              <w:t>22</w:t>
+              <w:t>23</w:t>
             </w:r>
             <w:r>
               <w:rPr>
@@ -2659,7 +2721,7 @@
               <w:noProof/>
             </w:rPr>
           </w:pPr>
-          <w:hyperlink w:anchor="_Toc243560590" w:history="1">
+          <w:hyperlink w:anchor="_Toc243565024" w:history="1">
             <w:r>
               <w:rPr>
                 <w:rStyle w:val="Collegamentoipertestuale"/>
@@ -2683,7 +2745,7 @@
               <w:rPr>
                 <w:noProof/>
               </w:rPr>
-              <w:instrText xml:space="preserve"> PAGEREF _Toc243560590 \h </w:instrText>
+              <w:instrText xml:space="preserve"> PAGEREF _Toc243565024 \h </w:instrText>
             </w:r>
             <w:r>
               <w:rPr>
@@ -2700,7 +2762,7 @@
               <w:rPr>
                 <w:noProof/>
               </w:rPr>
-              <w:t>22</w:t>
+              <w:t>23</w:t>
             </w:r>
             <w:r>
               <w:rPr>
@@ -2720,7 +2782,7 @@
               <w:noProof/>
             </w:rPr>
           </w:pPr>
-          <w:hyperlink w:anchor="_Toc243560591" w:history="1">
+          <w:hyperlink w:anchor="_Toc243565025" w:history="1">
             <w:r>
               <w:rPr>
                 <w:rStyle w:val="Collegamentoipertestuale"/>
@@ -2744,7 +2806,7 @@
               <w:rPr>
                 <w:noProof/>
               </w:rPr>
-              <w:instrText xml:space="preserve"> PAGEREF _Toc243560591 \h </w:instrText>
+              <w:instrText xml:space="preserve"> PAGEREF _Toc243565025 \h </w:instrText>
             </w:r>
             <w:r>
               <w:rPr>
@@ -2781,7 +2843,7 @@
               <w:noProof/>
             </w:rPr>
           </w:pPr>
-          <w:hyperlink w:anchor="_Toc243560592" w:history="1">
+          <w:hyperlink w:anchor="_Toc243565026" w:history="1">
             <w:r>
               <w:rPr>
                 <w:rStyle w:val="Collegamentoipertestuale"/>
@@ -2805,7 +2867,7 @@
               <w:rPr>
                 <w:noProof/>
               </w:rPr>
-              <w:instrText xml:space="preserve"> PAGEREF _Toc243560592 \h </w:instrText>
+              <w:instrText xml:space="preserve"> PAGEREF _Toc243565026 \h </w:instrText>
             </w:r>
             <w:r>
               <w:rPr>
@@ -2822,7 +2884,7 @@
               <w:rPr>
                 <w:noProof/>
               </w:rPr>
-              <w:t>23</w:t>
+              <w:t>24</w:t>
             </w:r>
             <w:r>
               <w:rPr>
@@ -2842,7 +2904,7 @@
               <w:noProof/>
             </w:rPr>
           </w:pPr>
-          <w:hyperlink w:anchor="_Toc243560593" w:history="1">
+          <w:hyperlink w:anchor="_Toc243565027" w:history="1">
             <w:r>
               <w:rPr>
                 <w:rStyle w:val="Collegamentoipertestuale"/>
@@ -2866,7 +2928,7 @@
               <w:rPr>
                 <w:noProof/>
               </w:rPr>
-              <w:instrText xml:space="preserve"> PAGEREF _Toc243560593 \h </w:instrText>
+              <w:instrText xml:space="preserve"> PAGEREF _Toc243565027 \h </w:instrText>
             </w:r>
             <w:r>
               <w:rPr>
@@ -2883,7 +2945,7 @@
               <w:rPr>
                 <w:noProof/>
               </w:rPr>
-              <w:t>23</w:t>
+              <w:t>24</w:t>
             </w:r>
             <w:r>
               <w:rPr>
@@ -2909,8 +2971,9 @@
       <w:pPr>
         <w:pStyle w:val="Titolo1"/>
       </w:pPr>
-      <w:bookmarkStart w:id="0" w:name="_Toc243560549"/>
-      <w:r>
+      <w:bookmarkStart w:id="0" w:name="_Toc243564982"/>
+      <w:r>
+        <w:lastRenderedPageBreak/>
         <w:t>1. In breve</w:t>
       </w:r>
       <w:bookmarkEnd w:id="0"/>
@@ -3200,7 +3263,7 @@
       <w:pPr>
         <w:pStyle w:val="Titolo1"/>
       </w:pPr>
-      <w:bookmarkStart w:id="1" w:name="_Toc243560550"/>
+      <w:bookmarkStart w:id="1" w:name="_Toc243564983"/>
       <w:r>
         <w:t>2. Nuovo marchio</w:t>
       </w:r>
@@ -3210,7 +3273,7 @@
       <w:pPr>
         <w:pStyle w:val="Titolo2"/>
       </w:pPr>
-      <w:bookmarkStart w:id="2" w:name="_Toc243560551"/>
+      <w:bookmarkStart w:id="2" w:name="_Toc243564984"/>
       <w:r>
         <w:t>2.1 Nomi e identificativi</w:t>
       </w:r>
@@ -3756,8 +3819,9 @@
       <w:pPr>
         <w:pStyle w:val="Titolo2"/>
       </w:pPr>
-      <w:bookmarkStart w:id="3" w:name="_Toc243560552"/>
-      <w:r>
+      <w:bookmarkStart w:id="3" w:name="_Toc243564985"/>
+      <w:r>
+        <w:lastRenderedPageBreak/>
         <w:t>2.2 Colori</w:t>
       </w:r>
       <w:bookmarkEnd w:id="3"/>
@@ -4151,7 +4215,7 @@
       <w:pPr>
         <w:pStyle w:val="Titolo2"/>
       </w:pPr>
-      <w:bookmarkStart w:id="4" w:name="_Toc243560553"/>
+      <w:bookmarkStart w:id="4" w:name="_Toc243564986"/>
       <w:r>
         <w:t>2.3 Icona in uso: 24 «Foglio senza fondo» (serie 6, 22 ottobre)</w:t>
       </w:r>
@@ -4185,7 +4249,7 @@
           <w:noProof/>
         </w:rPr>
         <w:drawing>
-          <wp:inline distT="0" distB="0" distL="0" distR="0" wp14:anchorId="5F1E0A90" wp14:editId="1E881C98">
+          <wp:inline distT="0" distB="0" distL="0" distR="0" wp14:anchorId="7F326358" wp14:editId="4B1A2826">
             <wp:extent cx="3429000" cy="4000500"/>
             <wp:effectExtent l="0" t="0" r="0" b="0"/>
             <wp:docPr id="2" name="Immagine 2"/>
@@ -4244,7 +4308,7 @@
       <w:pPr>
         <w:pStyle w:val="Titolo2"/>
       </w:pPr>
-      <w:bookmarkStart w:id="5" w:name="_Toc243560554"/>
+      <w:bookmarkStart w:id="5" w:name="_Toc243564987"/>
       <w:r>
         <w:t>2.4 Serie 4: la 17 «Foglio oro», in uso fino al 21 ottobre</w:t>
       </w:r>
@@ -4277,8 +4341,9 @@
         <w:rPr>
           <w:noProof/>
         </w:rPr>
+        <w:lastRenderedPageBreak/>
         <w:drawing>
-          <wp:inline distT="0" distB="0" distL="0" distR="0" wp14:anchorId="66BDA45F" wp14:editId="1457B059">
+          <wp:inline distT="0" distB="0" distL="0" distR="0" wp14:anchorId="45830A0E" wp14:editId="4F25832B">
             <wp:extent cx="5334000" cy="5895975"/>
             <wp:effectExtent l="0" t="0" r="0" b="0"/>
             <wp:docPr id="3" name="Immagine 3"/>
@@ -4691,7 +4756,7 @@
       <w:pPr>
         <w:pStyle w:val="Titolo2"/>
       </w:pPr>
-      <w:bookmarkStart w:id="6" w:name="_Toc243560555"/>
+      <w:bookmarkStart w:id="6" w:name="_Toc243564988"/>
       <w:r>
         <w:t>2.5 Serie 5: la 17 con più bianco, la 19 in uso il 21 ottobre</w:t>
       </w:r>
@@ -4712,7 +4777,11 @@
         <w:t>Scelta la 19 «Foglio bianco»</w:t>
       </w:r>
       <w:r>
-        <w:t xml:space="preserve"> (21 ottobre), applicata su tutte le piattaforme: icone di Windows, macOS, Linux e Android, favicon, logo, schermate di avvio e immagini dell'installer.</w:t>
+        <w:t xml:space="preserve"> (21 ottobre), </w:t>
+      </w:r>
+      <w:r>
+        <w:lastRenderedPageBreak/>
+        <w:t>applicata su tutte le piattaforme: icone di Windows, macOS, Linux e Android, favicon, logo, schermate di avvio e immagini dell'installer.</w:t>
       </w:r>
     </w:p>
     <w:p>
@@ -4725,7 +4794,7 @@
           <w:noProof/>
         </w:rPr>
         <w:drawing>
-          <wp:inline distT="0" distB="0" distL="0" distR="0" wp14:anchorId="03150606" wp14:editId="5894D6CA">
+          <wp:inline distT="0" distB="0" distL="0" distR="0" wp14:anchorId="6D25D86B" wp14:editId="5FEC6BDE">
             <wp:extent cx="5715000" cy="3295650"/>
             <wp:effectExtent l="0" t="0" r="0" b="0"/>
             <wp:docPr id="4" name="Immagine 4"/>
@@ -5272,7 +5341,7 @@
       <w:pPr>
         <w:pStyle w:val="Titolo2"/>
       </w:pPr>
-      <w:bookmarkStart w:id="7" w:name="_Toc243560556"/>
+      <w:bookmarkStart w:id="7" w:name="_Toc243564989"/>
       <w:r>
         <w:t>2.6 Serie 3, non scelta (la 11 è diventata la serie 4)</w:t>
       </w:r>
@@ -5295,8 +5364,9 @@
         <w:rPr>
           <w:noProof/>
         </w:rPr>
+        <w:lastRenderedPageBreak/>
         <w:drawing>
-          <wp:inline distT="0" distB="0" distL="0" distR="0" wp14:anchorId="6100EF94" wp14:editId="7BF3FCB2">
+          <wp:inline distT="0" distB="0" distL="0" distR="0" wp14:anchorId="0BF30C2D" wp14:editId="0626DCBD">
             <wp:extent cx="5905500" cy="4133850"/>
             <wp:effectExtent l="0" t="0" r="0" b="0"/>
             <wp:docPr id="5" name="Immagine 5"/>
@@ -5982,7 +6052,7 @@
       <w:pPr>
         <w:pStyle w:val="Titolo2"/>
       </w:pPr>
-      <w:bookmarkStart w:id="8" w:name="_Toc243560557"/>
+      <w:bookmarkStart w:id="8" w:name="_Toc243564990"/>
       <w:r>
         <w:t>2.7 Serie 2, non scelta</w:t>
       </w:r>
@@ -6005,8 +6075,9 @@
         <w:rPr>
           <w:noProof/>
         </w:rPr>
+        <w:lastRenderedPageBreak/>
         <w:drawing>
-          <wp:inline distT="0" distB="0" distL="0" distR="0" wp14:anchorId="5A322323" wp14:editId="507AD3E6">
+          <wp:inline distT="0" distB="0" distL="0" distR="0" wp14:anchorId="1BEEEF97" wp14:editId="386A3EC9">
             <wp:extent cx="5905500" cy="4133850"/>
             <wp:effectExtent l="0" t="0" r="0" b="0"/>
             <wp:docPr id="6" name="Immagine 6"/>
@@ -6726,7 +6797,7 @@
       <w:pPr>
         <w:pStyle w:val="Titolo2"/>
       </w:pPr>
-      <w:bookmarkStart w:id="9" w:name="_Toc243560558"/>
+      <w:bookmarkStart w:id="9" w:name="_Toc243564991"/>
       <w:r>
         <w:t>2.8 Serie 1, scartata</w:t>
       </w:r>
@@ -6749,8 +6820,9 @@
         <w:rPr>
           <w:noProof/>
         </w:rPr>
+        <w:lastRenderedPageBreak/>
         <w:drawing>
-          <wp:inline distT="0" distB="0" distL="0" distR="0" wp14:anchorId="132004C3" wp14:editId="4E635706">
+          <wp:inline distT="0" distB="0" distL="0" distR="0" wp14:anchorId="5EF77112" wp14:editId="55B9A764">
             <wp:extent cx="4000500" cy="2800350"/>
             <wp:effectExtent l="0" t="0" r="0" b="0"/>
             <wp:docPr id="7" name="Immagine 7"/>
@@ -6809,7 +6881,7 @@
       <w:pPr>
         <w:pStyle w:val="Titolo2"/>
       </w:pPr>
-      <w:bookmarkStart w:id="10" w:name="_Toc243560559"/>
+      <w:bookmarkStart w:id="10" w:name="_Toc243564992"/>
       <w:r>
         <w:t>2.9 Verifica dei marchi registrati</w:t>
       </w:r>
@@ -7061,7 +7133,7 @@
       <w:pPr>
         <w:pStyle w:val="Titolo1"/>
       </w:pPr>
-      <w:bookmarkStart w:id="11" w:name="_Toc243560560"/>
+      <w:bookmarkStart w:id="11" w:name="_Toc243564993"/>
       <w:r>
         <w:t>3. Temi colore</w:t>
       </w:r>
@@ -7094,8 +7166,9 @@
         <w:rPr>
           <w:noProof/>
         </w:rPr>
+        <w:lastRenderedPageBreak/>
         <w:drawing>
-          <wp:inline distT="0" distB="0" distL="0" distR="0" wp14:anchorId="540E6522" wp14:editId="474AAF07">
+          <wp:inline distT="0" distB="0" distL="0" distR="0" wp14:anchorId="4E5777BA" wp14:editId="0C98F097">
             <wp:extent cx="4572000" cy="3429000"/>
             <wp:effectExtent l="0" t="0" r="0" b="0"/>
             <wp:docPr id="8" name="Immagine 8"/>
@@ -7805,7 +7878,7 @@
       <w:pPr>
         <w:pStyle w:val="Titolo1"/>
       </w:pPr>
-      <w:bookmarkStart w:id="12" w:name="_Toc243560561"/>
+      <w:bookmarkStart w:id="12" w:name="_Toc243564994"/>
       <w:r>
         <w:t>4. Correzione: avvisi «come JavaScript»</w:t>
       </w:r>
@@ -7815,7 +7888,7 @@
       <w:pPr>
         <w:pStyle w:val="Titolo2"/>
       </w:pPr>
-      <w:bookmarkStart w:id="13" w:name="_Toc243560562"/>
+      <w:bookmarkStart w:id="13" w:name="_Toc243564995"/>
       <w:r>
         <w:t>4.1 Il problema</w:t>
       </w:r>
@@ -8218,7 +8291,7 @@
       <w:pPr>
         <w:pStyle w:val="Titolo2"/>
       </w:pPr>
-      <w:bookmarkStart w:id="14" w:name="_Toc243560563"/>
+      <w:bookmarkStart w:id="14" w:name="_Toc243564996"/>
       <w:r>
         <w:t>4.2 La soluzione</w:t>
       </w:r>
@@ -8351,7 +8424,7 @@
           <w:noProof/>
         </w:rPr>
         <w:drawing>
-          <wp:inline distT="0" distB="0" distL="0" distR="0" wp14:anchorId="17298C0B" wp14:editId="2FEE3613">
+          <wp:inline distT="0" distB="0" distL="0" distR="0" wp14:anchorId="62529869" wp14:editId="15ADDFE5">
             <wp:extent cx="4572000" cy="3429000"/>
             <wp:effectExtent l="0" t="0" r="0" b="0"/>
             <wp:docPr id="9" name="Immagine 9"/>
@@ -8410,7 +8483,7 @@
       <w:pPr>
         <w:pStyle w:val="Titolo2"/>
       </w:pPr>
-      <w:bookmarkStart w:id="15" w:name="_Toc243560564"/>
+      <w:bookmarkStart w:id="15" w:name="_Toc243564997"/>
       <w:r>
         <w:t>4.3 Verifiche</w:t>
       </w:r>
@@ -8457,7 +8530,7 @@
       <w:pPr>
         <w:pStyle w:val="Titolo2"/>
       </w:pPr>
-      <w:bookmarkStart w:id="16" w:name="_Toc243560565"/>
+      <w:bookmarkStart w:id="16" w:name="_Toc243564998"/>
       <w:r>
         <w:t>4.4 Android: menu Tema e notifiche (versione 1.0.1)</w:t>
       </w:r>
@@ -8725,6 +8798,7 @@
           </w:tcPr>
           <w:p>
             <w:r>
+              <w:lastRenderedPageBreak/>
               <w:t>Non si leggono tutte le notifiche</w:t>
             </w:r>
           </w:p>
@@ -8792,7 +8866,7 @@
       <w:pPr>
         <w:pStyle w:val="Titolo2"/>
       </w:pPr>
-      <w:bookmarkStart w:id="17" w:name="_Toc243560566"/>
+      <w:bookmarkStart w:id="17" w:name="_Toc243564999"/>
       <w:r>
         <w:t>4.5 App più leggera: traduzione tolta</w:t>
       </w:r>
@@ -9225,7 +9299,7 @@
       <w:pPr>
         <w:pStyle w:val="Titolo2"/>
       </w:pPr>
-      <w:bookmarkStart w:id="18" w:name="_Toc243560567"/>
+      <w:bookmarkStart w:id="18" w:name="_Toc243565000"/>
       <w:r>
         <w:t>4.6 Schede in una nuova finestra</w:t>
       </w:r>
@@ -9343,7 +9417,7 @@
           <w:noProof/>
         </w:rPr>
         <w:drawing>
-          <wp:inline distT="0" distB="0" distL="0" distR="0" wp14:anchorId="609D3398" wp14:editId="09D12D02">
+          <wp:inline distT="0" distB="0" distL="0" distR="0" wp14:anchorId="4A730F4F" wp14:editId="3B1F2F9A">
             <wp:extent cx="5715000" cy="857250"/>
             <wp:effectExtent l="0" t="0" r="0" b="0"/>
             <wp:docPr id="10" name="Immagine 10"/>
@@ -9541,6 +9615,7 @@
           </w:tcPr>
           <w:p>
             <w:r>
+              <w:lastRenderedPageBreak/>
               <w:t>Linux</w:t>
             </w:r>
           </w:p>
@@ -9632,7 +9707,7 @@
       <w:pPr>
         <w:pStyle w:val="Titolo2"/>
       </w:pPr>
-      <w:bookmarkStart w:id="19" w:name="_Toc243560568"/>
+      <w:bookmarkStart w:id="19" w:name="_Toc243565001"/>
       <w:r>
         <w:t>4.7 Riunire le finestre</w:t>
       </w:r>
@@ -9734,7 +9809,7 @@
       <w:pPr>
         <w:pStyle w:val="Titolo2"/>
       </w:pPr>
-      <w:bookmarkStart w:id="20" w:name="_Toc243560569"/>
+      <w:bookmarkStart w:id="20" w:name="_Toc243565002"/>
       <w:r>
         <w:t>4.8 Correzioni di «Modifica testo»</w:t>
       </w:r>
@@ -9998,8 +10073,9 @@
         <w:rPr>
           <w:noProof/>
         </w:rPr>
+        <w:lastRenderedPageBreak/>
         <w:drawing>
-          <wp:inline distT="0" distB="0" distL="0" distR="0" wp14:anchorId="38B85096" wp14:editId="11F86070">
+          <wp:inline distT="0" distB="0" distL="0" distR="0" wp14:anchorId="367201FC" wp14:editId="4EC2EE9F">
             <wp:extent cx="3286125" cy="2286000"/>
             <wp:effectExtent l="0" t="0" r="0" b="0"/>
             <wp:docPr id="11" name="Immagine 11"/>
@@ -10064,7 +10140,7 @@
           <w:noProof/>
         </w:rPr>
         <w:drawing>
-          <wp:inline distT="0" distB="0" distL="0" distR="0" wp14:anchorId="00986948" wp14:editId="720B924B">
+          <wp:inline distT="0" distB="0" distL="0" distR="0" wp14:anchorId="27492DF1" wp14:editId="3D744AC5">
             <wp:extent cx="3286125" cy="2286000"/>
             <wp:effectExtent l="0" t="0" r="0" b="0"/>
             <wp:docPr id="12" name="Immagine 12"/>
@@ -10131,7 +10207,7 @@
       <w:pPr>
         <w:pStyle w:val="Titolo2"/>
       </w:pPr>
-      <w:bookmarkStart w:id="21" w:name="_Toc243560570"/>
+      <w:bookmarkStart w:id="21" w:name="_Toc243565003"/>
       <w:r>
         <w:t>4.9 Web app per iPhone</w:t>
       </w:r>
@@ -10549,6 +10625,7 @@
           <w:bCs/>
           <w:color w:val="3B3632"/>
         </w:rPr>
+        <w:lastRenderedPageBreak/>
         <w:t>Regola (22 ottobre):</w:t>
       </w:r>
       <w:r>
@@ -10568,13 +10645,492 @@
     </w:p>
     <w:p>
       <w:pPr>
+        <w:pStyle w:val="Titolo2"/>
+      </w:pPr>
+      <w:bookmarkStart w:id="22" w:name="_Toc243565004"/>
+      <w:r>
+        <w:t>4.10 Aggiornamenti su Cloudflare (repository privato)</w:t>
+      </w:r>
+      <w:bookmarkEnd w:id="22"/>
+    </w:p>
+    <w:p>
+      <w:pPr>
+        <w:spacing w:after="120"/>
+      </w:pPr>
+      <w:r>
+        <w:t xml:space="preserve">L'autore vuole rendere privato il repository. Con il repository privato le GitHub Releases non si scaricano più senza accesso: le app non vedrebbero le nuove versioni. Installer, file di versione e web app passano quindi su </w:t>
+      </w:r>
+      <w:r>
+        <w:rPr>
+          <w:b/>
+          <w:bCs/>
+        </w:rPr>
+        <w:t>Cloudflare</w:t>
+      </w:r>
+      <w:r>
+        <w:t>, gratuito (scelta ⚖</w:t>
+      </w:r>
+      <w:r>
+        <w:t>️</w:t>
+      </w:r>
+      <w:r>
+        <w:t xml:space="preserve">; </w:t>
+      </w:r>
+      <w:r>
+        <w:t>💎</w:t>
+      </w:r>
+      <w:r>
+        <w:t xml:space="preserve"> dominio proprio possibile, </w:t>
+      </w:r>
+      <w:r>
+        <w:t>🆓</w:t>
+      </w:r>
+      <w:r>
+        <w:t xml:space="preserve"> secondo repository pubblico solo per i download).</w:t>
+      </w:r>
+    </w:p>
+    <w:tbl>
+      <w:tblPr>
+        <w:tblW w:w="9638" w:type="dxa"/>
+        <w:tblBorders>
+          <w:top w:val="single" w:sz="4" w:space="0" w:color="auto"/>
+          <w:left w:val="single" w:sz="4" w:space="0" w:color="auto"/>
+          <w:bottom w:val="single" w:sz="4" w:space="0" w:color="auto"/>
+          <w:right w:val="single" w:sz="4" w:space="0" w:color="auto"/>
+          <w:insideH w:val="single" w:sz="4" w:space="0" w:color="auto"/>
+          <w:insideV w:val="single" w:sz="4" w:space="0" w:color="auto"/>
+        </w:tblBorders>
+        <w:tblLook w:val="04A0" w:firstRow="1" w:lastRow="0" w:firstColumn="1" w:lastColumn="0" w:noHBand="0" w:noVBand="1"/>
+      </w:tblPr>
+      <w:tblGrid>
+        <w:gridCol w:w="2891"/>
+        <w:gridCol w:w="6747"/>
+      </w:tblGrid>
+      <w:tr>
+        <w:trPr>
+          <w:tblHeader/>
+        </w:trPr>
+        <w:tc>
+          <w:tcPr>
+            <w:tcW w:w="2891" w:type="dxa"/>
+            <w:tcBorders>
+              <w:top w:val="single" w:sz="4" w:space="0" w:color="D4CEC7"/>
+              <w:left w:val="single" w:sz="4" w:space="0" w:color="D4CEC7"/>
+              <w:bottom w:val="single" w:sz="4" w:space="0" w:color="D4CEC7"/>
+              <w:right w:val="single" w:sz="4" w:space="0" w:color="D4CEC7"/>
+            </w:tcBorders>
+            <w:shd w:val="clear" w:color="auto" w:fill="B3122B"/>
+            <w:tcMar>
+              <w:top w:w="60" w:type="dxa"/>
+              <w:left w:w="100" w:type="dxa"/>
+              <w:bottom w:w="60" w:type="dxa"/>
+              <w:right w:w="100" w:type="dxa"/>
+            </w:tcMar>
+          </w:tcPr>
+          <w:p>
+            <w:r>
+              <w:rPr>
+                <w:b/>
+                <w:bCs/>
+                <w:color w:val="FFFFFF"/>
+              </w:rPr>
+              <w:t>Indirizzo</w:t>
+            </w:r>
+          </w:p>
+        </w:tc>
+        <w:tc>
+          <w:tcPr>
+            <w:tcW w:w="6747" w:type="dxa"/>
+            <w:tcBorders>
+              <w:top w:val="single" w:sz="4" w:space="0" w:color="D4CEC7"/>
+              <w:left w:val="single" w:sz="4" w:space="0" w:color="D4CEC7"/>
+              <w:bottom w:val="single" w:sz="4" w:space="0" w:color="D4CEC7"/>
+              <w:right w:val="single" w:sz="4" w:space="0" w:color="D4CEC7"/>
+            </w:tcBorders>
+            <w:shd w:val="clear" w:color="auto" w:fill="B3122B"/>
+            <w:tcMar>
+              <w:top w:w="60" w:type="dxa"/>
+              <w:left w:w="100" w:type="dxa"/>
+              <w:bottom w:w="60" w:type="dxa"/>
+              <w:right w:w="100" w:type="dxa"/>
+            </w:tcMar>
+          </w:tcPr>
+          <w:p>
+            <w:r>
+              <w:rPr>
+                <w:b/>
+                <w:bCs/>
+                <w:color w:val="FFFFFF"/>
+              </w:rPr>
+              <w:t>Contenuto</w:t>
+            </w:r>
+          </w:p>
+        </w:tc>
+      </w:tr>
+      <w:tr>
+        <w:tc>
+          <w:tcPr>
+            <w:tcW w:w="2891" w:type="dxa"/>
+            <w:tcBorders>
+              <w:top w:val="single" w:sz="4" w:space="0" w:color="D4CEC7"/>
+              <w:left w:val="single" w:sz="4" w:space="0" w:color="D4CEC7"/>
+              <w:bottom w:val="single" w:sz="4" w:space="0" w:color="D4CEC7"/>
+              <w:right w:val="single" w:sz="4" w:space="0" w:color="D4CEC7"/>
+            </w:tcBorders>
+            <w:tcMar>
+              <w:top w:w="60" w:type="dxa"/>
+              <w:left w:w="100" w:type="dxa"/>
+              <w:bottom w:w="60" w:type="dxa"/>
+              <w:right w:w="100" w:type="dxa"/>
+            </w:tcMar>
+          </w:tcPr>
+          <w:p>
+            <w:r>
+              <w:t>https://pdfz.pages.dev/</w:t>
+            </w:r>
+          </w:p>
+        </w:tc>
+        <w:tc>
+          <w:tcPr>
+            <w:tcW w:w="6747" w:type="dxa"/>
+            <w:tcBorders>
+              <w:top w:val="single" w:sz="4" w:space="0" w:color="D4CEC7"/>
+              <w:left w:val="single" w:sz="4" w:space="0" w:color="D4CEC7"/>
+              <w:bottom w:val="single" w:sz="4" w:space="0" w:color="D4CEC7"/>
+              <w:right w:val="single" w:sz="4" w:space="0" w:color="D4CEC7"/>
+            </w:tcBorders>
+            <w:tcMar>
+              <w:top w:w="60" w:type="dxa"/>
+              <w:left w:w="100" w:type="dxa"/>
+              <w:bottom w:w="60" w:type="dxa"/>
+              <w:right w:w="100" w:type="dxa"/>
+            </w:tcMar>
+          </w:tcPr>
+          <w:p>
+            <w:r>
+              <w:t>pagina degli aggiornamenti: ultima versione, download per ogni sistema, novità, codice sorgente (AGPL)</w:t>
+            </w:r>
+          </w:p>
+        </w:tc>
+      </w:tr>
+      <w:tr>
+        <w:tc>
+          <w:tcPr>
+            <w:tcW w:w="2891" w:type="dxa"/>
+            <w:tcBorders>
+              <w:top w:val="single" w:sz="4" w:space="0" w:color="D4CEC7"/>
+              <w:left w:val="single" w:sz="4" w:space="0" w:color="D4CEC7"/>
+              <w:bottom w:val="single" w:sz="4" w:space="0" w:color="D4CEC7"/>
+              <w:right w:val="single" w:sz="4" w:space="0" w:color="D4CEC7"/>
+            </w:tcBorders>
+            <w:tcMar>
+              <w:top w:w="60" w:type="dxa"/>
+              <w:left w:w="100" w:type="dxa"/>
+              <w:bottom w:w="60" w:type="dxa"/>
+              <w:right w:w="100" w:type="dxa"/>
+            </w:tcMar>
+          </w:tcPr>
+          <w:p>
+            <w:r>
+              <w:t>/versione-&lt;sistema&gt;.json</w:t>
+            </w:r>
+          </w:p>
+        </w:tc>
+        <w:tc>
+          <w:tcPr>
+            <w:tcW w:w="6747" w:type="dxa"/>
+            <w:tcBorders>
+              <w:top w:val="single" w:sz="4" w:space="0" w:color="D4CEC7"/>
+              <w:left w:val="single" w:sz="4" w:space="0" w:color="D4CEC7"/>
+              <w:bottom w:val="single" w:sz="4" w:space="0" w:color="D4CEC7"/>
+              <w:right w:val="single" w:sz="4" w:space="0" w:color="D4CEC7"/>
+            </w:tcBorders>
+            <w:tcMar>
+              <w:top w:w="60" w:type="dxa"/>
+              <w:left w:w="100" w:type="dxa"/>
+              <w:bottom w:w="60" w:type="dxa"/>
+              <w:right w:w="100" w:type="dxa"/>
+            </w:tcMar>
+          </w:tcPr>
+          <w:p>
+            <w:r>
+              <w:t>avviso di nuova versione letto dalle app (UPDATE_BASE_URL)</w:t>
+            </w:r>
+          </w:p>
+        </w:tc>
+      </w:tr>
+      <w:tr>
+        <w:tc>
+          <w:tcPr>
+            <w:tcW w:w="2891" w:type="dxa"/>
+            <w:tcBorders>
+              <w:top w:val="single" w:sz="4" w:space="0" w:color="D4CEC7"/>
+              <w:left w:val="single" w:sz="4" w:space="0" w:color="D4CEC7"/>
+              <w:bottom w:val="single" w:sz="4" w:space="0" w:color="D4CEC7"/>
+              <w:right w:val="single" w:sz="4" w:space="0" w:color="D4CEC7"/>
+            </w:tcBorders>
+            <w:tcMar>
+              <w:top w:w="60" w:type="dxa"/>
+              <w:left w:w="100" w:type="dxa"/>
+              <w:bottom w:w="60" w:type="dxa"/>
+              <w:right w:w="100" w:type="dxa"/>
+            </w:tcMar>
+          </w:tcPr>
+          <w:p>
+            <w:r>
+              <w:t>/download/vX.Y.Z/&lt;file&gt;</w:t>
+            </w:r>
+          </w:p>
+        </w:tc>
+        <w:tc>
+          <w:tcPr>
+            <w:tcW w:w="6747" w:type="dxa"/>
+            <w:tcBorders>
+              <w:top w:val="single" w:sz="4" w:space="0" w:color="D4CEC7"/>
+              <w:left w:val="single" w:sz="4" w:space="0" w:color="D4CEC7"/>
+              <w:bottom w:val="single" w:sz="4" w:space="0" w:color="D4CEC7"/>
+              <w:right w:val="single" w:sz="4" w:space="0" w:color="D4CEC7"/>
+            </w:tcBorders>
+            <w:tcMar>
+              <w:top w:w="60" w:type="dxa"/>
+              <w:left w:w="100" w:type="dxa"/>
+              <w:bottom w:w="60" w:type="dxa"/>
+              <w:right w:w="100" w:type="dxa"/>
+            </w:tcMar>
+          </w:tcPr>
+          <w:p>
+            <w:r>
+              <w:t>installer dall'archivio R2 (le Pages accettano file fino a 25 MB, gli installer arrivano a 175 MB), con ripresa dei download</w:t>
+            </w:r>
+          </w:p>
+        </w:tc>
+      </w:tr>
+      <w:tr>
+        <w:tc>
+          <w:tcPr>
+            <w:tcW w:w="2891" w:type="dxa"/>
+            <w:tcBorders>
+              <w:top w:val="single" w:sz="4" w:space="0" w:color="D4CEC7"/>
+              <w:left w:val="single" w:sz="4" w:space="0" w:color="D4CEC7"/>
+              <w:bottom w:val="single" w:sz="4" w:space="0" w:color="D4CEC7"/>
+              <w:right w:val="single" w:sz="4" w:space="0" w:color="D4CEC7"/>
+            </w:tcBorders>
+            <w:tcMar>
+              <w:top w:w="60" w:type="dxa"/>
+              <w:left w:w="100" w:type="dxa"/>
+              <w:bottom w:w="60" w:type="dxa"/>
+              <w:right w:w="100" w:type="dxa"/>
+            </w:tcMar>
+          </w:tcPr>
+          <w:p>
+            <w:r>
+              <w:t>/app/</w:t>
+            </w:r>
+          </w:p>
+        </w:tc>
+        <w:tc>
+          <w:tcPr>
+            <w:tcW w:w="6747" w:type="dxa"/>
+            <w:tcBorders>
+              <w:top w:val="single" w:sz="4" w:space="0" w:color="D4CEC7"/>
+              <w:left w:val="single" w:sz="4" w:space="0" w:color="D4CEC7"/>
+              <w:bottom w:val="single" w:sz="4" w:space="0" w:color="D4CEC7"/>
+              <w:right w:val="single" w:sz="4" w:space="0" w:color="D4CEC7"/>
+            </w:tcBorders>
+            <w:tcMar>
+              <w:top w:w="60" w:type="dxa"/>
+              <w:left w:w="100" w:type="dxa"/>
+              <w:bottom w:w="60" w:type="dxa"/>
+              <w:right w:w="100" w:type="dxa"/>
+            </w:tcMar>
+          </w:tcPr>
+          <w:p>
+            <w:r>
+              <w:t>web app per iPhone</w:t>
+            </w:r>
+          </w:p>
+        </w:tc>
+      </w:tr>
+    </w:tbl>
+    <w:p>
+      <w:pPr>
+        <w:spacing w:after="120"/>
+      </w:pPr>
+    </w:p>
+    <w:p>
+      <w:pPr>
+        <w:spacing w:after="120"/>
+      </w:pPr>
+      <w:r>
+        <w:t xml:space="preserve">Dopo ogni release il flusso </w:t>
+      </w:r>
+      <w:r>
+        <w:rPr>
+          <w:rFonts w:ascii="Consolas" w:eastAsia="Consolas" w:hAnsi="Consolas" w:cs="Consolas"/>
+          <w:sz w:val="19"/>
+          <w:szCs w:val="19"/>
+        </w:rPr>
+        <w:t>cloudflare.yml</w:t>
+      </w:r>
+      <w:r>
+        <w:t xml:space="preserve"> prende gli installer dalla GitHub Release, li carica nell'archivio R2 (tiene le ultime 5 versioni: circa 530 MB ciascuna, 10 GB gratuiti), compila la web app e pubblica il sito. Si accende con la variabile </w:t>
+      </w:r>
+      <w:r>
+        <w:rPr>
+          <w:rFonts w:ascii="Consolas" w:eastAsia="Consolas" w:hAnsi="Consolas" w:cs="Consolas"/>
+          <w:sz w:val="19"/>
+          <w:szCs w:val="19"/>
+        </w:rPr>
+        <w:t>CLOUDFLARE_PAGES</w:t>
+      </w:r>
+      <w:r>
+        <w:t>.</w:t>
+      </w:r>
+    </w:p>
+    <w:p>
+      <w:pPr>
+        <w:pBdr>
+          <w:left w:val="single" w:sz="18" w:space="6" w:color="C9A227"/>
+        </w:pBdr>
+        <w:shd w:val="clear" w:color="auto" w:fill="FBF3DA"/>
+        <w:spacing w:before="80" w:after="160"/>
+        <w:ind w:left="120" w:right="120"/>
+      </w:pPr>
+      <w:r>
+        <w:rPr>
+          <w:b/>
+          <w:bCs/>
+          <w:color w:val="3B3632"/>
+        </w:rPr>
+        <w:t>Ordine del passaggio</w:t>
+      </w:r>
+      <w:r>
+        <w:rPr>
+          <w:color w:val="3B3632"/>
+        </w:rPr>
+        <w:t xml:space="preserve">: 1) l'autore configura Cloudflare (account, archivio R2 </w:t>
+      </w:r>
+      <w:r>
+        <w:rPr>
+          <w:rFonts w:ascii="Consolas" w:eastAsia="Consolas" w:hAnsi="Consolas" w:cs="Consolas"/>
+          <w:color w:val="3B3632"/>
+          <w:sz w:val="19"/>
+          <w:szCs w:val="19"/>
+        </w:rPr>
+        <w:t>pdfz-installer</w:t>
+      </w:r>
+      <w:r>
+        <w:rPr>
+          <w:color w:val="3B3632"/>
+        </w:rPr>
+        <w:t xml:space="preserve">, token con i permessi Pages e R2) e GitHub (secrets </w:t>
+      </w:r>
+      <w:r>
+        <w:rPr>
+          <w:rFonts w:ascii="Consolas" w:eastAsia="Consolas" w:hAnsi="Consolas" w:cs="Consolas"/>
+          <w:color w:val="3B3632"/>
+          <w:sz w:val="19"/>
+          <w:szCs w:val="19"/>
+        </w:rPr>
+        <w:t>CLOUDFLARE_API_TOKEN</w:t>
+      </w:r>
+      <w:r>
+        <w:rPr>
+          <w:color w:val="3B3632"/>
+        </w:rPr>
+        <w:t xml:space="preserve">, </w:t>
+      </w:r>
+      <w:r>
+        <w:rPr>
+          <w:rFonts w:ascii="Consolas" w:eastAsia="Consolas" w:hAnsi="Consolas" w:cs="Consolas"/>
+          <w:color w:val="3B3632"/>
+          <w:sz w:val="19"/>
+          <w:szCs w:val="19"/>
+        </w:rPr>
+        <w:t>CLOUDFLARE_ACCOUNT_ID</w:t>
+      </w:r>
+      <w:r>
+        <w:rPr>
+          <w:color w:val="3B3632"/>
+        </w:rPr>
+        <w:t xml:space="preserve">; variabili </w:t>
+      </w:r>
+      <w:r>
+        <w:rPr>
+          <w:rFonts w:ascii="Consolas" w:eastAsia="Consolas" w:hAnsi="Consolas" w:cs="Consolas"/>
+          <w:color w:val="3B3632"/>
+          <w:sz w:val="19"/>
+          <w:szCs w:val="19"/>
+        </w:rPr>
+        <w:t>CLOUDFLARE_PAGES</w:t>
+      </w:r>
+      <w:r>
+        <w:rPr>
+          <w:color w:val="3B3632"/>
+        </w:rPr>
+        <w:t xml:space="preserve"> = true e </w:t>
+      </w:r>
+      <w:r>
+        <w:rPr>
+          <w:rFonts w:ascii="Consolas" w:eastAsia="Consolas" w:hAnsi="Consolas" w:cs="Consolas"/>
+          <w:color w:val="3B3632"/>
+          <w:sz w:val="19"/>
+          <w:szCs w:val="19"/>
+        </w:rPr>
+        <w:t>UPDATE_BASE_URL</w:t>
+      </w:r>
+      <w:r>
+        <w:rPr>
+          <w:color w:val="3B3632"/>
+        </w:rPr>
+        <w:t xml:space="preserve">); 2) prova del sito con la 1.3.0; 3) </w:t>
+      </w:r>
+      <w:r>
+        <w:rPr>
+          <w:b/>
+          <w:bCs/>
+          <w:color w:val="3B3632"/>
+        </w:rPr>
+        <w:t>versione ponte</w:t>
+      </w:r>
+      <w:r>
+        <w:rPr>
+          <w:color w:val="3B3632"/>
+        </w:rPr>
+        <w:t xml:space="preserve"> compilata con l'indirizzo Cloudflare, pubblicata anche su GitHub (ancora pubblico); 4) installata su tutti i dispositivi; 5) </w:t>
+      </w:r>
+      <w:r>
+        <w:rPr>
+          <w:b/>
+          <w:bCs/>
+          <w:color w:val="3B3632"/>
+        </w:rPr>
+        <w:t>solo allora</w:t>
+      </w:r>
+      <w:r>
+        <w:rPr>
+          <w:color w:val="3B3632"/>
+        </w:rPr>
+        <w:t xml:space="preserve"> repository privato. Un'app rimasta alla 1.3.0 o prima non vedrebbe più gli aggiornamenti.</w:t>
+      </w:r>
+    </w:p>
+    <w:p>
+      <w:pPr>
+        <w:spacing w:after="120"/>
+      </w:pPr>
+      <w:r>
+        <w:t>Prove del 22 ottobre sul PC: pagina generata con installer finti e servita in locale con la web app in /app/, file di versione con i link al sito, funzione dei download con un archivio R2 simulato (file intero, parte del file, richieste non ammesse rifiutate). La pubblicazione vera aspetta la configurazione dell'autore.</w:t>
+      </w:r>
+    </w:p>
+    <w:p>
+      <w:pPr>
         <w:pStyle w:val="Titolo1"/>
       </w:pPr>
-      <w:bookmarkStart w:id="22" w:name="_Toc243560571"/>
+      <w:bookmarkStart w:id="23" w:name="_Toc243565005"/>
       <w:r>
         <w:t>5. Decisioni</w:t>
       </w:r>
-      <w:bookmarkEnd w:id="22"/>
+      <w:bookmarkEnd w:id="23"/>
     </w:p>
     <w:p>
       <w:pPr>
@@ -10588,11 +11144,11 @@
       <w:pPr>
         <w:pStyle w:val="Titolo2"/>
       </w:pPr>
-      <w:bookmarkStart w:id="23" w:name="_Toc243560572"/>
+      <w:bookmarkStart w:id="24" w:name="_Toc243565006"/>
       <w:r>
         <w:t>5.1 Canale degli aggiornamenti</w:t>
       </w:r>
-      <w:bookmarkEnd w:id="23"/>
+      <w:bookmarkEnd w:id="24"/>
     </w:p>
     <w:p>
       <w:pPr>
@@ -10895,6 +11451,7 @@
                 <w:bCs/>
                 <w:color w:val="FFFFFF"/>
               </w:rPr>
+              <w:lastRenderedPageBreak/>
               <w:t>Strategia</w:t>
             </w:r>
           </w:p>
@@ -11095,11 +11652,11 @@
       <w:pPr>
         <w:pStyle w:val="Titolo2"/>
       </w:pPr>
-      <w:bookmarkStart w:id="24" w:name="_Toc243560573"/>
+      <w:bookmarkStart w:id="25" w:name="_Toc243565007"/>
       <w:r>
         <w:t>5.2 Storia del repository</w:t>
       </w:r>
-      <w:bookmarkEnd w:id="24"/>
+      <w:bookmarkEnd w:id="25"/>
     </w:p>
     <w:p>
       <w:pPr>
@@ -11602,11 +12159,11 @@
       <w:pPr>
         <w:pStyle w:val="Titolo2"/>
       </w:pPr>
-      <w:bookmarkStart w:id="25" w:name="_Toc243560574"/>
+      <w:bookmarkStart w:id="26" w:name="_Toc243565008"/>
       <w:r>
         <w:t>5.3 Identificativi del prodotto</w:t>
       </w:r>
-      <w:bookmarkEnd w:id="25"/>
+      <w:bookmarkEnd w:id="26"/>
     </w:p>
     <w:p>
       <w:pPr>
@@ -12102,11 +12659,12 @@
       <w:pPr>
         <w:pStyle w:val="Titolo2"/>
       </w:pPr>
-      <w:bookmarkStart w:id="26" w:name="_Toc243560575"/>
-      <w:r>
+      <w:bookmarkStart w:id="27" w:name="_Toc243565009"/>
+      <w:r>
+        <w:lastRenderedPageBreak/>
         <w:t>5.4 Avvisi e domande</w:t>
       </w:r>
-      <w:bookmarkEnd w:id="26"/>
+      <w:bookmarkEnd w:id="27"/>
     </w:p>
     <w:p>
       <w:pPr>
@@ -12609,11 +13167,11 @@
       <w:pPr>
         <w:pStyle w:val="Titolo2"/>
       </w:pPr>
-      <w:bookmarkStart w:id="27" w:name="_Toc243560576"/>
+      <w:bookmarkStart w:id="28" w:name="_Toc243565010"/>
       <w:r>
         <w:t>5.5 Traduzione offline</w:t>
       </w:r>
-      <w:bookmarkEnd w:id="27"/>
+      <w:bookmarkEnd w:id="28"/>
     </w:p>
     <w:p>
       <w:pPr>
@@ -13116,11 +13674,11 @@
       <w:pPr>
         <w:pStyle w:val="Titolo2"/>
       </w:pPr>
-      <w:bookmarkStart w:id="28" w:name="_Toc243560577"/>
+      <w:bookmarkStart w:id="29" w:name="_Toc243565011"/>
       <w:r>
         <w:t>5.6 Passaggio della scheda alla nuova finestra</w:t>
       </w:r>
-      <w:bookmarkEnd w:id="28"/>
+      <w:bookmarkEnd w:id="29"/>
     </w:p>
     <w:p>
       <w:pPr>
@@ -13638,11 +14196,11 @@
       <w:pPr>
         <w:pStyle w:val="Titolo2"/>
       </w:pPr>
-      <w:bookmarkStart w:id="29" w:name="_Toc243560578"/>
+      <w:bookmarkStart w:id="30" w:name="_Toc243565012"/>
       <w:r>
         <w:t>5.7 Come si cancella la riga in «Modifica testo»</w:t>
       </w:r>
-      <w:bookmarkEnd w:id="29"/>
+      <w:bookmarkEnd w:id="30"/>
     </w:p>
     <w:p>
       <w:pPr>
@@ -14145,21 +14703,21 @@
       <w:pPr>
         <w:pStyle w:val="Titolo1"/>
       </w:pPr>
-      <w:bookmarkStart w:id="30" w:name="_Toc243560579"/>
+      <w:bookmarkStart w:id="31" w:name="_Toc243565013"/>
       <w:r>
         <w:t>6. Come si lavora</w:t>
       </w:r>
-      <w:bookmarkEnd w:id="30"/>
+      <w:bookmarkEnd w:id="31"/>
     </w:p>
     <w:p>
       <w:pPr>
         <w:pStyle w:val="Titolo2"/>
       </w:pPr>
-      <w:bookmarkStart w:id="31" w:name="_Toc243560580"/>
+      <w:bookmarkStart w:id="32" w:name="_Toc243565014"/>
       <w:r>
         <w:t>6.1 Comandi</w:t>
       </w:r>
-      <w:bookmarkEnd w:id="31"/>
+      <w:bookmarkEnd w:id="32"/>
     </w:p>
     <w:p>
       <w:pPr>
@@ -14225,11 +14783,11 @@
       <w:pPr>
         <w:pStyle w:val="Titolo2"/>
       </w:pPr>
-      <w:bookmarkStart w:id="32" w:name="_Toc243560581"/>
+      <w:bookmarkStart w:id="33" w:name="_Toc243565015"/>
       <w:r>
         <w:t>6.2 Pubblicare una versione</w:t>
       </w:r>
-      <w:bookmarkEnd w:id="32"/>
+      <w:bookmarkEnd w:id="33"/>
     </w:p>
     <w:p>
       <w:pPr>
@@ -14346,6 +14904,7 @@
         <w:spacing w:after="60"/>
       </w:pPr>
       <w:r>
+        <w:lastRenderedPageBreak/>
         <w:t>La pipeline compila Windows, macOS, Linux e Android e pubblica la GitHub Release con installer e file di versione.</w:t>
       </w:r>
     </w:p>
@@ -14353,11 +14912,11 @@
       <w:pPr>
         <w:pStyle w:val="Titolo2"/>
       </w:pPr>
-      <w:bookmarkStart w:id="33" w:name="_Toc243560582"/>
+      <w:bookmarkStart w:id="34" w:name="_Toc243565016"/>
       <w:r>
         <w:t>6.3 Release 1.0.0 (pubblicata il 16 ottobre 2026)</w:t>
       </w:r>
-      <w:bookmarkEnd w:id="33"/>
+      <w:bookmarkEnd w:id="34"/>
     </w:p>
     <w:p>
       <w:pPr>
@@ -15080,11 +15639,11 @@
       <w:pPr>
         <w:pStyle w:val="Titolo2"/>
       </w:pPr>
-      <w:bookmarkStart w:id="34" w:name="_Toc243560583"/>
+      <w:bookmarkStart w:id="35" w:name="_Toc243565017"/>
       <w:r>
         <w:t>6.4 Release 1.0.1</w:t>
       </w:r>
-      <w:bookmarkEnd w:id="34"/>
+      <w:bookmarkEnd w:id="35"/>
     </w:p>
     <w:p>
       <w:pPr>
@@ -15377,11 +15936,12 @@
       <w:pPr>
         <w:pStyle w:val="Titolo2"/>
       </w:pPr>
-      <w:bookmarkStart w:id="35" w:name="_Toc243560584"/>
-      <w:r>
+      <w:bookmarkStart w:id="36" w:name="_Toc243565018"/>
+      <w:r>
+        <w:lastRenderedPageBreak/>
         <w:t>6.5 Release 1.0.2 e repository pubblico</w:t>
       </w:r>
-      <w:bookmarkEnd w:id="35"/>
+      <w:bookmarkEnd w:id="36"/>
     </w:p>
     <w:p>
       <w:pPr>
@@ -15799,11 +16359,11 @@
       <w:pPr>
         <w:pStyle w:val="Titolo2"/>
       </w:pPr>
-      <w:bookmarkStart w:id="36" w:name="_Toc243560585"/>
+      <w:bookmarkStart w:id="37" w:name="_Toc243565019"/>
       <w:r>
         <w:t>6.6 Nuova versione: link diretto per ogni sistema</w:t>
       </w:r>
-      <w:bookmarkEnd w:id="36"/>
+      <w:bookmarkEnd w:id="37"/>
     </w:p>
     <w:p>
       <w:pPr>
@@ -16215,8 +16775,9 @@
         <w:rPr>
           <w:noProof/>
         </w:rPr>
+        <w:lastRenderedPageBreak/>
         <w:drawing>
-          <wp:inline distT="0" distB="0" distL="0" distR="0" wp14:anchorId="40F84EB8" wp14:editId="10F0B772">
+          <wp:inline distT="0" distB="0" distL="0" distR="0" wp14:anchorId="316547B3" wp14:editId="157C7998">
             <wp:extent cx="4572000" cy="4429125"/>
             <wp:effectExtent l="0" t="0" r="0" b="0"/>
             <wp:docPr id="13" name="Immagine 13"/>
@@ -16291,11 +16852,11 @@
       <w:pPr>
         <w:pStyle w:val="Titolo2"/>
       </w:pPr>
-      <w:bookmarkStart w:id="37" w:name="_Toc243560586"/>
+      <w:bookmarkStart w:id="38" w:name="_Toc243565020"/>
       <w:r>
         <w:t>6.7 Release 1.1.0</w:t>
       </w:r>
-      <w:bookmarkEnd w:id="37"/>
+      <w:bookmarkEnd w:id="38"/>
     </w:p>
     <w:p>
       <w:pPr>
@@ -16855,11 +17416,12 @@
       <w:pPr>
         <w:pStyle w:val="Titolo2"/>
       </w:pPr>
-      <w:bookmarkStart w:id="38" w:name="_Toc243560587"/>
-      <w:r>
+      <w:bookmarkStart w:id="39" w:name="_Toc243565021"/>
+      <w:r>
+        <w:lastRenderedPageBreak/>
         <w:t>6.8 Versione 1.2.0</w:t>
       </w:r>
-      <w:bookmarkEnd w:id="38"/>
+      <w:bookmarkEnd w:id="39"/>
     </w:p>
     <w:p>
       <w:pPr>
@@ -17404,11 +17966,11 @@
       <w:pPr>
         <w:pStyle w:val="Titolo2"/>
       </w:pPr>
-      <w:bookmarkStart w:id="39" w:name="_Toc243560588"/>
+      <w:bookmarkStart w:id="40" w:name="_Toc243565022"/>
       <w:r>
         <w:t>6.9 Versione 1.2.1</w:t>
       </w:r>
-      <w:bookmarkEnd w:id="39"/>
+      <w:bookmarkEnd w:id="40"/>
     </w:p>
     <w:p>
       <w:pPr>
@@ -17422,11 +17984,11 @@
       <w:pPr>
         <w:pStyle w:val="Titolo2"/>
       </w:pPr>
-      <w:bookmarkStart w:id="40" w:name="_Toc243560589"/>
+      <w:bookmarkStart w:id="41" w:name="_Toc243565023"/>
       <w:r>
         <w:t>6.10 Versione 1.3.0</w:t>
       </w:r>
-      <w:bookmarkEnd w:id="40"/>
+      <w:bookmarkEnd w:id="41"/>
     </w:p>
     <w:p>
       <w:pPr>
@@ -17454,11 +18016,11 @@
       <w:pPr>
         <w:pStyle w:val="Titolo2"/>
       </w:pPr>
-      <w:bookmarkStart w:id="41" w:name="_Toc243560590"/>
+      <w:bookmarkStart w:id="42" w:name="_Toc243565024"/>
       <w:r>
         <w:t>6.11 Ruoli</w:t>
       </w:r>
-      <w:bookmarkEnd w:id="41"/>
+      <w:bookmarkEnd w:id="42"/>
     </w:p>
     <w:tbl>
       <w:tblPr>
@@ -17727,11 +18289,11 @@
       <w:pPr>
         <w:pStyle w:val="Titolo1"/>
       </w:pPr>
-      <w:bookmarkStart w:id="42" w:name="_Toc243560591"/>
+      <w:bookmarkStart w:id="43" w:name="_Toc243565025"/>
       <w:r>
         <w:t>7. Sicurezza</w:t>
       </w:r>
-      <w:bookmarkEnd w:id="42"/>
+      <w:bookmarkEnd w:id="43"/>
     </w:p>
     <w:p>
       <w:pPr>
@@ -17838,6 +18400,7 @@
                 <w:bCs/>
                 <w:color w:val="FFFFFF"/>
               </w:rPr>
+              <w:lastRenderedPageBreak/>
               <w:t>Livello</w:t>
             </w:r>
           </w:p>
@@ -18026,11 +18589,11 @@
       <w:pPr>
         <w:pStyle w:val="Titolo1"/>
       </w:pPr>
-      <w:bookmarkStart w:id="43" w:name="_Toc243560592"/>
+      <w:bookmarkStart w:id="44" w:name="_Toc243565026"/>
       <w:r>
         <w:t>8. Punti aperti</w:t>
       </w:r>
-      <w:bookmarkEnd w:id="43"/>
+      <w:bookmarkEnd w:id="44"/>
     </w:p>
     <w:p>
       <w:pPr>
@@ -18201,10 +18764,10 @@
           <w:b/>
           <w:bCs/>
         </w:rPr>
-        <w:t>PyMuPDF 2.0 su Android</w:t>
-      </w:r>
-      <w:r>
-        <w:t>: l'app Android resta sulla 1.28.2 finché non esiste la versione WebAssembly della 2.0.</w:t>
+        <w:t>Cloudflare e repository privato</w:t>
+      </w:r>
+      <w:r>
+        <w:t>: configurare Cloudflare e GitHub (4.10), poi versione ponte e solo dopo repository privato.</w:t>
       </w:r>
     </w:p>
     <w:p>
@@ -18217,6 +18780,26 @@
         <w:spacing w:after="60"/>
       </w:pPr>
       <w:r>
+        <w:rPr>
+          <w:b/>
+          <w:bCs/>
+        </w:rPr>
+        <w:t>PyMuPDF 2.0 su Android</w:t>
+      </w:r>
+      <w:r>
+        <w:t>: l'app Android resta sulla 1.28.2 finché non esiste la versione WebAssembly della 2.0.</w:t>
+      </w:r>
+    </w:p>
+    <w:p>
+      <w:pPr>
+        <w:pStyle w:val="Paragrafoelenco"/>
+        <w:numPr>
+          <w:ilvl w:val="0"/>
+          <w:numId w:val="4"/>
+        </w:numPr>
+        <w:spacing w:after="60"/>
+      </w:pPr>
+      <w:r>
         <w:t xml:space="preserve">Sul PC di sviluppo la cartella </w:t>
       </w:r>
       <w:r>
@@ -18235,11 +18818,11 @@
       <w:pPr>
         <w:pStyle w:val="Titolo1"/>
       </w:pPr>
-      <w:bookmarkStart w:id="44" w:name="_Toc243560593"/>
+      <w:bookmarkStart w:id="45" w:name="_Toc243565027"/>
       <w:r>
         <w:t>9. Pensato per i prossimi 10 anni</w:t>
       </w:r>
-      <w:bookmarkEnd w:id="44"/>
+      <w:bookmarkEnd w:id="45"/>
     </w:p>
     <w:p>
       <w:pPr>
@@ -18513,10 +19096,10 @@
 <file path=word/numbering.xml><?xml version="1.0" encoding="utf-8"?>
 <w:numbering xmlns:wpc="http://schemas.microsoft.com/office/word/2010/wordprocessingCanvas" xmlns:cx="http://schemas.microsoft.com/office/drawing/2014/chartex" xmlns:cx1="http://schemas.microsoft.com/office/drawing/2015/9/8/chartex" xmlns:cx2="http://schemas.microsoft.com/office/drawing/2015/10/21/chartex" xmlns:cx3="http://schemas.microsoft.com/office/drawing/2016/5/9/chartex" xmlns:cx4="http://schemas.microsoft.com/office/drawing/2016/5/10/chartex" xmlns:cx5="http://schemas.microsoft.com/office/drawing/2016/5/11/chartex" xmlns:cx6="http://schemas.microsoft.com/office/drawing/2016/5/12/chartex" xmlns:cx7="http://schemas.microsoft.com/office/drawing/2016/5/13/chartex" xmlns:cx8="http://schemas.microsoft.com/office/drawing/2016/5/14/chartex" xmlns:mc="http://schemas.openxmlformats.org/markup-compatibility/2006" xmlns:aink="http://schemas.microsoft.com/office/drawing/2016/ink" xmlns:am3d="http://schemas.microsoft.com/office/drawing/2017/model3d" xmlns:o="urn:schemas-microsoft-com:office:office" xmlns:oel="http://schemas.microsoft.com/office/2019/extlst" xmlns:r="http://schemas.openxmlformats.org/officeDocument/2006/relationships" xmlns:m="http://schemas.openxmlformats.org/officeDocument/2006/math" xmlns:v="urn:schemas-microsoft-com:vml" xmlns:wp14="http://schemas.microsoft.com/office/word/2010/wordprocessingDrawing" xmlns:wp="http://schemas.openxmlformats.org/drawingml/2006/wordprocessingDrawing" xmlns:w10="urn:schemas-microsoft-com:office:word" xmlns:w="http://schemas.openxmlformats.org/wordprocessingml/2006/main" xmlns:w14="http://schemas.microsoft.com/office/word/2010/wordml" xmlns:w15="http://schemas.microsoft.com/office/word/2012/wordml" xmlns:w16cex="http://schemas.microsoft.com/office/word/2018/wordml/cex" xmlns:w16cid="http://schemas.microsoft.com/office/word/2016/wordml/cid" xmlns:w16="http://schemas.microsoft.com/office/word/2018/wordml" xmlns:w16du="http://schemas.microsoft.com/office/word/2023/wordml/word16du" xmlns:w16sdtdh="http://schemas.microsoft.com/office/word/2020/wordml/sdtdatahash" xmlns:w16sdtfl="http://schemas.microsoft.com/office/word/2024/wordml/sdtformatlock" xmlns:w16se="http://schemas.microsoft.com/office/word/2015/wordml/symex" xmlns:wpg="http://schemas.microsoft.com/office/word/2010/wordprocessingGroup" xmlns:wpi="http://schemas.microsoft.com/office/word/2010/wordprocessingInk" xmlns:wne="http://schemas.microsoft.com/office/word/2006/wordml" xmlns:wps="http://schemas.microsoft.com/office/word/2010/wordprocessingShape" mc:Ignorable="w14 w15 w16se w16cid w16 w16cex w16sdtdh w16sdtfl w16du wp14">
   <w:abstractNum w:abstractNumId="0" w15:restartNumberingAfterBreak="0">
-    <w:nsid w:val="08F2666F"/>
+    <w:nsid w:val="02412A14"/>
     <w:multiLevelType w:val="hybridMultilevel"/>
-    <w:tmpl w:val="05666D58"/>
-    <w:lvl w:ilvl="0" w:tplc="33967034">
+    <w:tmpl w:val="021C6304"/>
+    <w:lvl w:ilvl="0" w:tplc="30D4A67C">
       <w:start w:val="1"/>
       <w:numFmt w:val="decimal"/>
       <w:lvlText w:val="%1."/>
@@ -18525,261 +19108,261 @@
         <w:ind w:left="540" w:hanging="300"/>
       </w:pPr>
     </w:lvl>
-    <w:lvl w:ilvl="1" w:tplc="00AE5D1E">
+    <w:lvl w:ilvl="1" w:tplc="9480707C">
       <w:numFmt w:val="decimal"/>
       <w:lvlText w:val=""/>
       <w:lvlJc w:val="left"/>
     </w:lvl>
-    <w:lvl w:ilvl="2" w:tplc="AF1AF086">
+    <w:lvl w:ilvl="2" w:tplc="CD1A087E">
       <w:numFmt w:val="decimal"/>
       <w:lvlText w:val=""/>
       <w:lvlJc w:val="left"/>
     </w:lvl>
-    <w:lvl w:ilvl="3" w:tplc="FB9AD3E8">
+    <w:lvl w:ilvl="3" w:tplc="04C4268E">
       <w:numFmt w:val="decimal"/>
       <w:lvlText w:val=""/>
       <w:lvlJc w:val="left"/>
     </w:lvl>
-    <w:lvl w:ilvl="4" w:tplc="283A82AC">
+    <w:lvl w:ilvl="4" w:tplc="97005776">
       <w:numFmt w:val="decimal"/>
       <w:lvlText w:val=""/>
       <w:lvlJc w:val="left"/>
     </w:lvl>
-    <w:lvl w:ilvl="5" w:tplc="82EAC8F2">
+    <w:lvl w:ilvl="5" w:tplc="BB6CC474">
       <w:numFmt w:val="decimal"/>
       <w:lvlText w:val=""/>
       <w:lvlJc w:val="left"/>
     </w:lvl>
-    <w:lvl w:ilvl="6" w:tplc="83A49B58">
+    <w:lvl w:ilvl="6" w:tplc="36FA80DA">
       <w:numFmt w:val="decimal"/>
       <w:lvlText w:val=""/>
       <w:lvlJc w:val="left"/>
     </w:lvl>
-    <w:lvl w:ilvl="7" w:tplc="15664C0A">
+    <w:lvl w:ilvl="7" w:tplc="990A891E">
       <w:numFmt w:val="decimal"/>
       <w:lvlText w:val=""/>
       <w:lvlJc w:val="left"/>
     </w:lvl>
-    <w:lvl w:ilvl="8" w:tplc="933495F8">
+    <w:lvl w:ilvl="8" w:tplc="BBD08EC8">
       <w:numFmt w:val="decimal"/>
       <w:lvlText w:val=""/>
       <w:lvlJc w:val="left"/>
     </w:lvl>
   </w:abstractNum>
   <w:abstractNum w:abstractNumId="1" w15:restartNumberingAfterBreak="0">
-    <w:nsid w:val="22EF6D60"/>
+    <w:nsid w:val="1E2241F9"/>
     <w:multiLevelType w:val="hybridMultilevel"/>
-    <w:tmpl w:val="AF5A971C"/>
-    <w:lvl w:ilvl="0" w:tplc="B1662A3A">
+    <w:tmpl w:val="47D65B20"/>
+    <w:lvl w:ilvl="0" w:tplc="617C25E0">
       <w:start w:val="1"/>
-      <w:numFmt w:val="decimal"/>
-      <w:lvlText w:val="%1."/>
+      <w:numFmt w:val="bullet"/>
+      <w:lvlText w:val="•"/>
       <w:lvlJc w:val="left"/>
       <w:pPr>
-        <w:ind w:left="540" w:hanging="300"/>
+        <w:ind w:left="540" w:hanging="270"/>
       </w:pPr>
     </w:lvl>
-    <w:lvl w:ilvl="1" w:tplc="6212B274">
+    <w:lvl w:ilvl="1" w:tplc="5B6CA750">
       <w:numFmt w:val="decimal"/>
       <w:lvlText w:val=""/>
       <w:lvlJc w:val="left"/>
     </w:lvl>
-    <w:lvl w:ilvl="2" w:tplc="7AE2B2B6">
+    <w:lvl w:ilvl="2" w:tplc="281E7CA8">
       <w:numFmt w:val="decimal"/>
       <w:lvlText w:val=""/>
       <w:lvlJc w:val="left"/>
     </w:lvl>
-    <w:lvl w:ilvl="3" w:tplc="63A411EC">
+    <w:lvl w:ilvl="3" w:tplc="981CEF60">
       <w:numFmt w:val="decimal"/>
       <w:lvlText w:val=""/>
       <w:lvlJc w:val="left"/>
     </w:lvl>
-    <w:lvl w:ilvl="4" w:tplc="CB32C052">
+    <w:lvl w:ilvl="4" w:tplc="D488ECAE">
       <w:numFmt w:val="decimal"/>
       <w:lvlText w:val=""/>
       <w:lvlJc w:val="left"/>
     </w:lvl>
-    <w:lvl w:ilvl="5" w:tplc="931895A8">
+    <w:lvl w:ilvl="5" w:tplc="98602E0C">
       <w:numFmt w:val="decimal"/>
       <w:lvlText w:val=""/>
       <w:lvlJc w:val="left"/>
     </w:lvl>
-    <w:lvl w:ilvl="6" w:tplc="E2A0B9A8">
+    <w:lvl w:ilvl="6" w:tplc="05DC2C40">
       <w:numFmt w:val="decimal"/>
       <w:lvlText w:val=""/>
       <w:lvlJc w:val="left"/>
     </w:lvl>
-    <w:lvl w:ilvl="7" w:tplc="1068C506">
+    <w:lvl w:ilvl="7" w:tplc="DF3230D2">
       <w:numFmt w:val="decimal"/>
       <w:lvlText w:val=""/>
       <w:lvlJc w:val="left"/>
     </w:lvl>
-    <w:lvl w:ilvl="8" w:tplc="F92EFE34">
+    <w:lvl w:ilvl="8" w:tplc="6810A2D0">
       <w:numFmt w:val="decimal"/>
       <w:lvlText w:val=""/>
       <w:lvlJc w:val="left"/>
     </w:lvl>
   </w:abstractNum>
   <w:abstractNum w:abstractNumId="2" w15:restartNumberingAfterBreak="0">
-    <w:nsid w:val="3F3F1FD0"/>
+    <w:nsid w:val="50410B6D"/>
     <w:multiLevelType w:val="hybridMultilevel"/>
-    <w:tmpl w:val="5F42F232"/>
-    <w:lvl w:ilvl="0" w:tplc="F8043442" w:tentative="1">
+    <w:tmpl w:val="FAF04AC0"/>
+    <w:lvl w:ilvl="0" w:tplc="31C498E0">
       <w:start w:val="1"/>
-      <w:numFmt w:val="bullet"/>
-      <w:lvlText w:val="●"/>
+      <w:numFmt w:val="decimal"/>
+      <w:lvlText w:val="%1."/>
       <w:lvlJc w:val="left"/>
       <w:pPr>
-        <w:ind w:left="720" w:hanging="360"/>
+        <w:ind w:left="540" w:hanging="300"/>
       </w:pPr>
     </w:lvl>
-    <w:lvl w:ilvl="1" w:tplc="4362880A" w:tentative="1">
-      <w:start w:val="1"/>
-      <w:numFmt w:val="bullet"/>
-      <w:lvlText w:val="○"/>
-      <w:lvlJc w:val="left"/>
-      <w:pPr>
-        <w:ind w:left="1440" w:hanging="360"/>
-      </w:pPr>
-    </w:lvl>
-    <w:lvl w:ilvl="2" w:tplc="5FFCDA98" w:tentative="1">
-      <w:start w:val="1"/>
-      <w:numFmt w:val="bullet"/>
-      <w:lvlText w:val="■"/>
-      <w:lvlJc w:val="left"/>
-      <w:pPr>
-        <w:ind w:left="2160" w:hanging="360"/>
-      </w:pPr>
-    </w:lvl>
-    <w:lvl w:ilvl="3" w:tplc="8092FC1E" w:tentative="1">
-      <w:start w:val="1"/>
-      <w:numFmt w:val="bullet"/>
-      <w:lvlText w:val="●"/>
-      <w:lvlJc w:val="left"/>
-      <w:pPr>
-        <w:ind w:left="2880" w:hanging="360"/>
-      </w:pPr>
-    </w:lvl>
-    <w:lvl w:ilvl="4" w:tplc="C680BBB6" w:tentative="1">
-      <w:start w:val="1"/>
-      <w:numFmt w:val="bullet"/>
-      <w:lvlText w:val="○"/>
-      <w:lvlJc w:val="left"/>
-      <w:pPr>
-        <w:ind w:left="3600" w:hanging="360"/>
-      </w:pPr>
-    </w:lvl>
-    <w:lvl w:ilvl="5" w:tplc="D01ECF3E" w:tentative="1">
-      <w:start w:val="1"/>
-      <w:numFmt w:val="bullet"/>
-      <w:lvlText w:val="■"/>
-      <w:lvlJc w:val="left"/>
-      <w:pPr>
-        <w:ind w:left="4320" w:hanging="360"/>
-      </w:pPr>
-    </w:lvl>
-    <w:lvl w:ilvl="6" w:tplc="F88CAEA0" w:tentative="1">
-      <w:start w:val="1"/>
-      <w:numFmt w:val="bullet"/>
-      <w:lvlText w:val="●"/>
-      <w:lvlJc w:val="left"/>
-      <w:pPr>
-        <w:ind w:left="5040" w:hanging="360"/>
-      </w:pPr>
-    </w:lvl>
-    <w:lvl w:ilvl="7" w:tplc="B0A657DE" w:tentative="1">
-      <w:start w:val="1"/>
-      <w:numFmt w:val="bullet"/>
-      <w:lvlText w:val="●"/>
-      <w:lvlJc w:val="left"/>
-      <w:pPr>
-        <w:ind w:left="5760" w:hanging="360"/>
-      </w:pPr>
-    </w:lvl>
-    <w:lvl w:ilvl="8" w:tplc="5E8C8898" w:tentative="1">
-      <w:start w:val="1"/>
-      <w:numFmt w:val="bullet"/>
-      <w:lvlText w:val="●"/>
-      <w:lvlJc w:val="left"/>
-      <w:pPr>
-        <w:ind w:left="6480" w:hanging="360"/>
-      </w:pPr>
-    </w:lvl>
-  </w:abstractNum>
-  <w:abstractNum w:abstractNumId="3" w15:restartNumberingAfterBreak="0">
-    <w:nsid w:val="48983F13"/>
-    <w:multiLevelType w:val="hybridMultilevel"/>
-    <w:tmpl w:val="E4B216B4"/>
-    <w:lvl w:ilvl="0" w:tplc="7E005888">
-      <w:start w:val="1"/>
-      <w:numFmt w:val="bullet"/>
-      <w:lvlText w:val="•"/>
-      <w:lvlJc w:val="left"/>
-      <w:pPr>
-        <w:ind w:left="540" w:hanging="270"/>
-      </w:pPr>
-    </w:lvl>
-    <w:lvl w:ilvl="1" w:tplc="C18236D8">
+    <w:lvl w:ilvl="1" w:tplc="49DAB20A">
       <w:numFmt w:val="decimal"/>
       <w:lvlText w:val=""/>
       <w:lvlJc w:val="left"/>
     </w:lvl>
-    <w:lvl w:ilvl="2" w:tplc="8A26624E">
+    <w:lvl w:ilvl="2" w:tplc="E0E2C55C">
       <w:numFmt w:val="decimal"/>
       <w:lvlText w:val=""/>
       <w:lvlJc w:val="left"/>
     </w:lvl>
-    <w:lvl w:ilvl="3" w:tplc="DDC69E30">
+    <w:lvl w:ilvl="3" w:tplc="F8BE2760">
       <w:numFmt w:val="decimal"/>
       <w:lvlText w:val=""/>
       <w:lvlJc w:val="left"/>
     </w:lvl>
-    <w:lvl w:ilvl="4" w:tplc="31C0F400">
+    <w:lvl w:ilvl="4" w:tplc="D1066400">
       <w:numFmt w:val="decimal"/>
       <w:lvlText w:val=""/>
       <w:lvlJc w:val="left"/>
     </w:lvl>
-    <w:lvl w:ilvl="5" w:tplc="64349E90">
+    <w:lvl w:ilvl="5" w:tplc="E314F770">
       <w:numFmt w:val="decimal"/>
       <w:lvlText w:val=""/>
       <w:lvlJc w:val="left"/>
     </w:lvl>
-    <w:lvl w:ilvl="6" w:tplc="6CEE8090">
+    <w:lvl w:ilvl="6" w:tplc="1E8C4776">
       <w:numFmt w:val="decimal"/>
       <w:lvlText w:val=""/>
       <w:lvlJc w:val="left"/>
     </w:lvl>
-    <w:lvl w:ilvl="7" w:tplc="A4D2A91C">
+    <w:lvl w:ilvl="7" w:tplc="F1FA9210">
       <w:numFmt w:val="decimal"/>
       <w:lvlText w:val=""/>
       <w:lvlJc w:val="left"/>
     </w:lvl>
-    <w:lvl w:ilvl="8" w:tplc="2A0C6256">
+    <w:lvl w:ilvl="8" w:tplc="0B3A053C">
       <w:numFmt w:val="decimal"/>
       <w:lvlText w:val=""/>
       <w:lvlJc w:val="left"/>
     </w:lvl>
   </w:abstractNum>
-  <w:num w:numId="1" w16cid:durableId="1559902241">
+  <w:abstractNum w:abstractNumId="3" w15:restartNumberingAfterBreak="0">
+    <w:nsid w:val="6CD0412E"/>
+    <w:multiLevelType w:val="hybridMultilevel"/>
+    <w:tmpl w:val="D5B03B60"/>
+    <w:lvl w:ilvl="0" w:tplc="2E1C72A0" w:tentative="1">
+      <w:start w:val="1"/>
+      <w:numFmt w:val="bullet"/>
+      <w:lvlText w:val="●"/>
+      <w:lvlJc w:val="left"/>
+      <w:pPr>
+        <w:ind w:left="720" w:hanging="360"/>
+      </w:pPr>
+    </w:lvl>
+    <w:lvl w:ilvl="1" w:tplc="CAB87D74" w:tentative="1">
+      <w:start w:val="1"/>
+      <w:numFmt w:val="bullet"/>
+      <w:lvlText w:val="○"/>
+      <w:lvlJc w:val="left"/>
+      <w:pPr>
+        <w:ind w:left="1440" w:hanging="360"/>
+      </w:pPr>
+    </w:lvl>
+    <w:lvl w:ilvl="2" w:tplc="3B12A08C" w:tentative="1">
+      <w:start w:val="1"/>
+      <w:numFmt w:val="bullet"/>
+      <w:lvlText w:val="■"/>
+      <w:lvlJc w:val="left"/>
+      <w:pPr>
+        <w:ind w:left="2160" w:hanging="360"/>
+      </w:pPr>
+    </w:lvl>
+    <w:lvl w:ilvl="3" w:tplc="A998C2A6" w:tentative="1">
+      <w:start w:val="1"/>
+      <w:numFmt w:val="bullet"/>
+      <w:lvlText w:val="●"/>
+      <w:lvlJc w:val="left"/>
+      <w:pPr>
+        <w:ind w:left="2880" w:hanging="360"/>
+      </w:pPr>
+    </w:lvl>
+    <w:lvl w:ilvl="4" w:tplc="CC2AF360" w:tentative="1">
+      <w:start w:val="1"/>
+      <w:numFmt w:val="bullet"/>
+      <w:lvlText w:val="○"/>
+      <w:lvlJc w:val="left"/>
+      <w:pPr>
+        <w:ind w:left="3600" w:hanging="360"/>
+      </w:pPr>
+    </w:lvl>
+    <w:lvl w:ilvl="5" w:tplc="2FBCADCC" w:tentative="1">
+      <w:start w:val="1"/>
+      <w:numFmt w:val="bullet"/>
+      <w:lvlText w:val="■"/>
+      <w:lvlJc w:val="left"/>
+      <w:pPr>
+        <w:ind w:left="4320" w:hanging="360"/>
+      </w:pPr>
+    </w:lvl>
+    <w:lvl w:ilvl="6" w:tplc="E6E0E248" w:tentative="1">
+      <w:start w:val="1"/>
+      <w:numFmt w:val="bullet"/>
+      <w:lvlText w:val="●"/>
+      <w:lvlJc w:val="left"/>
+      <w:pPr>
+        <w:ind w:left="5040" w:hanging="360"/>
+      </w:pPr>
+    </w:lvl>
+    <w:lvl w:ilvl="7" w:tplc="70304300" w:tentative="1">
+      <w:start w:val="1"/>
+      <w:numFmt w:val="bullet"/>
+      <w:lvlText w:val="●"/>
+      <w:lvlJc w:val="left"/>
+      <w:pPr>
+        <w:ind w:left="5760" w:hanging="360"/>
+      </w:pPr>
+    </w:lvl>
+    <w:lvl w:ilvl="8" w:tplc="ACC8DF8C" w:tentative="1">
+      <w:start w:val="1"/>
+      <w:numFmt w:val="bullet"/>
+      <w:lvlText w:val="●"/>
+      <w:lvlJc w:val="left"/>
+      <w:pPr>
+        <w:ind w:left="6480" w:hanging="360"/>
+      </w:pPr>
+    </w:lvl>
+  </w:abstractNum>
+  <w:num w:numId="1" w16cid:durableId="750011046">
+    <w:abstractNumId w:val="3"/>
+    <w:lvlOverride w:ilvl="0">
+      <w:startOverride w:val="1"/>
+    </w:lvlOverride>
+  </w:num>
+  <w:num w:numId="2" w16cid:durableId="529495435">
+    <w:abstractNumId w:val="1"/>
+    <w:lvlOverride w:ilvl="0">
+      <w:startOverride w:val="1"/>
+    </w:lvlOverride>
+  </w:num>
+  <w:num w:numId="3" w16cid:durableId="1591427862">
     <w:abstractNumId w:val="2"/>
     <w:lvlOverride w:ilvl="0">
       <w:startOverride w:val="1"/>
     </w:lvlOverride>
   </w:num>
-  <w:num w:numId="2" w16cid:durableId="1415587488">
-    <w:abstractNumId w:val="3"/>
-    <w:lvlOverride w:ilvl="0">
-      <w:startOverride w:val="1"/>
-    </w:lvlOverride>
-  </w:num>
-  <w:num w:numId="3" w16cid:durableId="941568814">
+  <w:num w:numId="4" w16cid:durableId="585268284">
     <w:abstractNumId w:val="0"/>
-    <w:lvlOverride w:ilvl="0">
-      <w:startOverride w:val="1"/>
-    </w:lvlOverride>
-  </w:num>
-  <w:num w:numId="4" w16cid:durableId="1071853144">
-    <w:abstractNumId w:val="1"/>
     <w:lvlOverride w:ilvl="0">
       <w:startOverride w:val="1"/>
     </w:lvlOverride>
@@ -19420,7 +20003,7 @@
     <w:autoRedefine/>
     <w:uiPriority w:val="39"/>
     <w:unhideWhenUsed/>
-    <w:rsid w:val="00C16A3E"/>
+    <w:rsid w:val="00BC46BF"/>
     <w:pPr>
       <w:spacing w:after="100"/>
     </w:pPr>
@@ -19432,7 +20015,7 @@
     <w:autoRedefine/>
     <w:uiPriority w:val="39"/>
     <w:unhideWhenUsed/>
-    <w:rsid w:val="00C16A3E"/>
+    <w:rsid w:val="00BC46BF"/>
     <w:pPr>
       <w:spacing w:after="100"/>
       <w:ind w:left="210"/>

</xml_diff>